<commit_message>
A new doc has been added called table creation which further details how the database tables were made and includes the statements used to create them, pictures of the structures and also shows code which was used to import the data into the tables using LOAD DATA INFILE as we used the import button on SQL last time and we didn't read through assignment instructions carefully. The sql code document will now only contain the 6 queries and examples of insert statements.
</commit_message>
<xml_diff>
--- a/SQL code.docx
+++ b/SQL code.docx
@@ -2,205 +2,65 @@
 <file path=word/document.xml><?xml version="1.0" encoding="utf-8"?>
 <w:document xmlns:wpc="http://schemas.microsoft.com/office/word/2010/wordprocessingCanvas" xmlns:cx="http://schemas.microsoft.com/office/drawing/2014/chartex" xmlns:cx1="http://schemas.microsoft.com/office/drawing/2015/9/8/chartex" xmlns:cx2="http://schemas.microsoft.com/office/drawing/2015/10/21/chartex" xmlns:cx3="http://schemas.microsoft.com/office/drawing/2016/5/9/chartex" xmlns:cx4="http://schemas.microsoft.com/office/drawing/2016/5/10/chartex" xmlns:cx5="http://schemas.microsoft.com/office/drawing/2016/5/11/chartex" xmlns:cx6="http://schemas.microsoft.com/office/drawing/2016/5/12/chartex" xmlns:cx7="http://schemas.microsoft.com/office/drawing/2016/5/13/chartex" xmlns:cx8="http://schemas.microsoft.com/office/drawing/2016/5/14/chartex" xmlns:mc="http://schemas.openxmlformats.org/markup-compatibility/2006" xmlns:aink="http://schemas.microsoft.com/office/drawing/2016/ink" xmlns:am3d="http://schemas.microsoft.com/office/drawing/2017/model3d" xmlns:o="urn:schemas-microsoft-com:office:office" xmlns:oel="http://schemas.microsoft.com/office/2019/extlst" xmlns:r="http://schemas.openxmlformats.org/officeDocument/2006/relationships" xmlns:m="http://schemas.openxmlformats.org/officeDocument/2006/math" xmlns:v="urn:schemas-microsoft-com:vml" xmlns:wp14="http://schemas.microsoft.com/office/word/2010/wordprocessingDrawing" xmlns:wp="http://schemas.openxmlformats.org/drawingml/2006/wordprocessingDrawing" xmlns:w10="urn:schemas-microsoft-com:office:word" xmlns:w="http://schemas.openxmlformats.org/wordprocessingml/2006/main" xmlns:w14="http://schemas.microsoft.com/office/word/2010/wordml" xmlns:w15="http://schemas.microsoft.com/office/word/2012/wordml" xmlns:w16cex="http://schemas.microsoft.com/office/word/2018/wordml/cex" xmlns:w16cid="http://schemas.microsoft.com/office/word/2016/wordml/cid" xmlns:w16="http://schemas.microsoft.com/office/word/2018/wordml" xmlns:w16du="http://schemas.microsoft.com/office/word/2023/wordml/word16du" xmlns:w16sdtdh="http://schemas.microsoft.com/office/word/2020/wordml/sdtdatahash" xmlns:w16sdtfl="http://schemas.microsoft.com/office/word/2024/wordml/sdtformatlock" xmlns:w16se="http://schemas.microsoft.com/office/word/2015/wordml/symex" xmlns:wpg="http://schemas.microsoft.com/office/word/2010/wordprocessingGroup" xmlns:wpi="http://schemas.microsoft.com/office/word/2010/wordprocessingInk" xmlns:wne="http://schemas.microsoft.com/office/word/2006/wordml" xmlns:wps="http://schemas.microsoft.com/office/word/2010/wordprocessingShape" mc:Ignorable="w14 w15 w16se w16cid w16 w16cex w16sdtdh w16sdtfl w16du wp14">
   <w:body>
-    <w:p>
-      <w:r>
-        <w:t xml:space="preserve">CREATE TABLE </w:t>
+    <w:p/>
+    <w:p/>
+    <w:p>
+      <w:pPr>
+        <w:pStyle w:val="Heading2"/>
+        <w:rPr>
+          <w:u w:val="single"/>
+        </w:rPr>
+      </w:pPr>
+      <w:r>
+        <w:rPr>
+          <w:u w:val="single"/>
+        </w:rPr>
+        <w:t>Example insert statements</w:t>
+      </w:r>
+    </w:p>
+    <w:p/>
+    <w:p>
+      <w:pPr>
+        <w:pStyle w:val="Heading2"/>
+        <w:rPr>
+          <w:u w:val="single"/>
+        </w:rPr>
+      </w:pPr>
+      <w:r>
+        <w:rPr>
+          <w:u w:val="single"/>
+        </w:rPr>
+        <w:t>Query 1: using like</w:t>
+      </w:r>
+    </w:p>
+    <w:p>
+      <w:r>
+        <w:t xml:space="preserve">SELECT * FROM neighbourhood WHERE </w:t>
       </w:r>
       <w:proofErr w:type="spellStart"/>
       <w:r>
-        <w:t>CityBlock</w:t>
+        <w:t>Neighbourhood_Name</w:t>
       </w:r>
       <w:proofErr w:type="spellEnd"/>
       <w:r>
-        <w:t xml:space="preserve"> (</w:t>
-      </w:r>
-      <w:proofErr w:type="spellStart"/>
-      <w:r>
-        <w:t>Block_ID</w:t>
-      </w:r>
-      <w:proofErr w:type="spellEnd"/>
-      <w:r>
-        <w:t xml:space="preserve"> INT NOT NULL, </w:t>
-      </w:r>
-      <w:proofErr w:type="spellStart"/>
-      <w:r>
-        <w:t>Neighbourhood_ID</w:t>
-      </w:r>
-      <w:proofErr w:type="spellEnd"/>
-      <w:r>
-        <w:t xml:space="preserve"> INT NOT NULL, Population INT NOT NULL, </w:t>
-      </w:r>
-      <w:proofErr w:type="spellStart"/>
-      <w:r>
-        <w:t>Infected_Count</w:t>
-      </w:r>
-      <w:proofErr w:type="spellEnd"/>
-      <w:r>
-        <w:t xml:space="preserve"> INT NOT NULL, </w:t>
-      </w:r>
-      <w:proofErr w:type="spellStart"/>
-      <w:r>
-        <w:t>Recovered_COUNT</w:t>
-      </w:r>
-      <w:proofErr w:type="spellEnd"/>
-      <w:r>
-        <w:t xml:space="preserve"> INT NOT NULL, PRIMARY KEY (</w:t>
-      </w:r>
-      <w:proofErr w:type="spellStart"/>
-      <w:r>
-        <w:t>Block_ID</w:t>
-      </w:r>
-      <w:proofErr w:type="spellEnd"/>
-      <w:r>
-        <w:t>), FOREIGN KEY(</w:t>
-      </w:r>
-      <w:proofErr w:type="spellStart"/>
-      <w:r>
-        <w:t>Neighbourhood_ID</w:t>
-      </w:r>
-      <w:proofErr w:type="spellEnd"/>
-      <w:r>
-        <w:t>) REFERENCES neighbourhood (Neighbourhood</w:t>
-      </w:r>
-      <w:proofErr w:type="gramStart"/>
-      <w:r>
-        <w:t>) )</w:t>
-      </w:r>
-      <w:proofErr w:type="gramEnd"/>
-      <w:r>
-        <w:t xml:space="preserve"> </w:t>
-      </w:r>
-    </w:p>
-    <w:p/>
-    <w:p>
-      <w:r>
-        <w:t xml:space="preserve">CREATE TABLE </w:t>
-      </w:r>
-      <w:proofErr w:type="spellStart"/>
-      <w:r>
-        <w:t>InfectionEvent</w:t>
-      </w:r>
-      <w:proofErr w:type="spellEnd"/>
-      <w:r>
-        <w:t xml:space="preserve"> (</w:t>
-      </w:r>
-      <w:proofErr w:type="spellStart"/>
-      <w:r>
-        <w:t>Event_Number</w:t>
-      </w:r>
-      <w:proofErr w:type="spellEnd"/>
-      <w:r>
-        <w:t xml:space="preserve"> INT NOT NULL, </w:t>
-      </w:r>
-      <w:proofErr w:type="spellStart"/>
-      <w:r>
-        <w:t>Block_ID</w:t>
-      </w:r>
-      <w:proofErr w:type="spellEnd"/>
-      <w:r>
-        <w:t xml:space="preserve"> INT NOT NULL, </w:t>
-      </w:r>
-      <w:proofErr w:type="spellStart"/>
-      <w:r>
-        <w:t>People_Inected</w:t>
-      </w:r>
-      <w:proofErr w:type="spellEnd"/>
-      <w:r>
-        <w:t xml:space="preserve"> INT NOT NULL, </w:t>
-      </w:r>
-      <w:proofErr w:type="spellStart"/>
-      <w:r>
-        <w:t>Event_Description</w:t>
-      </w:r>
-      <w:proofErr w:type="spellEnd"/>
-      <w:r>
-        <w:t xml:space="preserve"> </w:t>
-      </w:r>
-      <w:proofErr w:type="gramStart"/>
-      <w:r>
-        <w:t>VARCHAR(</w:t>
-      </w:r>
-      <w:proofErr w:type="gramEnd"/>
-      <w:r>
-        <w:t>255) NOT NULL, PRIMARY KEY (</w:t>
-      </w:r>
-      <w:proofErr w:type="spellStart"/>
-      <w:r>
-        <w:t>Event_Number</w:t>
-      </w:r>
-      <w:proofErr w:type="spellEnd"/>
-      <w:r>
-        <w:t>), FOREIGN KEY(</w:t>
-      </w:r>
-      <w:proofErr w:type="spellStart"/>
-      <w:r>
-        <w:t>Block_ID</w:t>
-      </w:r>
-      <w:proofErr w:type="spellEnd"/>
-      <w:r>
-        <w:t xml:space="preserve">) REFERENCES </w:t>
-      </w:r>
-      <w:proofErr w:type="spellStart"/>
-      <w:r>
-        <w:t>CityBlock</w:t>
-      </w:r>
-      <w:proofErr w:type="spellEnd"/>
-      <w:r>
-        <w:t xml:space="preserve"> (</w:t>
-      </w:r>
-      <w:proofErr w:type="spellStart"/>
-      <w:r>
-        <w:t>Block_ID</w:t>
-      </w:r>
-      <w:proofErr w:type="spellEnd"/>
-      <w:proofErr w:type="gramStart"/>
-      <w:r>
-        <w:t>) )</w:t>
-      </w:r>
-      <w:proofErr w:type="gramEnd"/>
-    </w:p>
-    <w:p/>
-    <w:p>
-      <w:pPr>
-        <w:pStyle w:val="Heading2"/>
-        <w:rPr>
-          <w:u w:val="single"/>
-        </w:rPr>
-      </w:pPr>
-      <w:r>
-        <w:rPr>
-          <w:u w:val="single"/>
-        </w:rPr>
-        <w:t>Query 1: using like</w:t>
-      </w:r>
-    </w:p>
-    <w:p>
-      <w:pPr>
-        <w:pStyle w:val="ListParagraph"/>
-        <w:numPr>
-          <w:ilvl w:val="0"/>
-          <w:numId w:val="1"/>
-        </w:numPr>
-      </w:pPr>
-      <w:r>
-        <w:t xml:space="preserve">SELECT * FROM neighbourhood WHERE </w:t>
-      </w:r>
-      <w:proofErr w:type="spellStart"/>
-      <w:r>
-        <w:t>Neighbourhood_Name</w:t>
-      </w:r>
-      <w:proofErr w:type="spellEnd"/>
-      <w:r>
         <w:t xml:space="preserve"> LIKE "%Side"</w:t>
       </w:r>
     </w:p>
     <w:p>
       <w:r>
+        <w:t>-- Neighbourhood names ending in side</w:t>
+      </w:r>
+    </w:p>
+    <w:p>
+      <w:r>
         <w:t>Result:</w:t>
       </w:r>
     </w:p>
     <w:p>
       <w:r>
+        <w:rPr>
+          <w:noProof/>
+        </w:rPr>
         <w:drawing>
           <wp:inline distT="0" distB="0" distL="0" distR="0" wp14:anchorId="4A3B40AC" wp14:editId="79E32A9D">
             <wp:extent cx="4902452" cy="997001"/>
@@ -273,15 +133,7 @@
         <w:t xml:space="preserve">Purpose: </w:t>
       </w:r>
       <w:r>
-        <w:t xml:space="preserve">To compare the initial </w:t>
-      </w:r>
-      <w:proofErr w:type="gramStart"/>
-      <w:r>
-        <w:t>infection</w:t>
-      </w:r>
-      <w:proofErr w:type="gramEnd"/>
-      <w:r>
-        <w:t xml:space="preserve"> count of the outbreak event to the final number of people infected in that same block.</w:t>
+        <w:t>To compare the initial infection count of the outbreak event to the final number of people infected in that same block.</w:t>
       </w:r>
     </w:p>
     <w:p>
@@ -289,13 +141,8 @@
         <w:t xml:space="preserve">SELECT </w:t>
       </w:r>
       <w:proofErr w:type="spellStart"/>
-      <w:proofErr w:type="gramStart"/>
-      <w:r>
-        <w:t>infectionevent.Block</w:t>
-      </w:r>
-      <w:proofErr w:type="gramEnd"/>
-      <w:r>
-        <w:t>_ID</w:t>
+      <w:r>
+        <w:t>infectionevent.Block_ID</w:t>
       </w:r>
       <w:proofErr w:type="spellEnd"/>
       <w:r>
@@ -359,26 +206,16 @@
         <w:t xml:space="preserve"> ON </w:t>
       </w:r>
       <w:proofErr w:type="spellStart"/>
-      <w:proofErr w:type="gramStart"/>
-      <w:r>
-        <w:t>infectionevent.Block</w:t>
-      </w:r>
-      <w:proofErr w:type="gramEnd"/>
-      <w:r>
-        <w:t>_ID</w:t>
+      <w:r>
+        <w:t>infectionevent.Block_ID</w:t>
       </w:r>
       <w:proofErr w:type="spellEnd"/>
       <w:r>
         <w:t xml:space="preserve"> = </w:t>
       </w:r>
       <w:proofErr w:type="spellStart"/>
-      <w:proofErr w:type="gramStart"/>
-      <w:r>
-        <w:t>cityblock.Block</w:t>
-      </w:r>
-      <w:proofErr w:type="gramEnd"/>
-      <w:r>
-        <w:t>_ID</w:t>
+      <w:r>
+        <w:t>cityblock.Block_ID</w:t>
       </w:r>
       <w:proofErr w:type="spellEnd"/>
       <w:r>
@@ -415,6 +252,9 @@
     </w:p>
     <w:p>
       <w:r>
+        <w:rPr>
+          <w:noProof/>
+        </w:rPr>
         <w:drawing>
           <wp:inline distT="0" distB="0" distL="0" distR="0" wp14:anchorId="2CD23EFD" wp14:editId="63AF4DAA">
             <wp:extent cx="5731510" cy="955040"/>
@@ -459,6 +299,9 @@
     </w:p>
     <w:p>
       <w:r>
+        <w:rPr>
+          <w:noProof/>
+        </w:rPr>
         <w:lastRenderedPageBreak/>
         <w:drawing>
           <wp:inline distT="0" distB="0" distL="0" distR="0" wp14:anchorId="4E92B272" wp14:editId="6A11C97F">
@@ -497,6 +340,313 @@
         </w:drawing>
       </w:r>
     </w:p>
+    <w:p>
+      <w:pPr>
+        <w:pStyle w:val="Heading2"/>
+        <w:rPr>
+          <w:u w:val="single"/>
+        </w:rPr>
+      </w:pPr>
+      <w:r>
+        <w:rPr>
+          <w:u w:val="single"/>
+        </w:rPr>
+        <w:t xml:space="preserve">Query </w:t>
+      </w:r>
+      <w:r>
+        <w:rPr>
+          <w:u w:val="single"/>
+        </w:rPr>
+        <w:t>3</w:t>
+      </w:r>
+      <w:r>
+        <w:rPr>
+          <w:u w:val="single"/>
+        </w:rPr>
+        <w:t>:</w:t>
+      </w:r>
+      <w:r>
+        <w:rPr>
+          <w:u w:val="single"/>
+        </w:rPr>
+        <w:t xml:space="preserve"> using “&gt;”</w:t>
+      </w:r>
+    </w:p>
+    <w:p>
+      <w:r>
+        <w:rPr>
+          <w:b/>
+          <w:bCs/>
+        </w:rPr>
+        <w:t xml:space="preserve">Purpose: </w:t>
+      </w:r>
+      <w:r>
+        <w:t>We want to use this query to see which blocks have the highest infected count</w:t>
+      </w:r>
+      <w:r>
+        <w:t xml:space="preserve"> (over 40000).</w:t>
+      </w:r>
+    </w:p>
+    <w:p>
+      <w:r>
+        <w:t xml:space="preserve">SELECT </w:t>
+      </w:r>
+      <w:proofErr w:type="spellStart"/>
+      <w:r>
+        <w:t>Block_ID</w:t>
+      </w:r>
+      <w:proofErr w:type="spellEnd"/>
+      <w:r>
+        <w:t xml:space="preserve">, </w:t>
+      </w:r>
+      <w:proofErr w:type="spellStart"/>
+      <w:r>
+        <w:t>Neighbourhood_ID</w:t>
+      </w:r>
+      <w:proofErr w:type="spellEnd"/>
+      <w:r>
+        <w:t xml:space="preserve">, Population, </w:t>
+      </w:r>
+      <w:proofErr w:type="spellStart"/>
+      <w:r>
+        <w:t>Infected_Count</w:t>
+      </w:r>
+      <w:proofErr w:type="spellEnd"/>
+      <w:r>
+        <w:t xml:space="preserve"> </w:t>
+      </w:r>
+    </w:p>
+    <w:p>
+      <w:r>
+        <w:t xml:space="preserve">FROM </w:t>
+      </w:r>
+      <w:proofErr w:type="spellStart"/>
+      <w:r>
+        <w:t>cityblock</w:t>
+      </w:r>
+      <w:proofErr w:type="spellEnd"/>
+      <w:r>
+        <w:t xml:space="preserve"> </w:t>
+      </w:r>
+    </w:p>
+    <w:p>
+      <w:r>
+        <w:t xml:space="preserve">WHERE </w:t>
+      </w:r>
+      <w:proofErr w:type="spellStart"/>
+      <w:r>
+        <w:t>Infected_Count</w:t>
+      </w:r>
+      <w:proofErr w:type="spellEnd"/>
+      <w:r>
+        <w:t xml:space="preserve"> &gt; 40000</w:t>
+      </w:r>
+    </w:p>
+    <w:p>
+      <w:pPr>
+        <w:rPr>
+          <w:b/>
+          <w:bCs/>
+        </w:rPr>
+      </w:pPr>
+      <w:r>
+        <w:rPr>
+          <w:b/>
+          <w:bCs/>
+        </w:rPr>
+        <w:t>Result:</w:t>
+      </w:r>
+    </w:p>
+    <w:p>
+      <w:pPr>
+        <w:rPr>
+          <w:b/>
+          <w:bCs/>
+        </w:rPr>
+      </w:pPr>
+      <w:r>
+        <w:rPr>
+          <w:b/>
+          <w:bCs/>
+        </w:rPr>
+        <w:drawing>
+          <wp:inline distT="0" distB="0" distL="0" distR="0" wp14:anchorId="2939E707" wp14:editId="3D9E6ACF">
+            <wp:extent cx="5731510" cy="3059430"/>
+            <wp:effectExtent l="0" t="0" r="2540" b="7620"/>
+            <wp:docPr id="402353641" name="Picture 1" descr="This is a table displaying information about various blocks, including their IDs, neighborhood IDs, population, and infection counts, with options to edit, copy, or delete each entry.&#10;&#10;AI-generated content may be incorrect."/>
+            <wp:cNvGraphicFramePr>
+              <a:graphicFrameLocks xmlns:a="http://schemas.openxmlformats.org/drawingml/2006/main" noChangeAspect="1"/>
+            </wp:cNvGraphicFramePr>
+            <a:graphic xmlns:a="http://schemas.openxmlformats.org/drawingml/2006/main">
+              <a:graphicData uri="http://schemas.openxmlformats.org/drawingml/2006/picture">
+                <pic:pic xmlns:pic="http://schemas.openxmlformats.org/drawingml/2006/picture">
+                  <pic:nvPicPr>
+                    <pic:cNvPr id="402353641" name="Picture 1" descr="This is a table displaying information about various blocks, including their IDs, neighborhood IDs, population, and infection counts, with options to edit, copy, or delete each entry.&#10;&#10;AI-generated content may be incorrect."/>
+                    <pic:cNvPicPr/>
+                  </pic:nvPicPr>
+                  <pic:blipFill>
+                    <a:blip r:embed="rId8"/>
+                    <a:stretch>
+                      <a:fillRect/>
+                    </a:stretch>
+                  </pic:blipFill>
+                  <pic:spPr>
+                    <a:xfrm>
+                      <a:off x="0" y="0"/>
+                      <a:ext cx="5731510" cy="3059430"/>
+                    </a:xfrm>
+                    <a:prstGeom prst="rect">
+                      <a:avLst/>
+                    </a:prstGeom>
+                  </pic:spPr>
+                </pic:pic>
+              </a:graphicData>
+            </a:graphic>
+          </wp:inline>
+        </w:drawing>
+      </w:r>
+    </w:p>
+    <w:p>
+      <w:pPr>
+        <w:pStyle w:val="Heading2"/>
+        <w:rPr>
+          <w:u w:val="single"/>
+        </w:rPr>
+      </w:pPr>
+      <w:r>
+        <w:rPr>
+          <w:u w:val="single"/>
+        </w:rPr>
+        <w:t xml:space="preserve">Query </w:t>
+      </w:r>
+      <w:r>
+        <w:rPr>
+          <w:u w:val="single"/>
+        </w:rPr>
+        <w:t>4</w:t>
+      </w:r>
+      <w:r>
+        <w:rPr>
+          <w:u w:val="single"/>
+        </w:rPr>
+        <w:t xml:space="preserve">: </w:t>
+      </w:r>
+    </w:p>
+    <w:p>
+      <w:pPr>
+        <w:rPr>
+          <w:b/>
+          <w:bCs/>
+        </w:rPr>
+      </w:pPr>
+      <w:r>
+        <w:rPr>
+          <w:b/>
+          <w:bCs/>
+        </w:rPr>
+        <w:t>Purpose:</w:t>
+      </w:r>
+    </w:p>
+    <w:p/>
+    <w:p>
+      <w:pPr>
+        <w:pStyle w:val="Heading2"/>
+        <w:rPr>
+          <w:u w:val="single"/>
+        </w:rPr>
+      </w:pPr>
+      <w:r>
+        <w:rPr>
+          <w:u w:val="single"/>
+        </w:rPr>
+        <w:t xml:space="preserve">Query </w:t>
+      </w:r>
+      <w:r>
+        <w:rPr>
+          <w:u w:val="single"/>
+        </w:rPr>
+        <w:t>5</w:t>
+      </w:r>
+      <w:r>
+        <w:rPr>
+          <w:u w:val="single"/>
+        </w:rPr>
+        <w:t xml:space="preserve">: </w:t>
+      </w:r>
+    </w:p>
+    <w:p>
+      <w:pPr>
+        <w:rPr>
+          <w:b/>
+          <w:bCs/>
+        </w:rPr>
+      </w:pPr>
+      <w:r>
+        <w:rPr>
+          <w:b/>
+          <w:bCs/>
+        </w:rPr>
+        <w:t>Purpose:</w:t>
+      </w:r>
+    </w:p>
+    <w:p/>
+    <w:p>
+      <w:pPr>
+        <w:pStyle w:val="Heading2"/>
+        <w:rPr>
+          <w:u w:val="single"/>
+        </w:rPr>
+      </w:pPr>
+      <w:r>
+        <w:rPr>
+          <w:u w:val="single"/>
+        </w:rPr>
+        <w:t xml:space="preserve">Query </w:t>
+      </w:r>
+      <w:r>
+        <w:rPr>
+          <w:u w:val="single"/>
+        </w:rPr>
+        <w:t>6</w:t>
+      </w:r>
+      <w:r>
+        <w:rPr>
+          <w:u w:val="single"/>
+        </w:rPr>
+        <w:t xml:space="preserve">: </w:t>
+      </w:r>
+    </w:p>
+    <w:p>
+      <w:pPr>
+        <w:rPr>
+          <w:b/>
+          <w:bCs/>
+        </w:rPr>
+      </w:pPr>
+      <w:r>
+        <w:rPr>
+          <w:b/>
+          <w:bCs/>
+        </w:rPr>
+        <w:t>Purpose:</w:t>
+      </w:r>
+    </w:p>
+    <w:p/>
+    <w:p>
+      <w:pPr>
+        <w:pStyle w:val="Heading2"/>
+        <w:rPr>
+          <w:u w:val="single"/>
+        </w:rPr>
+      </w:pPr>
+      <w:r>
+        <w:rPr>
+          <w:u w:val="single"/>
+        </w:rPr>
+        <w:t xml:space="preserve"> </w:t>
+      </w:r>
+    </w:p>
+    <w:p/>
     <w:sectPr>
       <w:pgSz w:w="11906" w:h="16838"/>
       <w:pgMar w:top="1440" w:right="1440" w:bottom="1440" w:left="1440" w:header="708" w:footer="708" w:gutter="0"/>

</xml_diff>

<commit_message>
Code for queries also includes comments.
</commit_message>
<xml_diff>
--- a/SQL code.docx
+++ b/SQL code.docx
@@ -48,8 +48,13 @@
     </w:p>
     <w:p>
       <w:r>
-        <w:t>-- Neighbourhood names ending in side</w:t>
-      </w:r>
+        <w:t xml:space="preserve">-- Neighbourhood names ending </w:t>
+      </w:r>
+      <w:proofErr w:type="gramStart"/>
+      <w:r>
+        <w:t>in side</w:t>
+      </w:r>
+      <w:proofErr w:type="gramEnd"/>
     </w:p>
     <w:p>
       <w:r>
@@ -133,7 +138,15 @@
         <w:t xml:space="preserve">Purpose: </w:t>
       </w:r>
       <w:r>
-        <w:t>To compare the initial infection count of the outbreak event to the final number of people infected in that same block.</w:t>
+        <w:t xml:space="preserve">To compare the initial </w:t>
+      </w:r>
+      <w:proofErr w:type="gramStart"/>
+      <w:r>
+        <w:t>infection</w:t>
+      </w:r>
+      <w:proofErr w:type="gramEnd"/>
+      <w:r>
+        <w:t xml:space="preserve"> count of the outbreak event to the final number of people infected in that same block.</w:t>
       </w:r>
     </w:p>
     <w:p>
@@ -141,8 +154,13 @@
         <w:t xml:space="preserve">SELECT </w:t>
       </w:r>
       <w:proofErr w:type="spellStart"/>
-      <w:r>
-        <w:t>infectionevent.Block_ID</w:t>
+      <w:proofErr w:type="gramStart"/>
+      <w:r>
+        <w:t>infectionevent.Block</w:t>
+      </w:r>
+      <w:proofErr w:type="gramEnd"/>
+      <w:r>
+        <w:t>_ID</w:t>
       </w:r>
       <w:proofErr w:type="spellEnd"/>
       <w:r>
@@ -206,16 +224,26 @@
         <w:t xml:space="preserve"> ON </w:t>
       </w:r>
       <w:proofErr w:type="spellStart"/>
-      <w:r>
-        <w:t>infectionevent.Block_ID</w:t>
+      <w:proofErr w:type="gramStart"/>
+      <w:r>
+        <w:t>infectionevent.Block</w:t>
+      </w:r>
+      <w:proofErr w:type="gramEnd"/>
+      <w:r>
+        <w:t>_ID</w:t>
       </w:r>
       <w:proofErr w:type="spellEnd"/>
       <w:r>
         <w:t xml:space="preserve"> = </w:t>
       </w:r>
       <w:proofErr w:type="spellStart"/>
-      <w:r>
-        <w:t>cityblock.Block_ID</w:t>
+      <w:proofErr w:type="gramStart"/>
+      <w:r>
+        <w:t>cityblock.Block</w:t>
+      </w:r>
+      <w:proofErr w:type="gramEnd"/>
+      <w:r>
+        <w:t>_ID</w:t>
       </w:r>
       <w:proofErr w:type="spellEnd"/>
       <w:r>
@@ -236,29 +264,64 @@
       </w:r>
     </w:p>
     <w:p>
-      <w:pPr>
+      <w:r>
+        <w:t>/*</w:t>
+      </w:r>
+    </w:p>
+    <w:p>
+      <w:r>
+        <w:t xml:space="preserve">This query will compare a subset of blocks to show the number of people who were initially infected at a block and show the number of people infected after the month by using data from the </w:t>
+      </w:r>
+      <w:proofErr w:type="spellStart"/>
+      <w:r>
+        <w:t>cityblock</w:t>
+      </w:r>
+      <w:proofErr w:type="spellEnd"/>
+      <w:r>
+        <w:t xml:space="preserve"> table</w:t>
+      </w:r>
+    </w:p>
+    <w:p>
+      <w:r>
+        <w:t>*/</w:t>
+      </w:r>
+    </w:p>
+    <w:p>
+      <w:pPr>
+        <w:rPr>
+          <w:noProof/>
+        </w:rPr>
+      </w:pPr>
+      <w:r>
         <w:rPr>
           <w:b/>
           <w:bCs/>
         </w:rPr>
-      </w:pPr>
-      <w:r>
+        <w:t>Result:</w:t>
+      </w:r>
+      <w:r>
+        <w:rPr>
+          <w:noProof/>
+        </w:rPr>
+        <w:t xml:space="preserve"> </w:t>
+      </w:r>
+    </w:p>
+    <w:p>
+      <w:pPr>
         <w:rPr>
           <w:b/>
           <w:bCs/>
         </w:rPr>
-        <w:t>Result:</w:t>
-      </w:r>
-    </w:p>
-    <w:p>
+      </w:pPr>
       <w:r>
         <w:rPr>
           <w:noProof/>
         </w:rPr>
+        <w:lastRenderedPageBreak/>
         <w:drawing>
-          <wp:inline distT="0" distB="0" distL="0" distR="0" wp14:anchorId="2CD23EFD" wp14:editId="63AF4DAA">
-            <wp:extent cx="5731510" cy="955040"/>
-            <wp:effectExtent l="0" t="0" r="2540" b="0"/>
+          <wp:inline distT="0" distB="0" distL="0" distR="0" wp14:anchorId="4286FC28" wp14:editId="4F847185">
+            <wp:extent cx="5632450" cy="938534"/>
+            <wp:effectExtent l="0" t="0" r="6350" b="0"/>
             <wp:docPr id="1380926349" name="Picture 1" descr="The image displays a table listing various events, including the number of people infected, the event description, and the total infected count, suggesting a scenario of a spreading infection through cash and contact in public places.&#10;&#10;AI-generated content may be incorrect."/>
             <wp:cNvGraphicFramePr>
               <a:graphicFrameLocks xmlns:a="http://schemas.openxmlformats.org/drawingml/2006/main" noChangeAspect="1"/>
@@ -279,7 +342,7 @@
                   <pic:spPr>
                     <a:xfrm>
                       <a:off x="0" y="0"/>
-                      <a:ext cx="5731510" cy="955040"/>
+                      <a:ext cx="5632516" cy="938545"/>
                     </a:xfrm>
                     <a:prstGeom prst="rect">
                       <a:avLst/>
@@ -292,6 +355,7 @@
         </w:drawing>
       </w:r>
     </w:p>
+    <w:p/>
     <w:p>
       <w:r>
         <w:t>WITHOUT the where statement:</w:t>
@@ -302,7 +366,6 @@
         <w:rPr>
           <w:noProof/>
         </w:rPr>
-        <w:lastRenderedPageBreak/>
         <w:drawing>
           <wp:inline distT="0" distB="0" distL="0" distR="0" wp14:anchorId="4E92B272" wp14:editId="6A11C97F">
             <wp:extent cx="5731510" cy="1728470"/>
@@ -443,6 +506,11 @@
       </w:r>
     </w:p>
     <w:p>
+      <w:r>
+        <w:t>-- WHERE is used as a filter to show the blocks with the highest infected count</w:t>
+      </w:r>
+    </w:p>
+    <w:p>
       <w:pPr>
         <w:rPr>
           <w:b/>
@@ -454,21 +522,29 @@
           <w:b/>
           <w:bCs/>
         </w:rPr>
-        <w:t>Result:</w:t>
-      </w:r>
-    </w:p>
-    <w:p>
-      <w:pPr>
+        <w:t>Result</w:t>
+      </w:r>
+      <w:r>
         <w:rPr>
           <w:b/>
           <w:bCs/>
         </w:rPr>
-      </w:pPr>
-      <w:r>
+        <w:t>:</w:t>
+      </w:r>
+    </w:p>
+    <w:p>
+      <w:pPr>
         <w:rPr>
           <w:b/>
           <w:bCs/>
         </w:rPr>
+      </w:pPr>
+      <w:r>
+        <w:rPr>
+          <w:b/>
+          <w:bCs/>
+        </w:rPr>
+        <w:lastRenderedPageBreak/>
         <w:drawing>
           <wp:inline distT="0" distB="0" distL="0" distR="0" wp14:anchorId="2939E707" wp14:editId="3D9E6ACF">
             <wp:extent cx="5731510" cy="3059430"/>

</xml_diff>

<commit_message>
Fixed an error in the excel spreadsheet where the columns for infectionevent were in the wrong order resulting in the table having the wrong values in each column. Re imported the data correctly, added semi colons to each statement and finished all the insert statement examples.
</commit_message>
<xml_diff>
--- a/SQL code.docx
+++ b/SQL code.docx
@@ -21,6 +21,318 @@
     <w:p/>
     <w:p>
       <w:pPr>
+        <w:rPr>
+          <w:b/>
+          <w:bCs/>
+          <w:u w:val="single"/>
+        </w:rPr>
+      </w:pPr>
+      <w:r>
+        <w:rPr>
+          <w:b/>
+          <w:bCs/>
+          <w:u w:val="single"/>
+        </w:rPr>
+        <w:t>Neighbourhood</w:t>
+      </w:r>
+    </w:p>
+    <w:p>
+      <w:r>
+        <w:t xml:space="preserve">INSERT INTO </w:t>
+      </w:r>
+      <w:proofErr w:type="gramStart"/>
+      <w:r>
+        <w:t>neighbourhood(</w:t>
+      </w:r>
+      <w:proofErr w:type="spellStart"/>
+      <w:proofErr w:type="gramEnd"/>
+      <w:r>
+        <w:t>Neighbourhood_ID</w:t>
+      </w:r>
+      <w:proofErr w:type="spellEnd"/>
+      <w:r>
+        <w:t xml:space="preserve">, </w:t>
+      </w:r>
+      <w:proofErr w:type="spellStart"/>
+      <w:r>
+        <w:t>Neighbourhood_Name</w:t>
+      </w:r>
+      <w:proofErr w:type="spellEnd"/>
+      <w:r>
+        <w:t>)</w:t>
+      </w:r>
+    </w:p>
+    <w:p>
+      <w:r>
+        <w:t>VALUES (21, "</w:t>
+      </w:r>
+      <w:proofErr w:type="spellStart"/>
+      <w:r>
+        <w:t>random_neighbourhood</w:t>
+      </w:r>
+      <w:proofErr w:type="spellEnd"/>
+      <w:r>
+        <w:t>")</w:t>
+      </w:r>
+    </w:p>
+    <w:p>
+      <w:r>
+        <w:t xml:space="preserve">-- The name is just an example since every neighbourhood from </w:t>
+      </w:r>
+      <w:proofErr w:type="spellStart"/>
+      <w:r>
+        <w:t>harlem</w:t>
+      </w:r>
+      <w:proofErr w:type="spellEnd"/>
+      <w:r>
+        <w:t xml:space="preserve"> is written down.</w:t>
+      </w:r>
+    </w:p>
+    <w:p>
+      <w:r>
+        <w:drawing>
+          <wp:inline distT="0" distB="0" distL="0" distR="0" wp14:anchorId="71F2AF80" wp14:editId="70FAA1AB">
+            <wp:extent cx="5188217" cy="819192"/>
+            <wp:effectExtent l="0" t="0" r="0" b="0"/>
+            <wp:docPr id="2142818460" name="Picture 1" descr="The image shows a list with various commands (Edit, Delete, Copy) associated with different neighborhood names.&#10;&#10;AI-generated content may be incorrect."/>
+            <wp:cNvGraphicFramePr>
+              <a:graphicFrameLocks xmlns:a="http://schemas.openxmlformats.org/drawingml/2006/main" noChangeAspect="1"/>
+            </wp:cNvGraphicFramePr>
+            <a:graphic xmlns:a="http://schemas.openxmlformats.org/drawingml/2006/main">
+              <a:graphicData uri="http://schemas.openxmlformats.org/drawingml/2006/picture">
+                <pic:pic xmlns:pic="http://schemas.openxmlformats.org/drawingml/2006/picture">
+                  <pic:nvPicPr>
+                    <pic:cNvPr id="2142818460" name="Picture 1" descr="The image shows a list with various commands (Edit, Delete, Copy) associated with different neighborhood names.&#10;&#10;AI-generated content may be incorrect."/>
+                    <pic:cNvPicPr/>
+                  </pic:nvPicPr>
+                  <pic:blipFill>
+                    <a:blip r:embed="rId5"/>
+                    <a:stretch>
+                      <a:fillRect/>
+                    </a:stretch>
+                  </pic:blipFill>
+                  <pic:spPr>
+                    <a:xfrm>
+                      <a:off x="0" y="0"/>
+                      <a:ext cx="5188217" cy="819192"/>
+                    </a:xfrm>
+                    <a:prstGeom prst="rect">
+                      <a:avLst/>
+                    </a:prstGeom>
+                  </pic:spPr>
+                </pic:pic>
+              </a:graphicData>
+            </a:graphic>
+          </wp:inline>
+        </w:drawing>
+      </w:r>
+    </w:p>
+    <w:p/>
+    <w:p>
+      <w:pPr>
+        <w:rPr>
+          <w:b/>
+          <w:bCs/>
+          <w:u w:val="single"/>
+        </w:rPr>
+      </w:pPr>
+      <w:proofErr w:type="spellStart"/>
+      <w:r>
+        <w:rPr>
+          <w:b/>
+          <w:bCs/>
+          <w:u w:val="single"/>
+        </w:rPr>
+        <w:t>Cityblock</w:t>
+      </w:r>
+      <w:proofErr w:type="spellEnd"/>
+    </w:p>
+    <w:p>
+      <w:r>
+        <w:t xml:space="preserve">INSERT INTO </w:t>
+      </w:r>
+      <w:proofErr w:type="spellStart"/>
+      <w:proofErr w:type="gramStart"/>
+      <w:r>
+        <w:t>cityblock</w:t>
+      </w:r>
+      <w:proofErr w:type="spellEnd"/>
+      <w:r>
+        <w:t>(</w:t>
+      </w:r>
+      <w:proofErr w:type="spellStart"/>
+      <w:proofErr w:type="gramEnd"/>
+      <w:r>
+        <w:t>Block_ID</w:t>
+      </w:r>
+      <w:proofErr w:type="spellEnd"/>
+      <w:r>
+        <w:t xml:space="preserve">, </w:t>
+      </w:r>
+      <w:proofErr w:type="spellStart"/>
+      <w:r>
+        <w:t>Neighbourhood_ID</w:t>
+      </w:r>
+      <w:proofErr w:type="spellEnd"/>
+      <w:r>
+        <w:t xml:space="preserve">, </w:t>
+      </w:r>
+      <w:proofErr w:type="gramStart"/>
+      <w:r>
+        <w:t xml:space="preserve">Population,  </w:t>
+      </w:r>
+      <w:proofErr w:type="spellStart"/>
+      <w:r>
+        <w:t>Infected</w:t>
+      </w:r>
+      <w:proofErr w:type="gramEnd"/>
+      <w:r>
+        <w:t>_Count</w:t>
+      </w:r>
+      <w:proofErr w:type="spellEnd"/>
+      <w:r>
+        <w:t xml:space="preserve">, </w:t>
+      </w:r>
+      <w:proofErr w:type="spellStart"/>
+      <w:r>
+        <w:t>Recovered_Count</w:t>
+      </w:r>
+      <w:proofErr w:type="spellEnd"/>
+      <w:r>
+        <w:t>)</w:t>
+      </w:r>
+    </w:p>
+    <w:p>
+      <w:r>
+        <w:t>VALUES (55, 20, 20000, 19000, 1000)</w:t>
+      </w:r>
+    </w:p>
+    <w:p/>
+    <w:p>
+      <w:r>
+        <w:t xml:space="preserve">/* Recovered count and infected count are based on the rates on the infection rates of the </w:t>
+      </w:r>
+      <w:proofErr w:type="spellStart"/>
+      <w:r>
+        <w:t>ingame</w:t>
+      </w:r>
+      <w:proofErr w:type="spellEnd"/>
+      <w:r>
+        <w:t xml:space="preserve"> virus with 95% for infection rate and 5% for recovery rate */</w:t>
+      </w:r>
+    </w:p>
+    <w:p>
+      <w:r>
+        <w:drawing>
+          <wp:inline distT="0" distB="0" distL="0" distR="0" wp14:anchorId="4FF11592" wp14:editId="61303AA8">
+            <wp:extent cx="5731510" cy="839470"/>
+            <wp:effectExtent l="0" t="0" r="2540" b="0"/>
+            <wp:docPr id="1125785299" name="Picture 1" descr="The image displays a table with sequential entries showing pairs of numbers, where each pair consists of an 'Edit' action followed by a 'Delete' action, with incremental increases in the second number of each pair.&#10;&#10;AI-generated content may be incorrect."/>
+            <wp:cNvGraphicFramePr>
+              <a:graphicFrameLocks xmlns:a="http://schemas.openxmlformats.org/drawingml/2006/main" noChangeAspect="1"/>
+            </wp:cNvGraphicFramePr>
+            <a:graphic xmlns:a="http://schemas.openxmlformats.org/drawingml/2006/main">
+              <a:graphicData uri="http://schemas.openxmlformats.org/drawingml/2006/picture">
+                <pic:pic xmlns:pic="http://schemas.openxmlformats.org/drawingml/2006/picture">
+                  <pic:nvPicPr>
+                    <pic:cNvPr id="1125785299" name="Picture 1" descr="The image displays a table with sequential entries showing pairs of numbers, where each pair consists of an 'Edit' action followed by a 'Delete' action, with incremental increases in the second number of each pair.&#10;&#10;AI-generated content may be incorrect."/>
+                    <pic:cNvPicPr/>
+                  </pic:nvPicPr>
+                  <pic:blipFill>
+                    <a:blip r:embed="rId6"/>
+                    <a:stretch>
+                      <a:fillRect/>
+                    </a:stretch>
+                  </pic:blipFill>
+                  <pic:spPr>
+                    <a:xfrm>
+                      <a:off x="0" y="0"/>
+                      <a:ext cx="5731510" cy="839470"/>
+                    </a:xfrm>
+                    <a:prstGeom prst="rect">
+                      <a:avLst/>
+                    </a:prstGeom>
+                  </pic:spPr>
+                </pic:pic>
+              </a:graphicData>
+            </a:graphic>
+          </wp:inline>
+        </w:drawing>
+      </w:r>
+    </w:p>
+    <w:p/>
+    <w:p>
+      <w:pPr>
+        <w:rPr>
+          <w:b/>
+          <w:bCs/>
+          <w:u w:val="single"/>
+        </w:rPr>
+      </w:pPr>
+      <w:proofErr w:type="spellStart"/>
+      <w:r>
+        <w:rPr>
+          <w:b/>
+          <w:bCs/>
+          <w:u w:val="single"/>
+        </w:rPr>
+        <w:t>InfectionEvent</w:t>
+      </w:r>
+      <w:proofErr w:type="spellEnd"/>
+    </w:p>
+    <w:p>
+      <w:r>
+        <w:t xml:space="preserve">INSERT INTO </w:t>
+      </w:r>
+      <w:proofErr w:type="spellStart"/>
+      <w:r>
+        <w:t>infectionevent</w:t>
+      </w:r>
+      <w:proofErr w:type="spellEnd"/>
+      <w:r>
+        <w:t xml:space="preserve"> (</w:t>
+      </w:r>
+      <w:proofErr w:type="spellStart"/>
+      <w:r>
+        <w:t>Event_Number</w:t>
+      </w:r>
+      <w:proofErr w:type="spellEnd"/>
+      <w:r>
+        <w:t xml:space="preserve">, </w:t>
+      </w:r>
+      <w:proofErr w:type="spellStart"/>
+      <w:r>
+        <w:t>Block_ID</w:t>
+      </w:r>
+      <w:proofErr w:type="spellEnd"/>
+      <w:r>
+        <w:t xml:space="preserve">, </w:t>
+      </w:r>
+      <w:proofErr w:type="spellStart"/>
+      <w:r>
+        <w:t>People_Infected</w:t>
+      </w:r>
+      <w:proofErr w:type="spellEnd"/>
+      <w:r>
+        <w:t xml:space="preserve">, </w:t>
+      </w:r>
+      <w:proofErr w:type="spellStart"/>
+      <w:r>
+        <w:t>Event_Description</w:t>
+      </w:r>
+      <w:proofErr w:type="spellEnd"/>
+      <w:r>
+        <w:t>)</w:t>
+      </w:r>
+    </w:p>
+    <w:p>
+      <w:r>
+        <w:t>VALUES (19, 11, 7, "Airborne particles spread at a major museum exhibit")</w:t>
+      </w:r>
+    </w:p>
+    <w:p/>
+    <w:p>
+      <w:pPr>
         <w:pStyle w:val="Heading2"/>
         <w:rPr>
           <w:u w:val="single"/>
@@ -30,6 +342,7 @@
         <w:rPr>
           <w:u w:val="single"/>
         </w:rPr>
+        <w:lastRenderedPageBreak/>
         <w:t>Query 1: using like</w:t>
       </w:r>
     </w:p>
@@ -82,7 +395,7 @@
                     <pic:cNvPicPr/>
                   </pic:nvPicPr>
                   <pic:blipFill>
-                    <a:blip r:embed="rId5"/>
+                    <a:blip r:embed="rId7"/>
                     <a:stretch>
                       <a:fillRect/>
                     </a:stretch>
@@ -317,7 +630,6 @@
         <w:rPr>
           <w:noProof/>
         </w:rPr>
-        <w:lastRenderedPageBreak/>
         <w:drawing>
           <wp:inline distT="0" distB="0" distL="0" distR="0" wp14:anchorId="4286FC28" wp14:editId="4F847185">
             <wp:extent cx="5632450" cy="938534"/>
@@ -334,7 +646,7 @@
                     <pic:cNvPicPr/>
                   </pic:nvPicPr>
                   <pic:blipFill>
-                    <a:blip r:embed="rId6"/>
+                    <a:blip r:embed="rId8"/>
                     <a:stretch>
                       <a:fillRect/>
                     </a:stretch>
@@ -366,6 +678,7 @@
         <w:rPr>
           <w:noProof/>
         </w:rPr>
+        <w:lastRenderedPageBreak/>
         <w:drawing>
           <wp:inline distT="0" distB="0" distL="0" distR="0" wp14:anchorId="4E92B272" wp14:editId="6A11C97F">
             <wp:extent cx="5731510" cy="1728470"/>
@@ -382,7 +695,7 @@
                     <pic:cNvPicPr/>
                   </pic:nvPicPr>
                   <pic:blipFill>
-                    <a:blip r:embed="rId7"/>
+                    <a:blip r:embed="rId9"/>
                     <a:stretch>
                       <a:fillRect/>
                     </a:stretch>
@@ -543,12 +856,12 @@
         <w:rPr>
           <w:b/>
           <w:bCs/>
-        </w:rPr>
-        <w:lastRenderedPageBreak/>
+          <w:noProof/>
+        </w:rPr>
         <w:drawing>
-          <wp:inline distT="0" distB="0" distL="0" distR="0" wp14:anchorId="2939E707" wp14:editId="3D9E6ACF">
-            <wp:extent cx="5731510" cy="3059430"/>
-            <wp:effectExtent l="0" t="0" r="2540" b="7620"/>
+          <wp:inline distT="0" distB="0" distL="0" distR="0" wp14:anchorId="2939E707" wp14:editId="6AC7EB4E">
+            <wp:extent cx="4718050" cy="2518454"/>
+            <wp:effectExtent l="0" t="0" r="6350" b="0"/>
             <wp:docPr id="402353641" name="Picture 1" descr="This is a table displaying information about various blocks, including their IDs, neighborhood IDs, population, and infection counts, with options to edit, copy, or delete each entry.&#10;&#10;AI-generated content may be incorrect."/>
             <wp:cNvGraphicFramePr>
               <a:graphicFrameLocks xmlns:a="http://schemas.openxmlformats.org/drawingml/2006/main" noChangeAspect="1"/>
@@ -561,7 +874,7 @@
                     <pic:cNvPicPr/>
                   </pic:nvPicPr>
                   <pic:blipFill>
-                    <a:blip r:embed="rId8"/>
+                    <a:blip r:embed="rId10"/>
                     <a:stretch>
                       <a:fillRect/>
                     </a:stretch>
@@ -569,7 +882,7 @@
                   <pic:spPr>
                     <a:xfrm>
                       <a:off x="0" y="0"/>
-                      <a:ext cx="5731510" cy="3059430"/>
+                      <a:ext cx="4722586" cy="2520875"/>
                     </a:xfrm>
                     <a:prstGeom prst="rect">
                       <a:avLst/>
@@ -677,6 +990,7 @@
         <w:rPr>
           <w:u w:val="single"/>
         </w:rPr>
+        <w:lastRenderedPageBreak/>
         <w:t xml:space="preserve">Query </w:t>
       </w:r>
       <w:r>

</xml_diff>

<commit_message>
Finished all the queries.
</commit_message>
<xml_diff>
--- a/SQL code.docx
+++ b/SQL code.docx
@@ -74,6 +74,9 @@
       <w:r>
         <w:t>")</w:t>
       </w:r>
+      <w:r>
+        <w:t>;</w:t>
+      </w:r>
     </w:p>
     <w:p>
       <w:r>
@@ -90,6 +93,9 @@
     </w:p>
     <w:p>
       <w:r>
+        <w:rPr>
+          <w:noProof/>
+        </w:rPr>
         <w:drawing>
           <wp:inline distT="0" distB="0" distL="0" distR="0" wp14:anchorId="71F2AF80" wp14:editId="70FAA1AB">
             <wp:extent cx="5188217" cy="819192"/>
@@ -206,6 +212,9 @@
       <w:r>
         <w:t>VALUES (55, 20, 20000, 19000, 1000)</w:t>
       </w:r>
+      <w:r>
+        <w:t>;</w:t>
+      </w:r>
     </w:p>
     <w:p/>
     <w:p>
@@ -223,6 +232,9 @@
     </w:p>
     <w:p>
       <w:r>
+        <w:rPr>
+          <w:noProof/>
+        </w:rPr>
         <w:drawing>
           <wp:inline distT="0" distB="0" distL="0" distR="0" wp14:anchorId="4FF11592" wp14:editId="61303AA8">
             <wp:extent cx="5731510" cy="839470"/>
@@ -327,7 +339,152 @@
     </w:p>
     <w:p>
       <w:r>
-        <w:t>VALUES (19, 11, 7, "Airborne particles spread at a major museum exhibit")</w:t>
+        <w:t>VALUES (1</w:t>
+      </w:r>
+      <w:r>
+        <w:t>1</w:t>
+      </w:r>
+      <w:r>
+        <w:t>, 1</w:t>
+      </w:r>
+      <w:r>
+        <w:t>9</w:t>
+      </w:r>
+      <w:r>
+        <w:t>, 7, "Airborne particles spread at a major museum exhibit")</w:t>
+      </w:r>
+      <w:r>
+        <w:t>;</w:t>
+      </w:r>
+    </w:p>
+    <w:p>
+      <w:r>
+        <w:rPr>
+          <w:noProof/>
+        </w:rPr>
+        <w:drawing>
+          <wp:inline distT="0" distB="0" distL="0" distR="0" wp14:anchorId="0BC8AF3D" wp14:editId="3ADC7D18">
+            <wp:extent cx="5731510" cy="558800"/>
+            <wp:effectExtent l="0" t="0" r="2540" b="0"/>
+            <wp:docPr id="903202947" name="Picture 1" descr="The image displays a list of numbered points detailing various measures to prevent the spread of an infectious virus, including editing and deleting certain actions, and measures such as quarantining infected individuals and sanitizing shared spaces.&#10;&#10;AI-generated content may be incorrect."/>
+            <wp:cNvGraphicFramePr>
+              <a:graphicFrameLocks xmlns:a="http://schemas.openxmlformats.org/drawingml/2006/main" noChangeAspect="1"/>
+            </wp:cNvGraphicFramePr>
+            <a:graphic xmlns:a="http://schemas.openxmlformats.org/drawingml/2006/main">
+              <a:graphicData uri="http://schemas.openxmlformats.org/drawingml/2006/picture">
+                <pic:pic xmlns:pic="http://schemas.openxmlformats.org/drawingml/2006/picture">
+                  <pic:nvPicPr>
+                    <pic:cNvPr id="903202947" name="Picture 1" descr="The image displays a list of numbered points detailing various measures to prevent the spread of an infectious virus, including editing and deleting certain actions, and measures such as quarantining infected individuals and sanitizing shared spaces.&#10;&#10;AI-generated content may be incorrect."/>
+                    <pic:cNvPicPr/>
+                  </pic:nvPicPr>
+                  <pic:blipFill>
+                    <a:blip r:embed="rId7"/>
+                    <a:stretch>
+                      <a:fillRect/>
+                    </a:stretch>
+                  </pic:blipFill>
+                  <pic:spPr>
+                    <a:xfrm>
+                      <a:off x="0" y="0"/>
+                      <a:ext cx="5731510" cy="558800"/>
+                    </a:xfrm>
+                    <a:prstGeom prst="rect">
+                      <a:avLst/>
+                    </a:prstGeom>
+                  </pic:spPr>
+                </pic:pic>
+              </a:graphicData>
+            </a:graphic>
+          </wp:inline>
+        </w:drawing>
+      </w:r>
+    </w:p>
+    <w:p>
+      <w:pPr>
+        <w:rPr>
+          <w:b/>
+          <w:bCs/>
+          <w:u w:val="single"/>
+        </w:rPr>
+      </w:pPr>
+      <w:r>
+        <w:rPr>
+          <w:b/>
+          <w:bCs/>
+          <w:u w:val="single"/>
+        </w:rPr>
+        <w:lastRenderedPageBreak/>
+        <w:t>Transmission</w:t>
+      </w:r>
+    </w:p>
+    <w:p>
+      <w:r>
+        <w:t xml:space="preserve">INSERT INTO </w:t>
+      </w:r>
+      <w:proofErr w:type="gramStart"/>
+      <w:r>
+        <w:t>transmission(</w:t>
+      </w:r>
+      <w:proofErr w:type="spellStart"/>
+      <w:proofErr w:type="gramEnd"/>
+      <w:r>
+        <w:t>Event_Number</w:t>
+      </w:r>
+      <w:proofErr w:type="spellEnd"/>
+      <w:r>
+        <w:t>, Method)</w:t>
+      </w:r>
+    </w:p>
+    <w:p>
+      <w:proofErr w:type="gramStart"/>
+      <w:r>
+        <w:t>VALUES(</w:t>
+      </w:r>
+      <w:proofErr w:type="gramEnd"/>
+      <w:r>
+        <w:t>2, "Shared Surfaces");</w:t>
+      </w:r>
+    </w:p>
+    <w:p>
+      <w:r>
+        <w:rPr>
+          <w:noProof/>
+        </w:rPr>
+        <w:drawing>
+          <wp:inline distT="0" distB="0" distL="0" distR="0" wp14:anchorId="35720529" wp14:editId="1149DCB0">
+            <wp:extent cx="4502381" cy="1085906"/>
+            <wp:effectExtent l="0" t="0" r="0" b="0"/>
+            <wp:docPr id="197035201" name="Picture 1" descr="Airborne Particles,&#10;&#10;AI-generated content may be incorrect."/>
+            <wp:cNvGraphicFramePr>
+              <a:graphicFrameLocks xmlns:a="http://schemas.openxmlformats.org/drawingml/2006/main" noChangeAspect="1"/>
+            </wp:cNvGraphicFramePr>
+            <a:graphic xmlns:a="http://schemas.openxmlformats.org/drawingml/2006/main">
+              <a:graphicData uri="http://schemas.openxmlformats.org/drawingml/2006/picture">
+                <pic:pic xmlns:pic="http://schemas.openxmlformats.org/drawingml/2006/picture">
+                  <pic:nvPicPr>
+                    <pic:cNvPr id="197035201" name="Picture 1" descr="Airborne Particles,&#10;&#10;AI-generated content may be incorrect."/>
+                    <pic:cNvPicPr/>
+                  </pic:nvPicPr>
+                  <pic:blipFill>
+                    <a:blip r:embed="rId8"/>
+                    <a:stretch>
+                      <a:fillRect/>
+                    </a:stretch>
+                  </pic:blipFill>
+                  <pic:spPr>
+                    <a:xfrm>
+                      <a:off x="0" y="0"/>
+                      <a:ext cx="4502381" cy="1085906"/>
+                    </a:xfrm>
+                    <a:prstGeom prst="rect">
+                      <a:avLst/>
+                    </a:prstGeom>
+                  </pic:spPr>
+                </pic:pic>
+              </a:graphicData>
+            </a:graphic>
+          </wp:inline>
+        </w:drawing>
       </w:r>
     </w:p>
     <w:p/>
@@ -342,7 +499,6 @@
         <w:rPr>
           <w:u w:val="single"/>
         </w:rPr>
-        <w:lastRenderedPageBreak/>
         <w:t>Query 1: using like</w:t>
       </w:r>
     </w:p>
@@ -357,6 +513,9 @@
       <w:proofErr w:type="spellEnd"/>
       <w:r>
         <w:t xml:space="preserve"> LIKE "%Side"</w:t>
+      </w:r>
+      <w:r>
+        <w:t>;</w:t>
       </w:r>
     </w:p>
     <w:p>
@@ -395,7 +554,7 @@
                     <pic:cNvPicPr/>
                   </pic:nvPicPr>
                   <pic:blipFill>
-                    <a:blip r:embed="rId7"/>
+                    <a:blip r:embed="rId9"/>
                     <a:stretch>
                       <a:fillRect/>
                     </a:stretch>
@@ -501,7 +660,7 @@
       </w:r>
       <w:proofErr w:type="spellEnd"/>
       <w:r>
-        <w:t xml:space="preserve">, Population, </w:t>
+        <w:t xml:space="preserve">, </w:t>
       </w:r>
       <w:proofErr w:type="spellStart"/>
       <w:r>
@@ -610,6 +769,7 @@
           <w:b/>
           <w:bCs/>
         </w:rPr>
+        <w:lastRenderedPageBreak/>
         <w:t>Result:</w:t>
       </w:r>
       <w:r>
@@ -622,19 +782,20 @@
     <w:p>
       <w:pPr>
         <w:rPr>
-          <w:b/>
-          <w:bCs/>
-        </w:rPr>
-      </w:pPr>
-      <w:r>
-        <w:rPr>
           <w:noProof/>
         </w:rPr>
+      </w:pPr>
+    </w:p>
+    <w:p>
+      <w:r>
+        <w:rPr>
+          <w:noProof/>
+        </w:rPr>
         <w:drawing>
-          <wp:inline distT="0" distB="0" distL="0" distR="0" wp14:anchorId="4286FC28" wp14:editId="4F847185">
-            <wp:extent cx="5632450" cy="938534"/>
-            <wp:effectExtent l="0" t="0" r="6350" b="0"/>
-            <wp:docPr id="1380926349" name="Picture 1" descr="The image displays a table listing various events, including the number of people infected, the event description, and the total infected count, suggesting a scenario of a spreading infection through cash and contact in public places.&#10;&#10;AI-generated content may be incorrect."/>
+          <wp:inline distT="0" distB="0" distL="0" distR="0" wp14:anchorId="028083B6" wp14:editId="09FAEDD6">
+            <wp:extent cx="5731510" cy="903605"/>
+            <wp:effectExtent l="0" t="0" r="2540" b="0"/>
+            <wp:docPr id="1463138293" name="Picture 1" descr="The image displays a table listing various events where infection occurred, including infected currency and contact in public places like malls, subways, markets, ATMs, and theaters.&#10;&#10;AI-generated content may be incorrect."/>
             <wp:cNvGraphicFramePr>
               <a:graphicFrameLocks xmlns:a="http://schemas.openxmlformats.org/drawingml/2006/main" noChangeAspect="1"/>
             </wp:cNvGraphicFramePr>
@@ -642,11 +803,11 @@
               <a:graphicData uri="http://schemas.openxmlformats.org/drawingml/2006/picture">
                 <pic:pic xmlns:pic="http://schemas.openxmlformats.org/drawingml/2006/picture">
                   <pic:nvPicPr>
-                    <pic:cNvPr id="1380926349" name="Picture 1" descr="The image displays a table listing various events, including the number of people infected, the event description, and the total infected count, suggesting a scenario of a spreading infection through cash and contact in public places.&#10;&#10;AI-generated content may be incorrect."/>
+                    <pic:cNvPr id="1463138293" name="Picture 1" descr="The image displays a table listing various events where infection occurred, including infected currency and contact in public places like malls, subways, markets, ATMs, and theaters.&#10;&#10;AI-generated content may be incorrect."/>
                     <pic:cNvPicPr/>
                   </pic:nvPicPr>
                   <pic:blipFill>
-                    <a:blip r:embed="rId8"/>
+                    <a:blip r:embed="rId10"/>
                     <a:stretch>
                       <a:fillRect/>
                     </a:stretch>
@@ -654,7 +815,7 @@
                   <pic:spPr>
                     <a:xfrm>
                       <a:off x="0" y="0"/>
-                      <a:ext cx="5632516" cy="938545"/>
+                      <a:ext cx="5731510" cy="903605"/>
                     </a:xfrm>
                     <a:prstGeom prst="rect">
                       <a:avLst/>
@@ -678,7 +839,6 @@
         <w:rPr>
           <w:noProof/>
         </w:rPr>
-        <w:lastRenderedPageBreak/>
         <w:drawing>
           <wp:inline distT="0" distB="0" distL="0" distR="0" wp14:anchorId="4E92B272" wp14:editId="6A11C97F">
             <wp:extent cx="5731510" cy="1728470"/>
@@ -695,7 +855,7 @@
                     <pic:cNvPicPr/>
                   </pic:nvPicPr>
                   <pic:blipFill>
-                    <a:blip r:embed="rId9"/>
+                    <a:blip r:embed="rId11"/>
                     <a:stretch>
                       <a:fillRect/>
                     </a:stretch>
@@ -817,6 +977,9 @@
       <w:r>
         <w:t xml:space="preserve"> &gt; 40000</w:t>
       </w:r>
+      <w:r>
+        <w:t>;</w:t>
+      </w:r>
     </w:p>
     <w:p>
       <w:r>
@@ -858,6 +1021,7 @@
           <w:bCs/>
           <w:noProof/>
         </w:rPr>
+        <w:lastRenderedPageBreak/>
         <w:drawing>
           <wp:inline distT="0" distB="0" distL="0" distR="0" wp14:anchorId="2939E707" wp14:editId="6AC7EB4E">
             <wp:extent cx="4718050" cy="2518454"/>
@@ -874,7 +1038,7 @@
                     <pic:cNvPicPr/>
                   </pic:nvPicPr>
                   <pic:blipFill>
-                    <a:blip r:embed="rId10"/>
+                    <a:blip r:embed="rId12"/>
                     <a:stretch>
                       <a:fillRect/>
                     </a:stretch>
@@ -922,45 +1086,91 @@
       </w:r>
     </w:p>
     <w:p>
-      <w:pPr>
+      <w:r>
         <w:rPr>
           <w:b/>
           <w:bCs/>
         </w:rPr>
-      </w:pPr>
+        <w:t>Purpose:</w:t>
+      </w:r>
       <w:r>
         <w:rPr>
           <w:b/>
           <w:bCs/>
         </w:rPr>
-        <w:t>Purpose:</w:t>
+        <w:t xml:space="preserve"> </w:t>
+      </w:r>
+      <w:r>
+        <w:t>We want to see the total number of blocks as well as the total number of people infected across each neighbourhood.</w:t>
+      </w:r>
+    </w:p>
+    <w:p>
+      <w:r>
+        <w:t xml:space="preserve">/* SUM is the total number of </w:t>
+      </w:r>
+      <w:proofErr w:type="gramStart"/>
+      <w:r>
+        <w:t>infected</w:t>
+      </w:r>
+      <w:proofErr w:type="gramEnd"/>
+      <w:r>
+        <w:t xml:space="preserve"> and COUNT increments the individual instances of each block in each neighbourhood. */</w:t>
       </w:r>
     </w:p>
     <w:p/>
     <w:p>
-      <w:pPr>
-        <w:pStyle w:val="Heading2"/>
-        <w:rPr>
-          <w:u w:val="single"/>
-        </w:rPr>
-      </w:pPr>
-      <w:r>
-        <w:rPr>
-          <w:u w:val="single"/>
-        </w:rPr>
-        <w:t xml:space="preserve">Query </w:t>
-      </w:r>
-      <w:r>
-        <w:rPr>
-          <w:u w:val="single"/>
-        </w:rPr>
-        <w:t>5</w:t>
-      </w:r>
-      <w:r>
-        <w:rPr>
-          <w:u w:val="single"/>
-        </w:rPr>
-        <w:t xml:space="preserve">: </w:t>
+      <w:r>
+        <w:t xml:space="preserve">SELECT </w:t>
+      </w:r>
+      <w:proofErr w:type="spellStart"/>
+      <w:r>
+        <w:t>Neighbourhood_ID</w:t>
+      </w:r>
+      <w:proofErr w:type="spellEnd"/>
+      <w:r>
+        <w:t>, SUM(</w:t>
+      </w:r>
+      <w:proofErr w:type="spellStart"/>
+      <w:r>
+        <w:t>Infected_Count</w:t>
+      </w:r>
+      <w:proofErr w:type="spellEnd"/>
+      <w:r>
+        <w:t>), COUNT(</w:t>
+      </w:r>
+      <w:proofErr w:type="spellStart"/>
+      <w:r>
+        <w:t>Block_ID</w:t>
+      </w:r>
+      <w:proofErr w:type="spellEnd"/>
+      <w:r>
+        <w:t xml:space="preserve">) </w:t>
+      </w:r>
+    </w:p>
+    <w:p>
+      <w:r>
+        <w:t xml:space="preserve">FROM </w:t>
+      </w:r>
+      <w:proofErr w:type="spellStart"/>
+      <w:r>
+        <w:t>cityblock</w:t>
+      </w:r>
+      <w:proofErr w:type="spellEnd"/>
+      <w:r>
+        <w:t xml:space="preserve"> </w:t>
+      </w:r>
+    </w:p>
+    <w:p>
+      <w:r>
+        <w:t xml:space="preserve">GROUP BY </w:t>
+      </w:r>
+      <w:proofErr w:type="spellStart"/>
+      <w:r>
+        <w:t>Neighbourhood_ID</w:t>
+      </w:r>
+      <w:proofErr w:type="spellEnd"/>
+      <w:r>
+        <w:t>;</w:t>
       </w:r>
     </w:p>
     <w:p>
@@ -975,35 +1185,7 @@
           <w:b/>
           <w:bCs/>
         </w:rPr>
-        <w:t>Purpose:</w:t>
-      </w:r>
-    </w:p>
-    <w:p/>
-    <w:p>
-      <w:pPr>
-        <w:pStyle w:val="Heading2"/>
-        <w:rPr>
-          <w:u w:val="single"/>
-        </w:rPr>
-      </w:pPr>
-      <w:r>
-        <w:rPr>
-          <w:u w:val="single"/>
-        </w:rPr>
-        <w:lastRenderedPageBreak/>
-        <w:t xml:space="preserve">Query </w:t>
-      </w:r>
-      <w:r>
-        <w:rPr>
-          <w:u w:val="single"/>
-        </w:rPr>
-        <w:t>6</w:t>
-      </w:r>
-      <w:r>
-        <w:rPr>
-          <w:u w:val="single"/>
-        </w:rPr>
-        <w:t xml:space="preserve">: </w:t>
+        <w:t>Result</w:t>
       </w:r>
     </w:p>
     <w:p>
@@ -1017,11 +1199,223 @@
         <w:rPr>
           <w:b/>
           <w:bCs/>
+          <w:noProof/>
+        </w:rPr>
+        <w:lastRenderedPageBreak/>
+        <w:drawing>
+          <wp:inline distT="0" distB="0" distL="0" distR="0" wp14:anchorId="18B8B7A5" wp14:editId="1D9DBCC0">
+            <wp:extent cx="3246133" cy="3651250"/>
+            <wp:effectExtent l="0" t="0" r="0" b="6350"/>
+            <wp:docPr id="1498612924" name="Picture 1" descr="The image is a table displaying a summary of neighborhood data, listing unique Neighborhood IDs, their total infected count, and the count of blocks within each neighborhood.&#10;&#10;AI-generated content may be incorrect."/>
+            <wp:cNvGraphicFramePr>
+              <a:graphicFrameLocks xmlns:a="http://schemas.openxmlformats.org/drawingml/2006/main" noChangeAspect="1"/>
+            </wp:cNvGraphicFramePr>
+            <a:graphic xmlns:a="http://schemas.openxmlformats.org/drawingml/2006/main">
+              <a:graphicData uri="http://schemas.openxmlformats.org/drawingml/2006/picture">
+                <pic:pic xmlns:pic="http://schemas.openxmlformats.org/drawingml/2006/picture">
+                  <pic:nvPicPr>
+                    <pic:cNvPr id="1498612924" name="Picture 1" descr="The image is a table displaying a summary of neighborhood data, listing unique Neighborhood IDs, their total infected count, and the count of blocks within each neighborhood.&#10;&#10;AI-generated content may be incorrect."/>
+                    <pic:cNvPicPr/>
+                  </pic:nvPicPr>
+                  <pic:blipFill>
+                    <a:blip r:embed="rId13"/>
+                    <a:stretch>
+                      <a:fillRect/>
+                    </a:stretch>
+                  </pic:blipFill>
+                  <pic:spPr>
+                    <a:xfrm>
+                      <a:off x="0" y="0"/>
+                      <a:ext cx="3250315" cy="3655954"/>
+                    </a:xfrm>
+                    <a:prstGeom prst="rect">
+                      <a:avLst/>
+                    </a:prstGeom>
+                  </pic:spPr>
+                </pic:pic>
+              </a:graphicData>
+            </a:graphic>
+          </wp:inline>
+        </w:drawing>
+      </w:r>
+    </w:p>
+    <w:p>
+      <w:pPr>
+        <w:pStyle w:val="Heading2"/>
+        <w:rPr>
+          <w:u w:val="single"/>
+        </w:rPr>
+      </w:pPr>
+      <w:r>
+        <w:rPr>
+          <w:u w:val="single"/>
+        </w:rPr>
+        <w:t xml:space="preserve">Query </w:t>
+      </w:r>
+      <w:r>
+        <w:rPr>
+          <w:u w:val="single"/>
+        </w:rPr>
+        <w:t>5</w:t>
+      </w:r>
+      <w:r>
+        <w:rPr>
+          <w:u w:val="single"/>
+        </w:rPr>
+        <w:t xml:space="preserve">: </w:t>
+      </w:r>
+    </w:p>
+    <w:p>
+      <w:r>
+        <w:rPr>
+          <w:b/>
+          <w:bCs/>
         </w:rPr>
         <w:t>Purpose:</w:t>
       </w:r>
-    </w:p>
-    <w:p/>
+      <w:r>
+        <w:rPr>
+          <w:b/>
+          <w:bCs/>
+        </w:rPr>
+        <w:t xml:space="preserve"> </w:t>
+      </w:r>
+      <w:r>
+        <w:t>To only show all the blocks</w:t>
+      </w:r>
+      <w:r>
+        <w:t xml:space="preserve"> </w:t>
+      </w:r>
+      <w:r>
+        <w:t>and their infected count</w:t>
+      </w:r>
+      <w:r>
+        <w:t>s</w:t>
+      </w:r>
+      <w:r>
+        <w:t xml:space="preserve"> in </w:t>
+      </w:r>
+      <w:r>
+        <w:t>neighbourhoods 1, 2 and 3.</w:t>
+      </w:r>
+    </w:p>
+    <w:p>
+      <w:hyperlink r:id="rId14" w:tgtFrame="mysql_doc" w:history="1">
+        <w:r>
+          <w:rPr>
+            <w:rStyle w:val="Hyperlink"/>
+          </w:rPr>
+          <w:t>SELECT</w:t>
+        </w:r>
+      </w:hyperlink>
+      <w:r>
+        <w:t xml:space="preserve"> </w:t>
+      </w:r>
+      <w:proofErr w:type="spellStart"/>
+      <w:r>
+        <w:t>Block_ID</w:t>
+      </w:r>
+      <w:proofErr w:type="spellEnd"/>
+      <w:r>
+        <w:t xml:space="preserve">, </w:t>
+      </w:r>
+      <w:proofErr w:type="spellStart"/>
+      <w:r>
+        <w:t>Neighbourhood_ID</w:t>
+      </w:r>
+      <w:proofErr w:type="spellEnd"/>
+      <w:r>
+        <w:t xml:space="preserve">, Population, </w:t>
+      </w:r>
+      <w:proofErr w:type="spellStart"/>
+      <w:r>
+        <w:t>Infected_Count</w:t>
+      </w:r>
+      <w:proofErr w:type="spellEnd"/>
+      <w:r>
+        <w:t xml:space="preserve"> </w:t>
+      </w:r>
+    </w:p>
+    <w:p>
+      <w:r>
+        <w:t xml:space="preserve">FROM </w:t>
+      </w:r>
+      <w:proofErr w:type="spellStart"/>
+      <w:r>
+        <w:t>cityblock</w:t>
+      </w:r>
+      <w:proofErr w:type="spellEnd"/>
+      <w:r>
+        <w:t xml:space="preserve"> </w:t>
+      </w:r>
+    </w:p>
+    <w:p>
+      <w:r>
+        <w:t xml:space="preserve">WHERE </w:t>
+      </w:r>
+      <w:proofErr w:type="spellStart"/>
+      <w:r>
+        <w:t>Neighbourhood_ID</w:t>
+      </w:r>
+      <w:proofErr w:type="spellEnd"/>
+      <w:r>
+        <w:t xml:space="preserve"> </w:t>
+      </w:r>
+      <w:hyperlink r:id="rId15" w:tgtFrame="mysql_doc" w:history="1">
+        <w:r>
+          <w:rPr>
+            <w:rStyle w:val="Hyperlink"/>
+          </w:rPr>
+          <w:t>IN</w:t>
+        </w:r>
+      </w:hyperlink>
+      <w:r>
+        <w:t xml:space="preserve"> (1, 2, 3);</w:t>
+      </w:r>
+    </w:p>
+    <w:p>
+      <w:r>
+        <w:rPr>
+          <w:noProof/>
+        </w:rPr>
+        <w:lastRenderedPageBreak/>
+        <w:drawing>
+          <wp:inline distT="0" distB="0" distL="0" distR="0" wp14:anchorId="3EAD772B" wp14:editId="0E1022C3">
+            <wp:extent cx="5731510" cy="4718685"/>
+            <wp:effectExtent l="0" t="0" r="2540" b="5715"/>
+            <wp:docPr id="570353914" name="Picture 1" descr="This table displays a neighborhood's population and infected count for various Block IDs, along with options to edit, copy, or delete the data.&#10;&#10;AI-generated content may be incorrect."/>
+            <wp:cNvGraphicFramePr>
+              <a:graphicFrameLocks xmlns:a="http://schemas.openxmlformats.org/drawingml/2006/main" noChangeAspect="1"/>
+            </wp:cNvGraphicFramePr>
+            <a:graphic xmlns:a="http://schemas.openxmlformats.org/drawingml/2006/main">
+              <a:graphicData uri="http://schemas.openxmlformats.org/drawingml/2006/picture">
+                <pic:pic xmlns:pic="http://schemas.openxmlformats.org/drawingml/2006/picture">
+                  <pic:nvPicPr>
+                    <pic:cNvPr id="570353914" name="Picture 1" descr="This table displays a neighborhood's population and infected count for various Block IDs, along with options to edit, copy, or delete the data.&#10;&#10;AI-generated content may be incorrect."/>
+                    <pic:cNvPicPr/>
+                  </pic:nvPicPr>
+                  <pic:blipFill>
+                    <a:blip r:embed="rId16"/>
+                    <a:stretch>
+                      <a:fillRect/>
+                    </a:stretch>
+                  </pic:blipFill>
+                  <pic:spPr>
+                    <a:xfrm>
+                      <a:off x="0" y="0"/>
+                      <a:ext cx="5731510" cy="4718685"/>
+                    </a:xfrm>
+                    <a:prstGeom prst="rect">
+                      <a:avLst/>
+                    </a:prstGeom>
+                  </pic:spPr>
+                </pic:pic>
+              </a:graphicData>
+            </a:graphic>
+          </wp:inline>
+        </w:drawing>
+      </w:r>
+    </w:p>
     <w:p>
       <w:pPr>
         <w:pStyle w:val="Heading2"/>
@@ -1033,10 +1427,392 @@
         <w:rPr>
           <w:u w:val="single"/>
         </w:rPr>
+        <w:t xml:space="preserve">Query </w:t>
+      </w:r>
+      <w:r>
+        <w:rPr>
+          <w:u w:val="single"/>
+        </w:rPr>
+        <w:t>6</w:t>
+      </w:r>
+      <w:r>
+        <w:rPr>
+          <w:u w:val="single"/>
+        </w:rPr>
+        <w:t xml:space="preserve">: </w:t>
+      </w:r>
+    </w:p>
+    <w:p>
+      <w:pPr>
+        <w:rPr>
+          <w:b/>
+          <w:bCs/>
+        </w:rPr>
+      </w:pPr>
+      <w:r>
+        <w:rPr>
+          <w:b/>
+          <w:bCs/>
+        </w:rPr>
+        <w:t>Purpose:</w:t>
+      </w:r>
+    </w:p>
+    <w:p>
+      <w:r>
+        <w:drawing>
+          <wp:inline distT="0" distB="0" distL="0" distR="0" wp14:anchorId="67565FF0" wp14:editId="0E23C296">
+            <wp:extent cx="5731510" cy="394335"/>
+            <wp:effectExtent l="0" t="0" r="2540" b="5715"/>
+            <wp:docPr id="706505288" name="Picture 1" descr="The image displays a table with columns for Block ID, Neighbourhood ID, Population, Infected Count, and Recovered Count, with values showing 1, 1, 32,250, 30,638, and 1,613 respectively, along with options to copy and delete the data.&#10;&#10;AI-generated content may be incorrect."/>
+            <wp:cNvGraphicFramePr>
+              <a:graphicFrameLocks xmlns:a="http://schemas.openxmlformats.org/drawingml/2006/main" noChangeAspect="1"/>
+            </wp:cNvGraphicFramePr>
+            <a:graphic xmlns:a="http://schemas.openxmlformats.org/drawingml/2006/main">
+              <a:graphicData uri="http://schemas.openxmlformats.org/drawingml/2006/picture">
+                <pic:pic xmlns:pic="http://schemas.openxmlformats.org/drawingml/2006/picture">
+                  <pic:nvPicPr>
+                    <pic:cNvPr id="706505288" name="Picture 1" descr="The image displays a table with columns for Block ID, Neighbourhood ID, Population, Infected Count, and Recovered Count, with values showing 1, 1, 32,250, 30,638, and 1,613 respectively, along with options to copy and delete the data.&#10;&#10;AI-generated content may be incorrect."/>
+                    <pic:cNvPicPr/>
+                  </pic:nvPicPr>
+                  <pic:blipFill>
+                    <a:blip r:embed="rId17"/>
+                    <a:stretch>
+                      <a:fillRect/>
+                    </a:stretch>
+                  </pic:blipFill>
+                  <pic:spPr>
+                    <a:xfrm>
+                      <a:off x="0" y="0"/>
+                      <a:ext cx="5731510" cy="394335"/>
+                    </a:xfrm>
+                    <a:prstGeom prst="rect">
+                      <a:avLst/>
+                    </a:prstGeom>
+                  </pic:spPr>
+                </pic:pic>
+              </a:graphicData>
+            </a:graphic>
+          </wp:inline>
+        </w:drawing>
+      </w:r>
+    </w:p>
+    <w:p>
+      <w:r>
+        <w:drawing>
+          <wp:inline distT="0" distB="0" distL="0" distR="0" wp14:anchorId="4A7116DC" wp14:editId="0C36AC20">
+            <wp:extent cx="5731510" cy="196850"/>
+            <wp:effectExtent l="0" t="0" r="2540" b="0"/>
+            <wp:docPr id="404092634" name="Picture 1"/>
+            <wp:cNvGraphicFramePr>
+              <a:graphicFrameLocks xmlns:a="http://schemas.openxmlformats.org/drawingml/2006/main" noChangeAspect="1"/>
+            </wp:cNvGraphicFramePr>
+            <a:graphic xmlns:a="http://schemas.openxmlformats.org/drawingml/2006/main">
+              <a:graphicData uri="http://schemas.openxmlformats.org/drawingml/2006/picture">
+                <pic:pic xmlns:pic="http://schemas.openxmlformats.org/drawingml/2006/picture">
+                  <pic:nvPicPr>
+                    <pic:cNvPr id="404092634" name=""/>
+                    <pic:cNvPicPr/>
+                  </pic:nvPicPr>
+                  <pic:blipFill>
+                    <a:blip r:embed="rId18"/>
+                    <a:stretch>
+                      <a:fillRect/>
+                    </a:stretch>
+                  </pic:blipFill>
+                  <pic:spPr>
+                    <a:xfrm>
+                      <a:off x="0" y="0"/>
+                      <a:ext cx="5731510" cy="196850"/>
+                    </a:xfrm>
+                    <a:prstGeom prst="rect">
+                      <a:avLst/>
+                    </a:prstGeom>
+                  </pic:spPr>
+                </pic:pic>
+              </a:graphicData>
+            </a:graphic>
+          </wp:inline>
+        </w:drawing>
+      </w:r>
+    </w:p>
+    <w:p>
+      <w:pPr>
+        <w:pStyle w:val="Heading2"/>
+        <w:rPr>
+          <w:u w:val="single"/>
+        </w:rPr>
+      </w:pPr>
+      <w:r>
+        <w:rPr>
+          <w:u w:val="single"/>
+        </w:rPr>
+        <w:drawing>
+          <wp:inline distT="0" distB="0" distL="0" distR="0" wp14:anchorId="4090FA03" wp14:editId="72CE3CCF">
+            <wp:extent cx="5731510" cy="213995"/>
+            <wp:effectExtent l="0" t="0" r="2540" b="0"/>
+            <wp:docPr id="462479058" name="Picture 1"/>
+            <wp:cNvGraphicFramePr>
+              <a:graphicFrameLocks xmlns:a="http://schemas.openxmlformats.org/drawingml/2006/main" noChangeAspect="1"/>
+            </wp:cNvGraphicFramePr>
+            <a:graphic xmlns:a="http://schemas.openxmlformats.org/drawingml/2006/main">
+              <a:graphicData uri="http://schemas.openxmlformats.org/drawingml/2006/picture">
+                <pic:pic xmlns:pic="http://schemas.openxmlformats.org/drawingml/2006/picture">
+                  <pic:nvPicPr>
+                    <pic:cNvPr id="462479058" name=""/>
+                    <pic:cNvPicPr/>
+                  </pic:nvPicPr>
+                  <pic:blipFill>
+                    <a:blip r:embed="rId19"/>
+                    <a:stretch>
+                      <a:fillRect/>
+                    </a:stretch>
+                  </pic:blipFill>
+                  <pic:spPr>
+                    <a:xfrm>
+                      <a:off x="0" y="0"/>
+                      <a:ext cx="5731510" cy="213995"/>
+                    </a:xfrm>
+                    <a:prstGeom prst="rect">
+                      <a:avLst/>
+                    </a:prstGeom>
+                  </pic:spPr>
+                </pic:pic>
+              </a:graphicData>
+            </a:graphic>
+          </wp:inline>
+        </w:drawing>
+      </w:r>
+    </w:p>
+    <w:p>
+      <w:r>
+        <w:t xml:space="preserve">We have identified 3 rows where the total of the </w:t>
+      </w:r>
+      <w:proofErr w:type="spellStart"/>
+      <w:r>
+        <w:t>infected_count</w:t>
+      </w:r>
+      <w:proofErr w:type="spellEnd"/>
+      <w:r>
+        <w:t xml:space="preserve"> and </w:t>
+      </w:r>
+      <w:proofErr w:type="spellStart"/>
+      <w:r>
+        <w:t>recovered_count</w:t>
+      </w:r>
+      <w:proofErr w:type="spellEnd"/>
+      <w:r>
         <w:t xml:space="preserve"> </w:t>
       </w:r>
-    </w:p>
-    <w:p/>
+      <w:r>
+        <w:t xml:space="preserve">adds up to 1 number higher than the population. An example is </w:t>
+      </w:r>
+      <w:r>
+        <w:t>row 1 where 30638 + 1613</w:t>
+      </w:r>
+      <w:r>
+        <w:t xml:space="preserve"> is equal to 32251</w:t>
+      </w:r>
+      <w:r>
+        <w:t xml:space="preserve"> which is not the population. We need to update </w:t>
+      </w:r>
+      <w:proofErr w:type="gramStart"/>
+      <w:r>
+        <w:t>them</w:t>
+      </w:r>
+      <w:proofErr w:type="gramEnd"/>
+      <w:r>
+        <w:t xml:space="preserve"> so the </w:t>
+      </w:r>
+      <w:r>
+        <w:t xml:space="preserve">infected and recovered count add up to the </w:t>
+      </w:r>
+      <w:r>
+        <w:t>population</w:t>
+      </w:r>
+      <w:r>
+        <w:t>.</w:t>
+      </w:r>
+    </w:p>
+    <w:p>
+      <w:r>
+        <w:t xml:space="preserve">UPDATE </w:t>
+      </w:r>
+      <w:proofErr w:type="spellStart"/>
+      <w:r>
+        <w:t>cityblock</w:t>
+      </w:r>
+      <w:proofErr w:type="spellEnd"/>
+    </w:p>
+    <w:p>
+      <w:r>
+        <w:t xml:space="preserve">SET </w:t>
+      </w:r>
+      <w:proofErr w:type="spellStart"/>
+      <w:r>
+        <w:t>Recovered_Count</w:t>
+      </w:r>
+      <w:proofErr w:type="spellEnd"/>
+      <w:r>
+        <w:t xml:space="preserve"> = </w:t>
+      </w:r>
+      <w:proofErr w:type="spellStart"/>
+      <w:r>
+        <w:t>Recovered_Count</w:t>
+      </w:r>
+      <w:proofErr w:type="spellEnd"/>
+      <w:r>
+        <w:t xml:space="preserve"> - 1 -- de-incrementing the recovered count for certain rows</w:t>
+      </w:r>
+    </w:p>
+    <w:p>
+      <w:r>
+        <w:t xml:space="preserve">WHERE </w:t>
+      </w:r>
+      <w:proofErr w:type="spellStart"/>
+      <w:r>
+        <w:t>Block_ID</w:t>
+      </w:r>
+      <w:proofErr w:type="spellEnd"/>
+      <w:r>
+        <w:t xml:space="preserve"> IN (1, 15, 51)</w:t>
+      </w:r>
+      <w:r>
+        <w:t>;</w:t>
+      </w:r>
+    </w:p>
+    <w:p>
+      <w:pPr>
+        <w:rPr>
+          <w:b/>
+          <w:bCs/>
+        </w:rPr>
+      </w:pPr>
+      <w:r>
+        <w:rPr>
+          <w:b/>
+          <w:bCs/>
+        </w:rPr>
+        <w:lastRenderedPageBreak/>
+        <w:t>Result:</w:t>
+      </w:r>
+    </w:p>
+    <w:p>
+      <w:r>
+        <w:drawing>
+          <wp:inline distT="0" distB="0" distL="0" distR="0" wp14:anchorId="47FB914E" wp14:editId="71ACAC5D">
+            <wp:extent cx="5731510" cy="384810"/>
+            <wp:effectExtent l="0" t="0" r="2540" b="0"/>
+            <wp:docPr id="119991242" name="Picture 1" descr="The image displays a table with columns for Block ID, Neighbourhood ID, Population, Infected Count, and Recovered Count, along with options to copy and delete the data.&#10;&#10;AI-generated content may be incorrect."/>
+            <wp:cNvGraphicFramePr>
+              <a:graphicFrameLocks xmlns:a="http://schemas.openxmlformats.org/drawingml/2006/main" noChangeAspect="1"/>
+            </wp:cNvGraphicFramePr>
+            <a:graphic xmlns:a="http://schemas.openxmlformats.org/drawingml/2006/main">
+              <a:graphicData uri="http://schemas.openxmlformats.org/drawingml/2006/picture">
+                <pic:pic xmlns:pic="http://schemas.openxmlformats.org/drawingml/2006/picture">
+                  <pic:nvPicPr>
+                    <pic:cNvPr id="119991242" name="Picture 1" descr="The image displays a table with columns for Block ID, Neighbourhood ID, Population, Infected Count, and Recovered Count, along with options to copy and delete the data.&#10;&#10;AI-generated content may be incorrect."/>
+                    <pic:cNvPicPr/>
+                  </pic:nvPicPr>
+                  <pic:blipFill>
+                    <a:blip r:embed="rId20"/>
+                    <a:stretch>
+                      <a:fillRect/>
+                    </a:stretch>
+                  </pic:blipFill>
+                  <pic:spPr>
+                    <a:xfrm>
+                      <a:off x="0" y="0"/>
+                      <a:ext cx="5731510" cy="384810"/>
+                    </a:xfrm>
+                    <a:prstGeom prst="rect">
+                      <a:avLst/>
+                    </a:prstGeom>
+                  </pic:spPr>
+                </pic:pic>
+              </a:graphicData>
+            </a:graphic>
+          </wp:inline>
+        </w:drawing>
+      </w:r>
+    </w:p>
+    <w:p>
+      <w:r>
+        <w:drawing>
+          <wp:inline distT="0" distB="0" distL="0" distR="0" wp14:anchorId="5B5A5CD3" wp14:editId="0BCDC0A9">
+            <wp:extent cx="5731510" cy="211455"/>
+            <wp:effectExtent l="0" t="0" r="2540" b="0"/>
+            <wp:docPr id="723308478" name="Picture 1"/>
+            <wp:cNvGraphicFramePr>
+              <a:graphicFrameLocks xmlns:a="http://schemas.openxmlformats.org/drawingml/2006/main" noChangeAspect="1"/>
+            </wp:cNvGraphicFramePr>
+            <a:graphic xmlns:a="http://schemas.openxmlformats.org/drawingml/2006/main">
+              <a:graphicData uri="http://schemas.openxmlformats.org/drawingml/2006/picture">
+                <pic:pic xmlns:pic="http://schemas.openxmlformats.org/drawingml/2006/picture">
+                  <pic:nvPicPr>
+                    <pic:cNvPr id="723308478" name=""/>
+                    <pic:cNvPicPr/>
+                  </pic:nvPicPr>
+                  <pic:blipFill>
+                    <a:blip r:embed="rId21"/>
+                    <a:stretch>
+                      <a:fillRect/>
+                    </a:stretch>
+                  </pic:blipFill>
+                  <pic:spPr>
+                    <a:xfrm>
+                      <a:off x="0" y="0"/>
+                      <a:ext cx="5731510" cy="211455"/>
+                    </a:xfrm>
+                    <a:prstGeom prst="rect">
+                      <a:avLst/>
+                    </a:prstGeom>
+                  </pic:spPr>
+                </pic:pic>
+              </a:graphicData>
+            </a:graphic>
+          </wp:inline>
+        </w:drawing>
+      </w:r>
+    </w:p>
+    <w:p>
+      <w:r>
+        <w:drawing>
+          <wp:inline distT="0" distB="0" distL="0" distR="0" wp14:anchorId="0EF6D3E0" wp14:editId="5342926A">
+            <wp:extent cx="5731510" cy="196850"/>
+            <wp:effectExtent l="0" t="0" r="2540" b="0"/>
+            <wp:docPr id="1937647496" name="Picture 1"/>
+            <wp:cNvGraphicFramePr>
+              <a:graphicFrameLocks xmlns:a="http://schemas.openxmlformats.org/drawingml/2006/main" noChangeAspect="1"/>
+            </wp:cNvGraphicFramePr>
+            <a:graphic xmlns:a="http://schemas.openxmlformats.org/drawingml/2006/main">
+              <a:graphicData uri="http://schemas.openxmlformats.org/drawingml/2006/picture">
+                <pic:pic xmlns:pic="http://schemas.openxmlformats.org/drawingml/2006/picture">
+                  <pic:nvPicPr>
+                    <pic:cNvPr id="1937647496" name=""/>
+                    <pic:cNvPicPr/>
+                  </pic:nvPicPr>
+                  <pic:blipFill>
+                    <a:blip r:embed="rId22"/>
+                    <a:stretch>
+                      <a:fillRect/>
+                    </a:stretch>
+                  </pic:blipFill>
+                  <pic:spPr>
+                    <a:xfrm>
+                      <a:off x="0" y="0"/>
+                      <a:ext cx="5731510" cy="196850"/>
+                    </a:xfrm>
+                    <a:prstGeom prst="rect">
+                      <a:avLst/>
+                    </a:prstGeom>
+                  </pic:spPr>
+                </pic:pic>
+              </a:graphicData>
+            </a:graphic>
+          </wp:inline>
+        </w:drawing>
+      </w:r>
+    </w:p>
     <w:sectPr>
       <w:pgSz w:w="11906" w:h="16838"/>
       <w:pgMar w:top="1440" w:right="1440" w:bottom="1440" w:left="1440" w:header="708" w:footer="708" w:gutter="0"/>
@@ -1050,6 +1826,118 @@
 <file path=word/numbering.xml><?xml version="1.0" encoding="utf-8"?>
 <w:numbering xmlns:wpc="http://schemas.microsoft.com/office/word/2010/wordprocessingCanvas" xmlns:cx="http://schemas.microsoft.com/office/drawing/2014/chartex" xmlns:cx1="http://schemas.microsoft.com/office/drawing/2015/9/8/chartex" xmlns:cx2="http://schemas.microsoft.com/office/drawing/2015/10/21/chartex" xmlns:cx3="http://schemas.microsoft.com/office/drawing/2016/5/9/chartex" xmlns:cx4="http://schemas.microsoft.com/office/drawing/2016/5/10/chartex" xmlns:cx5="http://schemas.microsoft.com/office/drawing/2016/5/11/chartex" xmlns:cx6="http://schemas.microsoft.com/office/drawing/2016/5/12/chartex" xmlns:cx7="http://schemas.microsoft.com/office/drawing/2016/5/13/chartex" xmlns:cx8="http://schemas.microsoft.com/office/drawing/2016/5/14/chartex" xmlns:mc="http://schemas.openxmlformats.org/markup-compatibility/2006" xmlns:aink="http://schemas.microsoft.com/office/drawing/2016/ink" xmlns:am3d="http://schemas.microsoft.com/office/drawing/2017/model3d" xmlns:o="urn:schemas-microsoft-com:office:office" xmlns:oel="http://schemas.microsoft.com/office/2019/extlst" xmlns:r="http://schemas.openxmlformats.org/officeDocument/2006/relationships" xmlns:m="http://schemas.openxmlformats.org/officeDocument/2006/math" xmlns:v="urn:schemas-microsoft-com:vml" xmlns:wp14="http://schemas.microsoft.com/office/word/2010/wordprocessingDrawing" xmlns:wp="http://schemas.openxmlformats.org/drawingml/2006/wordprocessingDrawing" xmlns:w10="urn:schemas-microsoft-com:office:word" xmlns:w="http://schemas.openxmlformats.org/wordprocessingml/2006/main" xmlns:w14="http://schemas.microsoft.com/office/word/2010/wordml" xmlns:w15="http://schemas.microsoft.com/office/word/2012/wordml" xmlns:w16cex="http://schemas.microsoft.com/office/word/2018/wordml/cex" xmlns:w16cid="http://schemas.microsoft.com/office/word/2016/wordml/cid" xmlns:w16="http://schemas.microsoft.com/office/word/2018/wordml" xmlns:w16du="http://schemas.microsoft.com/office/word/2023/wordml/word16du" xmlns:w16sdtdh="http://schemas.microsoft.com/office/word/2020/wordml/sdtdatahash" xmlns:w16sdtfl="http://schemas.microsoft.com/office/word/2024/wordml/sdtformatlock" xmlns:w16se="http://schemas.microsoft.com/office/word/2015/wordml/symex" xmlns:wpg="http://schemas.microsoft.com/office/word/2010/wordprocessingGroup" xmlns:wpi="http://schemas.microsoft.com/office/word/2010/wordprocessingInk" xmlns:wne="http://schemas.microsoft.com/office/word/2006/wordml" xmlns:wps="http://schemas.microsoft.com/office/word/2010/wordprocessingShape" mc:Ignorable="w14 w15 w16se w16cid w16 w16cex w16sdtdh w16sdtfl w16du wp14">
   <w:abstractNum w:abstractNumId="0" w15:restartNumberingAfterBreak="0">
+    <w:nsid w:val="0994213F"/>
+    <w:multiLevelType w:val="hybridMultilevel"/>
+    <w:tmpl w:val="E2A0C5BC"/>
+    <w:lvl w:ilvl="0" w:tplc="710081D2">
+      <w:numFmt w:val="bullet"/>
+      <w:lvlText w:val=""/>
+      <w:lvlJc w:val="left"/>
+      <w:pPr>
+        <w:ind w:left="720" w:hanging="360"/>
+      </w:pPr>
+      <w:rPr>
+        <w:rFonts w:ascii="Wingdings" w:eastAsiaTheme="minorHAnsi" w:hAnsi="Wingdings" w:cstheme="minorBidi" w:hint="default"/>
+      </w:rPr>
+    </w:lvl>
+    <w:lvl w:ilvl="1" w:tplc="08090003" w:tentative="1">
+      <w:start w:val="1"/>
+      <w:numFmt w:val="bullet"/>
+      <w:lvlText w:val="o"/>
+      <w:lvlJc w:val="left"/>
+      <w:pPr>
+        <w:ind w:left="1440" w:hanging="360"/>
+      </w:pPr>
+      <w:rPr>
+        <w:rFonts w:ascii="Courier New" w:hAnsi="Courier New" w:cs="Courier New" w:hint="default"/>
+      </w:rPr>
+    </w:lvl>
+    <w:lvl w:ilvl="2" w:tplc="08090005" w:tentative="1">
+      <w:start w:val="1"/>
+      <w:numFmt w:val="bullet"/>
+      <w:lvlText w:val=""/>
+      <w:lvlJc w:val="left"/>
+      <w:pPr>
+        <w:ind w:left="2160" w:hanging="360"/>
+      </w:pPr>
+      <w:rPr>
+        <w:rFonts w:ascii="Wingdings" w:hAnsi="Wingdings" w:hint="default"/>
+      </w:rPr>
+    </w:lvl>
+    <w:lvl w:ilvl="3" w:tplc="08090001" w:tentative="1">
+      <w:start w:val="1"/>
+      <w:numFmt w:val="bullet"/>
+      <w:lvlText w:val=""/>
+      <w:lvlJc w:val="left"/>
+      <w:pPr>
+        <w:ind w:left="2880" w:hanging="360"/>
+      </w:pPr>
+      <w:rPr>
+        <w:rFonts w:ascii="Symbol" w:hAnsi="Symbol" w:hint="default"/>
+      </w:rPr>
+    </w:lvl>
+    <w:lvl w:ilvl="4" w:tplc="08090003" w:tentative="1">
+      <w:start w:val="1"/>
+      <w:numFmt w:val="bullet"/>
+      <w:lvlText w:val="o"/>
+      <w:lvlJc w:val="left"/>
+      <w:pPr>
+        <w:ind w:left="3600" w:hanging="360"/>
+      </w:pPr>
+      <w:rPr>
+        <w:rFonts w:ascii="Courier New" w:hAnsi="Courier New" w:cs="Courier New" w:hint="default"/>
+      </w:rPr>
+    </w:lvl>
+    <w:lvl w:ilvl="5" w:tplc="08090005" w:tentative="1">
+      <w:start w:val="1"/>
+      <w:numFmt w:val="bullet"/>
+      <w:lvlText w:val=""/>
+      <w:lvlJc w:val="left"/>
+      <w:pPr>
+        <w:ind w:left="4320" w:hanging="360"/>
+      </w:pPr>
+      <w:rPr>
+        <w:rFonts w:ascii="Wingdings" w:hAnsi="Wingdings" w:hint="default"/>
+      </w:rPr>
+    </w:lvl>
+    <w:lvl w:ilvl="6" w:tplc="08090001" w:tentative="1">
+      <w:start w:val="1"/>
+      <w:numFmt w:val="bullet"/>
+      <w:lvlText w:val=""/>
+      <w:lvlJc w:val="left"/>
+      <w:pPr>
+        <w:ind w:left="5040" w:hanging="360"/>
+      </w:pPr>
+      <w:rPr>
+        <w:rFonts w:ascii="Symbol" w:hAnsi="Symbol" w:hint="default"/>
+      </w:rPr>
+    </w:lvl>
+    <w:lvl w:ilvl="7" w:tplc="08090003" w:tentative="1">
+      <w:start w:val="1"/>
+      <w:numFmt w:val="bullet"/>
+      <w:lvlText w:val="o"/>
+      <w:lvlJc w:val="left"/>
+      <w:pPr>
+        <w:ind w:left="5760" w:hanging="360"/>
+      </w:pPr>
+      <w:rPr>
+        <w:rFonts w:ascii="Courier New" w:hAnsi="Courier New" w:cs="Courier New" w:hint="default"/>
+      </w:rPr>
+    </w:lvl>
+    <w:lvl w:ilvl="8" w:tplc="08090005" w:tentative="1">
+      <w:start w:val="1"/>
+      <w:numFmt w:val="bullet"/>
+      <w:lvlText w:val=""/>
+      <w:lvlJc w:val="left"/>
+      <w:pPr>
+        <w:ind w:left="6480" w:hanging="360"/>
+      </w:pPr>
+      <w:rPr>
+        <w:rFonts w:ascii="Wingdings" w:hAnsi="Wingdings" w:hint="default"/>
+      </w:rPr>
+    </w:lvl>
+  </w:abstractNum>
+  <w:abstractNum w:abstractNumId="1" w15:restartNumberingAfterBreak="0">
     <w:nsid w:val="2936378D"/>
     <w:multiLevelType w:val="hybridMultilevel"/>
     <w:tmpl w:val="A71A0160"/>
@@ -1163,6 +2051,9 @@
     </w:lvl>
   </w:abstractNum>
   <w:num w:numId="1" w16cid:durableId="667825439">
+    <w:abstractNumId w:val="1"/>
+  </w:num>
+  <w:num w:numId="2" w16cid:durableId="1201749053">
     <w:abstractNumId w:val="0"/>
   </w:num>
 </w:numbering>
@@ -2083,6 +2974,29 @@
       <w:spacing w:val="5"/>
     </w:rPr>
   </w:style>
+  <w:style w:type="character" w:styleId="Hyperlink">
+    <w:name w:val="Hyperlink"/>
+    <w:basedOn w:val="DefaultParagraphFont"/>
+    <w:uiPriority w:val="99"/>
+    <w:unhideWhenUsed/>
+    <w:rsid w:val="000A45F6"/>
+    <w:rPr>
+      <w:color w:val="467886" w:themeColor="hyperlink"/>
+      <w:u w:val="single"/>
+    </w:rPr>
+  </w:style>
+  <w:style w:type="character" w:styleId="UnresolvedMention">
+    <w:name w:val="Unresolved Mention"/>
+    <w:basedOn w:val="DefaultParagraphFont"/>
+    <w:uiPriority w:val="99"/>
+    <w:semiHidden/>
+    <w:unhideWhenUsed/>
+    <w:rsid w:val="000A45F6"/>
+    <w:rPr>
+      <w:color w:val="605E5C"/>
+      <w:shd w:val="clear" w:color="auto" w:fill="E1DFDD"/>
+    </w:rPr>
+  </w:style>
 </w:styles>
 </file>
 

</xml_diff>

<commit_message>
Made some minor adjustments to the sql code in table creation and the queries for correct indentation.
</commit_message>
<xml_diff>
--- a/SQL code.docx
+++ b/SQL code.docx
@@ -788,14 +788,11 @@
     </w:p>
     <w:p>
       <w:r>
-        <w:rPr>
-          <w:noProof/>
-        </w:rPr>
         <w:drawing>
-          <wp:inline distT="0" distB="0" distL="0" distR="0" wp14:anchorId="028083B6" wp14:editId="09FAEDD6">
-            <wp:extent cx="5731510" cy="903605"/>
+          <wp:inline distT="0" distB="0" distL="0" distR="0" wp14:anchorId="51516A84" wp14:editId="675595A9">
+            <wp:extent cx="5731510" cy="1127760"/>
             <wp:effectExtent l="0" t="0" r="2540" b="0"/>
-            <wp:docPr id="1463138293" name="Picture 1" descr="The image displays a table listing various events where infection occurred, including infected currency and contact in public places like malls, subways, markets, ATMs, and theaters.&#10;&#10;AI-generated content may be incorrect."/>
+            <wp:docPr id="481157748" name="Picture 1"/>
             <wp:cNvGraphicFramePr>
               <a:graphicFrameLocks xmlns:a="http://schemas.openxmlformats.org/drawingml/2006/main" noChangeAspect="1"/>
             </wp:cNvGraphicFramePr>
@@ -803,7 +800,7 @@
               <a:graphicData uri="http://schemas.openxmlformats.org/drawingml/2006/picture">
                 <pic:pic xmlns:pic="http://schemas.openxmlformats.org/drawingml/2006/picture">
                   <pic:nvPicPr>
-                    <pic:cNvPr id="1463138293" name="Picture 1" descr="The image displays a table listing various events where infection occurred, including infected currency and contact in public places like malls, subways, markets, ATMs, and theaters.&#10;&#10;AI-generated content may be incorrect."/>
+                    <pic:cNvPr id="481157748" name=""/>
                     <pic:cNvPicPr/>
                   </pic:nvPicPr>
                   <pic:blipFill>
@@ -815,7 +812,7 @@
                   <pic:spPr>
                     <a:xfrm>
                       <a:off x="0" y="0"/>
-                      <a:ext cx="5731510" cy="903605"/>
+                      <a:ext cx="5731510" cy="1127760"/>
                     </a:xfrm>
                     <a:prstGeom prst="rect">
                       <a:avLst/>
@@ -1459,6 +1456,9 @@
     </w:p>
     <w:p>
       <w:r>
+        <w:rPr>
+          <w:noProof/>
+        </w:rPr>
         <w:drawing>
           <wp:inline distT="0" distB="0" distL="0" distR="0" wp14:anchorId="67565FF0" wp14:editId="0E23C296">
             <wp:extent cx="5731510" cy="394335"/>
@@ -1498,6 +1498,9 @@
     </w:p>
     <w:p>
       <w:r>
+        <w:rPr>
+          <w:noProof/>
+        </w:rPr>
         <w:drawing>
           <wp:inline distT="0" distB="0" distL="0" distR="0" wp14:anchorId="4A7116DC" wp14:editId="0C36AC20">
             <wp:extent cx="5731510" cy="196850"/>
@@ -1544,6 +1547,7 @@
       </w:pPr>
       <w:r>
         <w:rPr>
+          <w:noProof/>
           <w:u w:val="single"/>
         </w:rPr>
         <w:drawing>
@@ -1674,10 +1678,7 @@
       </w:r>
       <w:proofErr w:type="spellEnd"/>
       <w:r>
-        <w:t xml:space="preserve"> IN (1, 15, 51)</w:t>
-      </w:r>
-      <w:r>
-        <w:t>;</w:t>
+        <w:t xml:space="preserve"> IN (1, 15, 51);</w:t>
       </w:r>
     </w:p>
     <w:p>
@@ -1698,6 +1699,9 @@
     </w:p>
     <w:p>
       <w:r>
+        <w:rPr>
+          <w:noProof/>
+        </w:rPr>
         <w:drawing>
           <wp:inline distT="0" distB="0" distL="0" distR="0" wp14:anchorId="47FB914E" wp14:editId="71ACAC5D">
             <wp:extent cx="5731510" cy="384810"/>
@@ -1737,6 +1741,9 @@
     </w:p>
     <w:p>
       <w:r>
+        <w:rPr>
+          <w:noProof/>
+        </w:rPr>
         <w:drawing>
           <wp:inline distT="0" distB="0" distL="0" distR="0" wp14:anchorId="5B5A5CD3" wp14:editId="0BCDC0A9">
             <wp:extent cx="5731510" cy="211455"/>
@@ -1776,6 +1783,9 @@
     </w:p>
     <w:p>
       <w:r>
+        <w:rPr>
+          <w:noProof/>
+        </w:rPr>
         <w:drawing>
           <wp:inline distT="0" distB="0" distL="0" distR="0" wp14:anchorId="0EF6D3E0" wp14:editId="5342926A">
             <wp:extent cx="5731510" cy="196850"/>

</xml_diff>

<commit_message>
Changes to error in code
</commit_message>
<xml_diff>
--- a/SQL code.docx
+++ b/SQL code.docx
@@ -38,41 +38,12 @@
     </w:p>
     <w:p>
       <w:r>
-        <w:t xml:space="preserve">INSERT INTO </w:t>
-      </w:r>
-      <w:proofErr w:type="gramStart"/>
-      <w:r>
-        <w:t>neighbourhood(</w:t>
-      </w:r>
-      <w:proofErr w:type="spellStart"/>
-      <w:proofErr w:type="gramEnd"/>
-      <w:r>
-        <w:t>Neighbourhood_ID</w:t>
-      </w:r>
-      <w:proofErr w:type="spellEnd"/>
-      <w:r>
-        <w:t xml:space="preserve">, </w:t>
-      </w:r>
-      <w:proofErr w:type="spellStart"/>
-      <w:r>
-        <w:t>Neighbourhood_Name</w:t>
-      </w:r>
-      <w:proofErr w:type="spellEnd"/>
-      <w:r>
-        <w:t>)</w:t>
-      </w:r>
-    </w:p>
-    <w:p>
-      <w:r>
-        <w:t>VALUES (21, "</w:t>
-      </w:r>
-      <w:proofErr w:type="spellStart"/>
-      <w:r>
-        <w:t>random_neighbourhood</w:t>
-      </w:r>
-      <w:proofErr w:type="spellEnd"/>
-      <w:r>
-        <w:t>")</w:t>
+        <w:t>INSERT INTO neighbourhood(Neighbourhood_ID, Neighbourhood_Name)</w:t>
+      </w:r>
+    </w:p>
+    <w:p>
+      <w:r>
+        <w:t>VALUES (21, "random_neighbourhood")</w:t>
       </w:r>
       <w:r>
         <w:t>;</w:t>
@@ -80,15 +51,7 @@
     </w:p>
     <w:p>
       <w:r>
-        <w:t xml:space="preserve">-- The name is just an example since every neighbourhood from </w:t>
-      </w:r>
-      <w:proofErr w:type="spellStart"/>
-      <w:r>
-        <w:t>harlem</w:t>
-      </w:r>
-      <w:proofErr w:type="spellEnd"/>
-      <w:r>
-        <w:t xml:space="preserve"> is written down.</w:t>
+        <w:t>-- The name is just an example since every neighbourhood from harlem is written down.</w:t>
       </w:r>
     </w:p>
     <w:p>
@@ -142,7 +105,6 @@
           <w:u w:val="single"/>
         </w:rPr>
       </w:pPr>
-      <w:proofErr w:type="spellStart"/>
       <w:r>
         <w:rPr>
           <w:b/>
@@ -151,61 +113,10 @@
         </w:rPr>
         <w:t>Cityblock</w:t>
       </w:r>
-      <w:proofErr w:type="spellEnd"/>
-    </w:p>
-    <w:p>
-      <w:r>
-        <w:t xml:space="preserve">INSERT INTO </w:t>
-      </w:r>
-      <w:proofErr w:type="spellStart"/>
-      <w:proofErr w:type="gramStart"/>
-      <w:r>
-        <w:t>cityblock</w:t>
-      </w:r>
-      <w:proofErr w:type="spellEnd"/>
-      <w:r>
-        <w:t>(</w:t>
-      </w:r>
-      <w:proofErr w:type="spellStart"/>
-      <w:proofErr w:type="gramEnd"/>
-      <w:r>
-        <w:t>Block_ID</w:t>
-      </w:r>
-      <w:proofErr w:type="spellEnd"/>
-      <w:r>
-        <w:t xml:space="preserve">, </w:t>
-      </w:r>
-      <w:proofErr w:type="spellStart"/>
-      <w:r>
-        <w:t>Neighbourhood_ID</w:t>
-      </w:r>
-      <w:proofErr w:type="spellEnd"/>
-      <w:r>
-        <w:t xml:space="preserve">, </w:t>
-      </w:r>
-      <w:proofErr w:type="gramStart"/>
-      <w:r>
-        <w:t xml:space="preserve">Population,  </w:t>
-      </w:r>
-      <w:proofErr w:type="spellStart"/>
-      <w:r>
-        <w:t>Infected</w:t>
-      </w:r>
-      <w:proofErr w:type="gramEnd"/>
-      <w:r>
-        <w:t>_Count</w:t>
-      </w:r>
-      <w:proofErr w:type="spellEnd"/>
-      <w:r>
-        <w:t xml:space="preserve">, </w:t>
-      </w:r>
-      <w:proofErr w:type="spellStart"/>
-      <w:r>
-        <w:t>Recovered_Count</w:t>
-      </w:r>
-      <w:proofErr w:type="spellEnd"/>
-      <w:r>
-        <w:t>)</w:t>
+    </w:p>
+    <w:p>
+      <w:r>
+        <w:t>INSERT INTO cityblock(Block_ID, Neighbourhood_ID, Population,  Infected_Count, Recovered_Count)</w:t>
       </w:r>
     </w:p>
     <w:p>
@@ -219,15 +130,7 @@
     <w:p/>
     <w:p>
       <w:r>
-        <w:t xml:space="preserve">/* Recovered count and infected count are based on the rates on the infection rates of the </w:t>
-      </w:r>
-      <w:proofErr w:type="spellStart"/>
-      <w:r>
-        <w:t>ingame</w:t>
-      </w:r>
-      <w:proofErr w:type="spellEnd"/>
-      <w:r>
-        <w:t xml:space="preserve"> virus with 95% for infection rate and 5% for recovery rate */</w:t>
+        <w:t>/* Recovered count and infected count are based on the rates on the infection rates of the ingame virus with 95% for infection rate and 5% for recovery rate */</w:t>
       </w:r>
     </w:p>
     <w:p>
@@ -281,7 +184,6 @@
           <w:u w:val="single"/>
         </w:rPr>
       </w:pPr>
-      <w:proofErr w:type="spellStart"/>
       <w:r>
         <w:rPr>
           <w:b/>
@@ -290,51 +192,10 @@
         </w:rPr>
         <w:t>InfectionEvent</w:t>
       </w:r>
-      <w:proofErr w:type="spellEnd"/>
-    </w:p>
-    <w:p>
-      <w:r>
-        <w:t xml:space="preserve">INSERT INTO </w:t>
-      </w:r>
-      <w:proofErr w:type="spellStart"/>
-      <w:r>
-        <w:t>infectionevent</w:t>
-      </w:r>
-      <w:proofErr w:type="spellEnd"/>
-      <w:r>
-        <w:t xml:space="preserve"> (</w:t>
-      </w:r>
-      <w:proofErr w:type="spellStart"/>
-      <w:r>
-        <w:t>Event_Number</w:t>
-      </w:r>
-      <w:proofErr w:type="spellEnd"/>
-      <w:r>
-        <w:t xml:space="preserve">, </w:t>
-      </w:r>
-      <w:proofErr w:type="spellStart"/>
-      <w:r>
-        <w:t>Block_ID</w:t>
-      </w:r>
-      <w:proofErr w:type="spellEnd"/>
-      <w:r>
-        <w:t xml:space="preserve">, </w:t>
-      </w:r>
-      <w:proofErr w:type="spellStart"/>
-      <w:r>
-        <w:t>People_Infected</w:t>
-      </w:r>
-      <w:proofErr w:type="spellEnd"/>
-      <w:r>
-        <w:t xml:space="preserve">, </w:t>
-      </w:r>
-      <w:proofErr w:type="spellStart"/>
-      <w:r>
-        <w:t>Event_Description</w:t>
-      </w:r>
-      <w:proofErr w:type="spellEnd"/>
-      <w:r>
-        <w:t>)</w:t>
+    </w:p>
+    <w:p>
+      <w:r>
+        <w:t>INSERT INTO infectionevent (Event_Number, Block_ID, People_Infected, Event_Description)</w:t>
       </w:r>
     </w:p>
     <w:p>
@@ -419,30 +280,12 @@
     </w:p>
     <w:p>
       <w:r>
-        <w:t xml:space="preserve">INSERT INTO </w:t>
-      </w:r>
-      <w:proofErr w:type="gramStart"/>
-      <w:r>
-        <w:t>transmission(</w:t>
-      </w:r>
-      <w:proofErr w:type="spellStart"/>
-      <w:proofErr w:type="gramEnd"/>
-      <w:r>
-        <w:t>Event_Number</w:t>
-      </w:r>
-      <w:proofErr w:type="spellEnd"/>
-      <w:r>
-        <w:t>, Method)</w:t>
-      </w:r>
-    </w:p>
-    <w:p>
-      <w:proofErr w:type="gramStart"/>
-      <w:r>
-        <w:t>VALUES(</w:t>
-      </w:r>
-      <w:proofErr w:type="gramEnd"/>
-      <w:r>
-        <w:t>2, "Shared Surfaces");</w:t>
+        <w:t>INSERT INTO transmission(Event_Number, Method)</w:t>
+      </w:r>
+    </w:p>
+    <w:p>
+      <w:r>
+        <w:t>VALUES(2, "Shared Surfaces");</w:t>
       </w:r>
     </w:p>
     <w:p>
@@ -504,15 +347,7 @@
     </w:p>
     <w:p>
       <w:r>
-        <w:t xml:space="preserve">SELECT * FROM neighbourhood WHERE </w:t>
-      </w:r>
-      <w:proofErr w:type="spellStart"/>
-      <w:r>
-        <w:t>Neighbourhood_Name</w:t>
-      </w:r>
-      <w:proofErr w:type="spellEnd"/>
-      <w:r>
-        <w:t xml:space="preserve"> LIKE "%Side"</w:t>
+        <w:t>SELECT * FROM neighbourhood WHERE Neighbourhood_Name LIKE "%Side"</w:t>
       </w:r>
       <w:r>
         <w:t>;</w:t>
@@ -520,13 +355,8 @@
     </w:p>
     <w:p>
       <w:r>
-        <w:t xml:space="preserve">-- Neighbourhood names ending </w:t>
-      </w:r>
-      <w:proofErr w:type="gramStart"/>
-      <w:r>
-        <w:t>in side</w:t>
-      </w:r>
-      <w:proofErr w:type="gramEnd"/>
+        <w:t>-- Neighbourhood names ending in side</w:t>
+      </w:r>
     </w:p>
     <w:p>
       <w:r>
@@ -610,129 +440,32 @@
         <w:t xml:space="preserve">Purpose: </w:t>
       </w:r>
       <w:r>
-        <w:t xml:space="preserve">To compare the initial </w:t>
-      </w:r>
-      <w:proofErr w:type="gramStart"/>
-      <w:r>
-        <w:t>infection</w:t>
-      </w:r>
-      <w:proofErr w:type="gramEnd"/>
-      <w:r>
-        <w:t xml:space="preserve"> count of the outbreak event to the final number of people infected in that same block.</w:t>
-      </w:r>
-    </w:p>
-    <w:p>
-      <w:r>
-        <w:t xml:space="preserve">SELECT </w:t>
-      </w:r>
-      <w:proofErr w:type="spellStart"/>
-      <w:proofErr w:type="gramStart"/>
-      <w:r>
-        <w:t>infectionevent.Block</w:t>
-      </w:r>
-      <w:proofErr w:type="gramEnd"/>
-      <w:r>
-        <w:t>_ID</w:t>
-      </w:r>
-      <w:proofErr w:type="spellEnd"/>
-      <w:r>
-        <w:t xml:space="preserve">, </w:t>
-      </w:r>
-      <w:proofErr w:type="spellStart"/>
-      <w:r>
-        <w:t>Event_Number</w:t>
-      </w:r>
-      <w:proofErr w:type="spellEnd"/>
-      <w:r>
-        <w:t xml:space="preserve">, </w:t>
-      </w:r>
-      <w:proofErr w:type="spellStart"/>
-      <w:r>
-        <w:t>People_Infected</w:t>
-      </w:r>
-      <w:proofErr w:type="spellEnd"/>
-      <w:r>
-        <w:t xml:space="preserve">, </w:t>
-      </w:r>
-      <w:proofErr w:type="spellStart"/>
-      <w:r>
-        <w:t>Event_Description</w:t>
-      </w:r>
-      <w:proofErr w:type="spellEnd"/>
-      <w:r>
-        <w:t xml:space="preserve">, </w:t>
-      </w:r>
-      <w:proofErr w:type="spellStart"/>
-      <w:r>
-        <w:t>Infected_Count</w:t>
-      </w:r>
-      <w:proofErr w:type="spellEnd"/>
-      <w:r>
-        <w:t xml:space="preserve"> </w:t>
-      </w:r>
-    </w:p>
-    <w:p>
-      <w:r>
-        <w:t xml:space="preserve">FROM </w:t>
-      </w:r>
-      <w:proofErr w:type="spellStart"/>
-      <w:r>
-        <w:t>infectionevent</w:t>
-      </w:r>
-      <w:proofErr w:type="spellEnd"/>
-    </w:p>
-    <w:p>
-      <w:r>
-        <w:t xml:space="preserve"> INNER JOIN </w:t>
-      </w:r>
-      <w:proofErr w:type="spellStart"/>
-      <w:r>
-        <w:t>cityblock</w:t>
-      </w:r>
-      <w:proofErr w:type="spellEnd"/>
-    </w:p>
-    <w:p>
-      <w:r>
-        <w:t xml:space="preserve"> ON </w:t>
-      </w:r>
-      <w:proofErr w:type="spellStart"/>
-      <w:proofErr w:type="gramStart"/>
-      <w:r>
-        <w:t>infectionevent.Block</w:t>
-      </w:r>
-      <w:proofErr w:type="gramEnd"/>
-      <w:r>
-        <w:t>_ID</w:t>
-      </w:r>
-      <w:proofErr w:type="spellEnd"/>
-      <w:r>
-        <w:t xml:space="preserve"> = </w:t>
-      </w:r>
-      <w:proofErr w:type="spellStart"/>
-      <w:proofErr w:type="gramStart"/>
-      <w:r>
-        <w:t>cityblock.Block</w:t>
-      </w:r>
-      <w:proofErr w:type="gramEnd"/>
-      <w:r>
-        <w:t>_ID</w:t>
-      </w:r>
-      <w:proofErr w:type="spellEnd"/>
-      <w:r>
-        <w:t xml:space="preserve"> </w:t>
-      </w:r>
-    </w:p>
-    <w:p>
-      <w:r>
-        <w:t xml:space="preserve">WHERE </w:t>
-      </w:r>
-      <w:proofErr w:type="spellStart"/>
-      <w:r>
-        <w:t>People_Infected</w:t>
-      </w:r>
-      <w:proofErr w:type="spellEnd"/>
-      <w:r>
-        <w:t xml:space="preserve"> &gt; 7;</w:t>
+        <w:t>To compare the initial infection count of the outbreak event to the final number of people infected in that same block.</w:t>
+      </w:r>
+    </w:p>
+    <w:p>
+      <w:r>
+        <w:t xml:space="preserve">SELECT infectionevent.Block_ID, Event_Number, People_Infected, Event_Description, Infected_Count </w:t>
+      </w:r>
+    </w:p>
+    <w:p>
+      <w:r>
+        <w:t>FROM infectionevent</w:t>
+      </w:r>
+    </w:p>
+    <w:p>
+      <w:r>
+        <w:t xml:space="preserve"> INNER JOIN cityblock</w:t>
+      </w:r>
+    </w:p>
+    <w:p>
+      <w:r>
+        <w:t xml:space="preserve"> ON infectionevent.Block_ID = cityblock.Block_ID </w:t>
+      </w:r>
+    </w:p>
+    <w:p>
+      <w:r>
+        <w:t>WHERE People_Infected &gt; 7;</w:t>
       </w:r>
     </w:p>
     <w:p>
@@ -742,15 +475,7 @@
     </w:p>
     <w:p>
       <w:r>
-        <w:t xml:space="preserve">This query will compare a subset of blocks to show the number of people who were initially infected at a block and show the number of people infected after the month by using data from the </w:t>
-      </w:r>
-      <w:proofErr w:type="spellStart"/>
-      <w:r>
-        <w:t>cityblock</w:t>
-      </w:r>
-      <w:proofErr w:type="spellEnd"/>
-      <w:r>
-        <w:t xml:space="preserve"> table</w:t>
+        <w:t>This query will compare a subset of blocks to show the number of people who were initially infected at a block and show the number of people infected after the month by using data from the cityblock table</w:t>
       </w:r>
     </w:p>
     <w:p>
@@ -788,6 +513,9 @@
     </w:p>
     <w:p>
       <w:r>
+        <w:rPr>
+          <w:noProof/>
+        </w:rPr>
         <w:drawing>
           <wp:inline distT="0" distB="0" distL="0" distR="0" wp14:anchorId="51516A84" wp14:editId="675595A9">
             <wp:extent cx="5731510" cy="1127760"/>
@@ -833,14 +561,11 @@
     </w:p>
     <w:p>
       <w:r>
-        <w:rPr>
-          <w:noProof/>
-        </w:rPr>
         <w:drawing>
-          <wp:inline distT="0" distB="0" distL="0" distR="0" wp14:anchorId="4E92B272" wp14:editId="6A11C97F">
-            <wp:extent cx="5731510" cy="1728470"/>
-            <wp:effectExtent l="0" t="0" r="2540" b="5080"/>
-            <wp:docPr id="846623949" name="Picture 1"/>
+          <wp:inline distT="0" distB="0" distL="0" distR="0" wp14:anchorId="6C71C15B" wp14:editId="4224B16C">
+            <wp:extent cx="5731510" cy="1977390"/>
+            <wp:effectExtent l="0" t="0" r="2540" b="3810"/>
+            <wp:docPr id="809364805" name="Picture 1" descr="The image shows a table listing various events, including the number of people infected, the event description, and the number of infected instances, such as infected dollar bills, street market vendors, and airborne particles.&#10;&#10;AI-generated content may be incorrect."/>
             <wp:cNvGraphicFramePr>
               <a:graphicFrameLocks xmlns:a="http://schemas.openxmlformats.org/drawingml/2006/main" noChangeAspect="1"/>
             </wp:cNvGraphicFramePr>
@@ -848,7 +573,7 @@
               <a:graphicData uri="http://schemas.openxmlformats.org/drawingml/2006/picture">
                 <pic:pic xmlns:pic="http://schemas.openxmlformats.org/drawingml/2006/picture">
                   <pic:nvPicPr>
-                    <pic:cNvPr id="846623949" name=""/>
+                    <pic:cNvPr id="809364805" name="Picture 1" descr="The image shows a table listing various events, including the number of people infected, the event description, and the number of infected instances, such as infected dollar bills, street market vendors, and airborne particles.&#10;&#10;AI-generated content may be incorrect."/>
                     <pic:cNvPicPr/>
                   </pic:nvPicPr>
                   <pic:blipFill>
@@ -860,7 +585,7 @@
                   <pic:spPr>
                     <a:xfrm>
                       <a:off x="0" y="0"/>
-                      <a:ext cx="5731510" cy="1728470"/>
+                      <a:ext cx="5731510" cy="1977390"/>
                     </a:xfrm>
                     <a:prstGeom prst="rect">
                       <a:avLst/>
@@ -922,57 +647,17 @@
     </w:p>
     <w:p>
       <w:r>
-        <w:t xml:space="preserve">SELECT </w:t>
-      </w:r>
-      <w:proofErr w:type="spellStart"/>
-      <w:r>
-        <w:t>Block_ID</w:t>
-      </w:r>
-      <w:proofErr w:type="spellEnd"/>
-      <w:r>
-        <w:t xml:space="preserve">, </w:t>
-      </w:r>
-      <w:proofErr w:type="spellStart"/>
-      <w:r>
-        <w:t>Neighbourhood_ID</w:t>
-      </w:r>
-      <w:proofErr w:type="spellEnd"/>
-      <w:r>
-        <w:t xml:space="preserve">, Population, </w:t>
-      </w:r>
-      <w:proofErr w:type="spellStart"/>
-      <w:r>
-        <w:t>Infected_Count</w:t>
-      </w:r>
-      <w:proofErr w:type="spellEnd"/>
-      <w:r>
-        <w:t xml:space="preserve"> </w:t>
-      </w:r>
-    </w:p>
-    <w:p>
-      <w:r>
-        <w:t xml:space="preserve">FROM </w:t>
-      </w:r>
-      <w:proofErr w:type="spellStart"/>
-      <w:r>
-        <w:t>cityblock</w:t>
-      </w:r>
-      <w:proofErr w:type="spellEnd"/>
-      <w:r>
-        <w:t xml:space="preserve"> </w:t>
-      </w:r>
-    </w:p>
-    <w:p>
-      <w:r>
-        <w:t xml:space="preserve">WHERE </w:t>
-      </w:r>
-      <w:proofErr w:type="spellStart"/>
-      <w:r>
-        <w:t>Infected_Count</w:t>
-      </w:r>
-      <w:proofErr w:type="spellEnd"/>
-      <w:r>
-        <w:t xml:space="preserve"> &gt; 40000</w:t>
+        <w:t xml:space="preserve">SELECT Block_ID, Neighbourhood_ID, Population, Infected_Count </w:t>
+      </w:r>
+    </w:p>
+    <w:p>
+      <w:r>
+        <w:t xml:space="preserve">FROM cityblock </w:t>
+      </w:r>
+    </w:p>
+    <w:p>
+      <w:r>
+        <w:t>WHERE Infected_Count &gt; 40000</w:t>
       </w:r>
       <w:r>
         <w:t>;</w:t>
@@ -1103,71 +788,23 @@
     </w:p>
     <w:p>
       <w:r>
-        <w:t xml:space="preserve">/* SUM is the total number of </w:t>
-      </w:r>
-      <w:proofErr w:type="gramStart"/>
-      <w:r>
-        <w:t>infected</w:t>
-      </w:r>
-      <w:proofErr w:type="gramEnd"/>
-      <w:r>
-        <w:t xml:space="preserve"> and COUNT increments the individual instances of each block in each neighbourhood. */</w:t>
+        <w:t>/* SUM is the total number of infected and COUNT increments the individual instances of each block in each neighbourhood. */</w:t>
       </w:r>
     </w:p>
     <w:p/>
     <w:p>
       <w:r>
-        <w:t xml:space="preserve">SELECT </w:t>
-      </w:r>
-      <w:proofErr w:type="spellStart"/>
-      <w:r>
-        <w:t>Neighbourhood_ID</w:t>
-      </w:r>
-      <w:proofErr w:type="spellEnd"/>
-      <w:r>
-        <w:t>, SUM(</w:t>
-      </w:r>
-      <w:proofErr w:type="spellStart"/>
-      <w:r>
-        <w:t>Infected_Count</w:t>
-      </w:r>
-      <w:proofErr w:type="spellEnd"/>
-      <w:r>
-        <w:t>), COUNT(</w:t>
-      </w:r>
-      <w:proofErr w:type="spellStart"/>
-      <w:r>
-        <w:t>Block_ID</w:t>
-      </w:r>
-      <w:proofErr w:type="spellEnd"/>
-      <w:r>
-        <w:t xml:space="preserve">) </w:t>
-      </w:r>
-    </w:p>
-    <w:p>
-      <w:r>
-        <w:t xml:space="preserve">FROM </w:t>
-      </w:r>
-      <w:proofErr w:type="spellStart"/>
-      <w:r>
-        <w:t>cityblock</w:t>
-      </w:r>
-      <w:proofErr w:type="spellEnd"/>
-      <w:r>
-        <w:t xml:space="preserve"> </w:t>
-      </w:r>
-    </w:p>
-    <w:p>
-      <w:r>
-        <w:t xml:space="preserve">GROUP BY </w:t>
-      </w:r>
-      <w:proofErr w:type="spellStart"/>
-      <w:r>
-        <w:t>Neighbourhood_ID</w:t>
-      </w:r>
-      <w:proofErr w:type="spellEnd"/>
-      <w:r>
-        <w:t>;</w:t>
+        <w:t xml:space="preserve">SELECT Neighbourhood_ID, SUM(Infected_Count), COUNT(Block_ID) </w:t>
+      </w:r>
+    </w:p>
+    <w:p>
+      <w:r>
+        <w:t xml:space="preserve">FROM cityblock </w:t>
+      </w:r>
+    </w:p>
+    <w:p>
+      <w:r>
+        <w:t>GROUP BY Neighbourhood_ID;</w:t>
       </w:r>
     </w:p>
     <w:p>
@@ -1306,57 +943,17 @@
         </w:r>
       </w:hyperlink>
       <w:r>
-        <w:t xml:space="preserve"> </w:t>
-      </w:r>
-      <w:proofErr w:type="spellStart"/>
-      <w:r>
-        <w:t>Block_ID</w:t>
-      </w:r>
-      <w:proofErr w:type="spellEnd"/>
-      <w:r>
-        <w:t xml:space="preserve">, </w:t>
-      </w:r>
-      <w:proofErr w:type="spellStart"/>
-      <w:r>
-        <w:t>Neighbourhood_ID</w:t>
-      </w:r>
-      <w:proofErr w:type="spellEnd"/>
-      <w:r>
-        <w:t xml:space="preserve">, Population, </w:t>
-      </w:r>
-      <w:proofErr w:type="spellStart"/>
-      <w:r>
-        <w:t>Infected_Count</w:t>
-      </w:r>
-      <w:proofErr w:type="spellEnd"/>
-      <w:r>
-        <w:t xml:space="preserve"> </w:t>
-      </w:r>
-    </w:p>
-    <w:p>
-      <w:r>
-        <w:t xml:space="preserve">FROM </w:t>
-      </w:r>
-      <w:proofErr w:type="spellStart"/>
-      <w:r>
-        <w:t>cityblock</w:t>
-      </w:r>
-      <w:proofErr w:type="spellEnd"/>
-      <w:r>
-        <w:t xml:space="preserve"> </w:t>
-      </w:r>
-    </w:p>
-    <w:p>
-      <w:r>
-        <w:t xml:space="preserve">WHERE </w:t>
-      </w:r>
-      <w:proofErr w:type="spellStart"/>
-      <w:r>
-        <w:t>Neighbourhood_ID</w:t>
-      </w:r>
-      <w:proofErr w:type="spellEnd"/>
-      <w:r>
-        <w:t xml:space="preserve"> </w:t>
+        <w:t xml:space="preserve"> Block_ID, Neighbourhood_ID, Population, Infected_Count </w:t>
+      </w:r>
+    </w:p>
+    <w:p>
+      <w:r>
+        <w:t xml:space="preserve">FROM cityblock </w:t>
+      </w:r>
+    </w:p>
+    <w:p>
+      <w:r>
+        <w:t xml:space="preserve">WHERE Neighbourhood_ID </w:t>
       </w:r>
       <w:hyperlink r:id="rId15" w:tgtFrame="mysql_doc" w:history="1">
         <w:r>
@@ -1589,23 +1186,7 @@
     </w:p>
     <w:p>
       <w:r>
-        <w:t xml:space="preserve">We have identified 3 rows where the total of the </w:t>
-      </w:r>
-      <w:proofErr w:type="spellStart"/>
-      <w:r>
-        <w:t>infected_count</w:t>
-      </w:r>
-      <w:proofErr w:type="spellEnd"/>
-      <w:r>
-        <w:t xml:space="preserve"> and </w:t>
-      </w:r>
-      <w:proofErr w:type="spellStart"/>
-      <w:r>
-        <w:t>recovered_count</w:t>
-      </w:r>
-      <w:proofErr w:type="spellEnd"/>
-      <w:r>
-        <w:t xml:space="preserve"> </w:t>
+        <w:t xml:space="preserve">We have identified 3 rows where the total of the infected_count and recovered_count </w:t>
       </w:r>
       <w:r>
         <w:t xml:space="preserve">adds up to 1 number higher than the population. An example is </w:t>
@@ -1617,15 +1198,7 @@
         <w:t xml:space="preserve"> is equal to 32251</w:t>
       </w:r>
       <w:r>
-        <w:t xml:space="preserve"> which is not the population. We need to update </w:t>
-      </w:r>
-      <w:proofErr w:type="gramStart"/>
-      <w:r>
-        <w:t>them</w:t>
-      </w:r>
-      <w:proofErr w:type="gramEnd"/>
-      <w:r>
-        <w:t xml:space="preserve"> so the </w:t>
+        <w:t xml:space="preserve"> which is not the population. We need to update them so the </w:t>
       </w:r>
       <w:r>
         <w:t xml:space="preserve">infected and recovered count add up to the </w:t>
@@ -1639,46 +1212,17 @@
     </w:p>
     <w:p>
       <w:r>
-        <w:t xml:space="preserve">UPDATE </w:t>
-      </w:r>
-      <w:proofErr w:type="spellStart"/>
-      <w:r>
-        <w:t>cityblock</w:t>
-      </w:r>
-      <w:proofErr w:type="spellEnd"/>
-    </w:p>
-    <w:p>
-      <w:r>
-        <w:t xml:space="preserve">SET </w:t>
-      </w:r>
-      <w:proofErr w:type="spellStart"/>
-      <w:r>
-        <w:t>Recovered_Count</w:t>
-      </w:r>
-      <w:proofErr w:type="spellEnd"/>
-      <w:r>
-        <w:t xml:space="preserve"> = </w:t>
-      </w:r>
-      <w:proofErr w:type="spellStart"/>
-      <w:r>
-        <w:t>Recovered_Count</w:t>
-      </w:r>
-      <w:proofErr w:type="spellEnd"/>
-      <w:r>
-        <w:t xml:space="preserve"> - 1 -- de-incrementing the recovered count for certain rows</w:t>
-      </w:r>
-    </w:p>
-    <w:p>
-      <w:r>
-        <w:t xml:space="preserve">WHERE </w:t>
-      </w:r>
-      <w:proofErr w:type="spellStart"/>
-      <w:r>
-        <w:t>Block_ID</w:t>
-      </w:r>
-      <w:proofErr w:type="spellEnd"/>
-      <w:r>
-        <w:t xml:space="preserve"> IN (1, 15, 51);</w:t>
+        <w:t>UPDATE cityblock</w:t>
+      </w:r>
+    </w:p>
+    <w:p>
+      <w:r>
+        <w:t>SET Recovered_Count = Recovered_Count - 1 -- de-incrementing the recovered count for certain rows</w:t>
+      </w:r>
+    </w:p>
+    <w:p>
+      <w:r>
+        <w:t>WHERE Block_ID IN (1, 15, 51);</w:t>
       </w:r>
     </w:p>
     <w:p>

</xml_diff>

<commit_message>
Added a folder dedicated to all the images used and my report
</commit_message>
<xml_diff>
--- a/SQL code.docx
+++ b/SQL code.docx
@@ -51,7 +51,13 @@
     </w:p>
     <w:p>
       <w:r>
-        <w:t>-- The name is just an example since every neighbourhood from harlem is written down.</w:t>
+        <w:t xml:space="preserve">-- The name is just an example since every neighbourhood from </w:t>
+      </w:r>
+      <w:r>
+        <w:t>manhattan</w:t>
+      </w:r>
+      <w:r>
+        <w:t xml:space="preserve"> is written down.</w:t>
       </w:r>
     </w:p>
     <w:p>
@@ -223,6 +229,7 @@
         <w:rPr>
           <w:noProof/>
         </w:rPr>
+        <w:lastRenderedPageBreak/>
         <w:drawing>
           <wp:inline distT="0" distB="0" distL="0" distR="0" wp14:anchorId="0BC8AF3D" wp14:editId="3ADC7D18">
             <wp:extent cx="5731510" cy="558800"/>
@@ -274,7 +281,6 @@
           <w:bCs/>
           <w:u w:val="single"/>
         </w:rPr>
-        <w:lastRenderedPageBreak/>
         <w:t>Transmission</w:t>
       </w:r>
     </w:p>
@@ -475,6 +481,7 @@
     </w:p>
     <w:p>
       <w:r>
+        <w:lastRenderedPageBreak/>
         <w:t>This query will compare a subset of blocks to show the number of people who were initially infected at a block and show the number of people infected after the month by using data from the cityblock table</w:t>
       </w:r>
     </w:p>
@@ -494,7 +501,6 @@
           <w:b/>
           <w:bCs/>
         </w:rPr>
-        <w:lastRenderedPageBreak/>
         <w:t>Result:</w:t>
       </w:r>
       <w:r>

</xml_diff>

<commit_message>
Edited some word documents
</commit_message>
<xml_diff>
--- a/SQL code.docx
+++ b/SQL code.docx
@@ -38,12 +38,41 @@
     </w:p>
     <w:p>
       <w:r>
-        <w:t>INSERT INTO neighbourhood(Neighbourhood_ID, Neighbourhood_Name)</w:t>
-      </w:r>
-    </w:p>
-    <w:p>
-      <w:r>
-        <w:t>VALUES (21, "random_neighbourhood")</w:t>
+        <w:t xml:space="preserve">INSERT INTO </w:t>
+      </w:r>
+      <w:proofErr w:type="gramStart"/>
+      <w:r>
+        <w:t>neighbourhood(</w:t>
+      </w:r>
+      <w:proofErr w:type="spellStart"/>
+      <w:proofErr w:type="gramEnd"/>
+      <w:r>
+        <w:t>Neighbourhood_ID</w:t>
+      </w:r>
+      <w:proofErr w:type="spellEnd"/>
+      <w:r>
+        <w:t xml:space="preserve">, </w:t>
+      </w:r>
+      <w:proofErr w:type="spellStart"/>
+      <w:r>
+        <w:t>Neighbourhood_Name</w:t>
+      </w:r>
+      <w:proofErr w:type="spellEnd"/>
+      <w:r>
+        <w:t>)</w:t>
+      </w:r>
+    </w:p>
+    <w:p>
+      <w:r>
+        <w:t>VALUES (21, "</w:t>
+      </w:r>
+      <w:proofErr w:type="spellStart"/>
+      <w:r>
+        <w:t>random_neighbourhood</w:t>
+      </w:r>
+      <w:proofErr w:type="spellEnd"/>
+      <w:r>
+        <w:t>")</w:t>
       </w:r>
       <w:r>
         <w:t>;</w:t>
@@ -53,55 +82,16 @@
       <w:r>
         <w:t xml:space="preserve">-- The name is just an example since every neighbourhood from </w:t>
       </w:r>
+      <w:proofErr w:type="spellStart"/>
       <w:r>
         <w:t>manhattan</w:t>
       </w:r>
+      <w:proofErr w:type="spellEnd"/>
       <w:r>
         <w:t xml:space="preserve"> is written down.</w:t>
       </w:r>
     </w:p>
-    <w:p>
-      <w:r>
-        <w:rPr>
-          <w:noProof/>
-        </w:rPr>
-        <w:drawing>
-          <wp:inline distT="0" distB="0" distL="0" distR="0" wp14:anchorId="71F2AF80" wp14:editId="70FAA1AB">
-            <wp:extent cx="5188217" cy="819192"/>
-            <wp:effectExtent l="0" t="0" r="0" b="0"/>
-            <wp:docPr id="2142818460" name="Picture 1" descr="The image shows a list with various commands (Edit, Delete, Copy) associated with different neighborhood names.&#10;&#10;AI-generated content may be incorrect."/>
-            <wp:cNvGraphicFramePr>
-              <a:graphicFrameLocks xmlns:a="http://schemas.openxmlformats.org/drawingml/2006/main" noChangeAspect="1"/>
-            </wp:cNvGraphicFramePr>
-            <a:graphic xmlns:a="http://schemas.openxmlformats.org/drawingml/2006/main">
-              <a:graphicData uri="http://schemas.openxmlformats.org/drawingml/2006/picture">
-                <pic:pic xmlns:pic="http://schemas.openxmlformats.org/drawingml/2006/picture">
-                  <pic:nvPicPr>
-                    <pic:cNvPr id="2142818460" name="Picture 1" descr="The image shows a list with various commands (Edit, Delete, Copy) associated with different neighborhood names.&#10;&#10;AI-generated content may be incorrect."/>
-                    <pic:cNvPicPr/>
-                  </pic:nvPicPr>
-                  <pic:blipFill>
-                    <a:blip r:embed="rId5"/>
-                    <a:stretch>
-                      <a:fillRect/>
-                    </a:stretch>
-                  </pic:blipFill>
-                  <pic:spPr>
-                    <a:xfrm>
-                      <a:off x="0" y="0"/>
-                      <a:ext cx="5188217" cy="819192"/>
-                    </a:xfrm>
-                    <a:prstGeom prst="rect">
-                      <a:avLst/>
-                    </a:prstGeom>
-                  </pic:spPr>
-                </pic:pic>
-              </a:graphicData>
-            </a:graphic>
-          </wp:inline>
-        </w:drawing>
-      </w:r>
-    </w:p>
+    <w:p/>
     <w:p/>
     <w:p>
       <w:pPr>
@@ -111,6 +101,7 @@
           <w:u w:val="single"/>
         </w:rPr>
       </w:pPr>
+      <w:proofErr w:type="spellStart"/>
       <w:r>
         <w:rPr>
           <w:b/>
@@ -119,10 +110,61 @@
         </w:rPr>
         <w:t>Cityblock</w:t>
       </w:r>
-    </w:p>
-    <w:p>
-      <w:r>
-        <w:t>INSERT INTO cityblock(Block_ID, Neighbourhood_ID, Population,  Infected_Count, Recovered_Count)</w:t>
+      <w:proofErr w:type="spellEnd"/>
+    </w:p>
+    <w:p>
+      <w:r>
+        <w:t xml:space="preserve">INSERT INTO </w:t>
+      </w:r>
+      <w:proofErr w:type="spellStart"/>
+      <w:proofErr w:type="gramStart"/>
+      <w:r>
+        <w:t>cityblock</w:t>
+      </w:r>
+      <w:proofErr w:type="spellEnd"/>
+      <w:r>
+        <w:t>(</w:t>
+      </w:r>
+      <w:proofErr w:type="spellStart"/>
+      <w:proofErr w:type="gramEnd"/>
+      <w:r>
+        <w:t>Block_ID</w:t>
+      </w:r>
+      <w:proofErr w:type="spellEnd"/>
+      <w:r>
+        <w:t xml:space="preserve">, </w:t>
+      </w:r>
+      <w:proofErr w:type="spellStart"/>
+      <w:r>
+        <w:t>Neighbourhood_ID</w:t>
+      </w:r>
+      <w:proofErr w:type="spellEnd"/>
+      <w:r>
+        <w:t xml:space="preserve">, </w:t>
+      </w:r>
+      <w:proofErr w:type="gramStart"/>
+      <w:r>
+        <w:t xml:space="preserve">Population,  </w:t>
+      </w:r>
+      <w:proofErr w:type="spellStart"/>
+      <w:r>
+        <w:t>Infected</w:t>
+      </w:r>
+      <w:proofErr w:type="gramEnd"/>
+      <w:r>
+        <w:t>_Count</w:t>
+      </w:r>
+      <w:proofErr w:type="spellEnd"/>
+      <w:r>
+        <w:t xml:space="preserve">, </w:t>
+      </w:r>
+      <w:proofErr w:type="spellStart"/>
+      <w:r>
+        <w:t>Recovered_Count</w:t>
+      </w:r>
+      <w:proofErr w:type="spellEnd"/>
+      <w:r>
+        <w:t>)</w:t>
       </w:r>
     </w:p>
     <w:p>
@@ -136,51 +178,18 @@
     <w:p/>
     <w:p>
       <w:r>
-        <w:t>/* Recovered count and infected count are based on the rates on the infection rates of the ingame virus with 95% for infection rate and 5% for recovery rate */</w:t>
-      </w:r>
-    </w:p>
-    <w:p>
-      <w:r>
-        <w:rPr>
-          <w:noProof/>
-        </w:rPr>
-        <w:drawing>
-          <wp:inline distT="0" distB="0" distL="0" distR="0" wp14:anchorId="4FF11592" wp14:editId="61303AA8">
-            <wp:extent cx="5731510" cy="839470"/>
-            <wp:effectExtent l="0" t="0" r="2540" b="0"/>
-            <wp:docPr id="1125785299" name="Picture 1" descr="The image displays a table with sequential entries showing pairs of numbers, where each pair consists of an 'Edit' action followed by a 'Delete' action, with incremental increases in the second number of each pair.&#10;&#10;AI-generated content may be incorrect."/>
-            <wp:cNvGraphicFramePr>
-              <a:graphicFrameLocks xmlns:a="http://schemas.openxmlformats.org/drawingml/2006/main" noChangeAspect="1"/>
-            </wp:cNvGraphicFramePr>
-            <a:graphic xmlns:a="http://schemas.openxmlformats.org/drawingml/2006/main">
-              <a:graphicData uri="http://schemas.openxmlformats.org/drawingml/2006/picture">
-                <pic:pic xmlns:pic="http://schemas.openxmlformats.org/drawingml/2006/picture">
-                  <pic:nvPicPr>
-                    <pic:cNvPr id="1125785299" name="Picture 1" descr="The image displays a table with sequential entries showing pairs of numbers, where each pair consists of an 'Edit' action followed by a 'Delete' action, with incremental increases in the second number of each pair.&#10;&#10;AI-generated content may be incorrect."/>
-                    <pic:cNvPicPr/>
-                  </pic:nvPicPr>
-                  <pic:blipFill>
-                    <a:blip r:embed="rId6"/>
-                    <a:stretch>
-                      <a:fillRect/>
-                    </a:stretch>
-                  </pic:blipFill>
-                  <pic:spPr>
-                    <a:xfrm>
-                      <a:off x="0" y="0"/>
-                      <a:ext cx="5731510" cy="839470"/>
-                    </a:xfrm>
-                    <a:prstGeom prst="rect">
-                      <a:avLst/>
-                    </a:prstGeom>
-                  </pic:spPr>
-                </pic:pic>
-              </a:graphicData>
-            </a:graphic>
-          </wp:inline>
-        </w:drawing>
-      </w:r>
-    </w:p>
+        <w:t xml:space="preserve">/* Recovered count and infected count are based on the rates on the infection rates of the </w:t>
+      </w:r>
+      <w:proofErr w:type="spellStart"/>
+      <w:r>
+        <w:t>ingame</w:t>
+      </w:r>
+      <w:proofErr w:type="spellEnd"/>
+      <w:r>
+        <w:t xml:space="preserve"> virus with 95% for infection rate and 5% for recovery rate */</w:t>
+      </w:r>
+    </w:p>
+    <w:p/>
     <w:p/>
     <w:p>
       <w:pPr>
@@ -190,6 +199,7 @@
           <w:u w:val="single"/>
         </w:rPr>
       </w:pPr>
+      <w:proofErr w:type="spellStart"/>
       <w:r>
         <w:rPr>
           <w:b/>
@@ -198,10 +208,51 @@
         </w:rPr>
         <w:t>InfectionEvent</w:t>
       </w:r>
-    </w:p>
-    <w:p>
-      <w:r>
-        <w:t>INSERT INTO infectionevent (Event_Number, Block_ID, People_Infected, Event_Description)</w:t>
+      <w:proofErr w:type="spellEnd"/>
+    </w:p>
+    <w:p>
+      <w:r>
+        <w:t xml:space="preserve">INSERT INTO </w:t>
+      </w:r>
+      <w:proofErr w:type="spellStart"/>
+      <w:r>
+        <w:t>infectionevent</w:t>
+      </w:r>
+      <w:proofErr w:type="spellEnd"/>
+      <w:r>
+        <w:t xml:space="preserve"> (</w:t>
+      </w:r>
+      <w:proofErr w:type="spellStart"/>
+      <w:r>
+        <w:t>Event_Number</w:t>
+      </w:r>
+      <w:proofErr w:type="spellEnd"/>
+      <w:r>
+        <w:t xml:space="preserve">, </w:t>
+      </w:r>
+      <w:proofErr w:type="spellStart"/>
+      <w:r>
+        <w:t>Block_ID</w:t>
+      </w:r>
+      <w:proofErr w:type="spellEnd"/>
+      <w:r>
+        <w:t xml:space="preserve">, </w:t>
+      </w:r>
+      <w:proofErr w:type="spellStart"/>
+      <w:r>
+        <w:t>People_Infected</w:t>
+      </w:r>
+      <w:proofErr w:type="spellEnd"/>
+      <w:r>
+        <w:t xml:space="preserve">, </w:t>
+      </w:r>
+      <w:proofErr w:type="spellStart"/>
+      <w:r>
+        <w:t>Event_Description</w:t>
+      </w:r>
+      <w:proofErr w:type="spellEnd"/>
+      <w:r>
+        <w:t>)</w:t>
       </w:r>
     </w:p>
     <w:p>
@@ -224,49 +275,7 @@
         <w:t>;</w:t>
       </w:r>
     </w:p>
-    <w:p>
-      <w:r>
-        <w:rPr>
-          <w:noProof/>
-        </w:rPr>
-        <w:lastRenderedPageBreak/>
-        <w:drawing>
-          <wp:inline distT="0" distB="0" distL="0" distR="0" wp14:anchorId="0BC8AF3D" wp14:editId="3ADC7D18">
-            <wp:extent cx="5731510" cy="558800"/>
-            <wp:effectExtent l="0" t="0" r="2540" b="0"/>
-            <wp:docPr id="903202947" name="Picture 1" descr="The image displays a list of numbered points detailing various measures to prevent the spread of an infectious virus, including editing and deleting certain actions, and measures such as quarantining infected individuals and sanitizing shared spaces.&#10;&#10;AI-generated content may be incorrect."/>
-            <wp:cNvGraphicFramePr>
-              <a:graphicFrameLocks xmlns:a="http://schemas.openxmlformats.org/drawingml/2006/main" noChangeAspect="1"/>
-            </wp:cNvGraphicFramePr>
-            <a:graphic xmlns:a="http://schemas.openxmlformats.org/drawingml/2006/main">
-              <a:graphicData uri="http://schemas.openxmlformats.org/drawingml/2006/picture">
-                <pic:pic xmlns:pic="http://schemas.openxmlformats.org/drawingml/2006/picture">
-                  <pic:nvPicPr>
-                    <pic:cNvPr id="903202947" name="Picture 1" descr="The image displays a list of numbered points detailing various measures to prevent the spread of an infectious virus, including editing and deleting certain actions, and measures such as quarantining infected individuals and sanitizing shared spaces.&#10;&#10;AI-generated content may be incorrect."/>
-                    <pic:cNvPicPr/>
-                  </pic:nvPicPr>
-                  <pic:blipFill>
-                    <a:blip r:embed="rId7"/>
-                    <a:stretch>
-                      <a:fillRect/>
-                    </a:stretch>
-                  </pic:blipFill>
-                  <pic:spPr>
-                    <a:xfrm>
-                      <a:off x="0" y="0"/>
-                      <a:ext cx="5731510" cy="558800"/>
-                    </a:xfrm>
-                    <a:prstGeom prst="rect">
-                      <a:avLst/>
-                    </a:prstGeom>
-                  </pic:spPr>
-                </pic:pic>
-              </a:graphicData>
-            </a:graphic>
-          </wp:inline>
-        </w:drawing>
-      </w:r>
-    </w:p>
+    <w:p/>
     <w:p>
       <w:pPr>
         <w:rPr>
@@ -286,57 +295,34 @@
     </w:p>
     <w:p>
       <w:r>
-        <w:t>INSERT INTO transmission(Event_Number, Method)</w:t>
-      </w:r>
-    </w:p>
-    <w:p>
-      <w:r>
-        <w:t>VALUES(2, "Shared Surfaces");</w:t>
-      </w:r>
-    </w:p>
-    <w:p>
-      <w:r>
-        <w:rPr>
-          <w:noProof/>
-        </w:rPr>
-        <w:drawing>
-          <wp:inline distT="0" distB="0" distL="0" distR="0" wp14:anchorId="35720529" wp14:editId="1149DCB0">
-            <wp:extent cx="4502381" cy="1085906"/>
-            <wp:effectExtent l="0" t="0" r="0" b="0"/>
-            <wp:docPr id="197035201" name="Picture 1" descr="Airborne Particles,&#10;&#10;AI-generated content may be incorrect."/>
-            <wp:cNvGraphicFramePr>
-              <a:graphicFrameLocks xmlns:a="http://schemas.openxmlformats.org/drawingml/2006/main" noChangeAspect="1"/>
-            </wp:cNvGraphicFramePr>
-            <a:graphic xmlns:a="http://schemas.openxmlformats.org/drawingml/2006/main">
-              <a:graphicData uri="http://schemas.openxmlformats.org/drawingml/2006/picture">
-                <pic:pic xmlns:pic="http://schemas.openxmlformats.org/drawingml/2006/picture">
-                  <pic:nvPicPr>
-                    <pic:cNvPr id="197035201" name="Picture 1" descr="Airborne Particles,&#10;&#10;AI-generated content may be incorrect."/>
-                    <pic:cNvPicPr/>
-                  </pic:nvPicPr>
-                  <pic:blipFill>
-                    <a:blip r:embed="rId8"/>
-                    <a:stretch>
-                      <a:fillRect/>
-                    </a:stretch>
-                  </pic:blipFill>
-                  <pic:spPr>
-                    <a:xfrm>
-                      <a:off x="0" y="0"/>
-                      <a:ext cx="4502381" cy="1085906"/>
-                    </a:xfrm>
-                    <a:prstGeom prst="rect">
-                      <a:avLst/>
-                    </a:prstGeom>
-                  </pic:spPr>
-                </pic:pic>
-              </a:graphicData>
-            </a:graphic>
-          </wp:inline>
-        </w:drawing>
+        <w:t xml:space="preserve">INSERT INTO </w:t>
+      </w:r>
+      <w:proofErr w:type="gramStart"/>
+      <w:r>
+        <w:t>transmission(</w:t>
+      </w:r>
+      <w:proofErr w:type="spellStart"/>
+      <w:proofErr w:type="gramEnd"/>
+      <w:r>
+        <w:t>Event_Number</w:t>
+      </w:r>
+      <w:proofErr w:type="spellEnd"/>
+      <w:r>
+        <w:t>, Method)</w:t>
+      </w:r>
+    </w:p>
+    <w:p>
+      <w:proofErr w:type="gramStart"/>
+      <w:r>
+        <w:t>VALUES(</w:t>
+      </w:r>
+      <w:proofErr w:type="gramEnd"/>
+      <w:r>
+        <w:t>2, "Shared Surfaces");</w:t>
       </w:r>
     </w:p>
     <w:p/>
+    <w:p/>
     <w:p>
       <w:pPr>
         <w:pStyle w:val="Heading2"/>
@@ -353,7 +339,15 @@
     </w:p>
     <w:p>
       <w:r>
-        <w:t>SELECT * FROM neighbourhood WHERE Neighbourhood_Name LIKE "%Side"</w:t>
+        <w:t xml:space="preserve">SELECT * FROM neighbourhood WHERE </w:t>
+      </w:r>
+      <w:proofErr w:type="spellStart"/>
+      <w:r>
+        <w:t>Neighbourhood_Name</w:t>
+      </w:r>
+      <w:proofErr w:type="spellEnd"/>
+      <w:r>
+        <w:t xml:space="preserve"> LIKE "%Side"</w:t>
       </w:r>
       <w:r>
         <w:t>;</w:t>
@@ -361,56 +355,20 @@
     </w:p>
     <w:p>
       <w:r>
-        <w:t>-- Neighbourhood names ending in side</w:t>
-      </w:r>
+        <w:t xml:space="preserve">-- Neighbourhood names ending </w:t>
+      </w:r>
+      <w:proofErr w:type="gramStart"/>
+      <w:r>
+        <w:t>in side</w:t>
+      </w:r>
+      <w:proofErr w:type="gramEnd"/>
     </w:p>
     <w:p>
       <w:r>
         <w:t>Result:</w:t>
       </w:r>
     </w:p>
-    <w:p>
-      <w:r>
-        <w:rPr>
-          <w:noProof/>
-        </w:rPr>
-        <w:drawing>
-          <wp:inline distT="0" distB="0" distL="0" distR="0" wp14:anchorId="4A3B40AC" wp14:editId="79E32A9D">
-            <wp:extent cx="4902452" cy="997001"/>
-            <wp:effectExtent l="0" t="0" r="0" b="0"/>
-            <wp:docPr id="1826293948" name="Picture 1" descr="The image displays a neighborhood management interface with various actions (Edit, Copy, Delete) for different neighborhood IDs, including Upper West Side, Upper East Side, and Lower East Side.&#10;&#10;AI-generated content may be incorrect."/>
-            <wp:cNvGraphicFramePr>
-              <a:graphicFrameLocks xmlns:a="http://schemas.openxmlformats.org/drawingml/2006/main" noChangeAspect="1"/>
-            </wp:cNvGraphicFramePr>
-            <a:graphic xmlns:a="http://schemas.openxmlformats.org/drawingml/2006/main">
-              <a:graphicData uri="http://schemas.openxmlformats.org/drawingml/2006/picture">
-                <pic:pic xmlns:pic="http://schemas.openxmlformats.org/drawingml/2006/picture">
-                  <pic:nvPicPr>
-                    <pic:cNvPr id="1826293948" name="Picture 1" descr="The image displays a neighborhood management interface with various actions (Edit, Copy, Delete) for different neighborhood IDs, including Upper West Side, Upper East Side, and Lower East Side.&#10;&#10;AI-generated content may be incorrect."/>
-                    <pic:cNvPicPr/>
-                  </pic:nvPicPr>
-                  <pic:blipFill>
-                    <a:blip r:embed="rId9"/>
-                    <a:stretch>
-                      <a:fillRect/>
-                    </a:stretch>
-                  </pic:blipFill>
-                  <pic:spPr>
-                    <a:xfrm>
-                      <a:off x="0" y="0"/>
-                      <a:ext cx="4902452" cy="997001"/>
-                    </a:xfrm>
-                    <a:prstGeom prst="rect">
-                      <a:avLst/>
-                    </a:prstGeom>
-                  </pic:spPr>
-                </pic:pic>
-              </a:graphicData>
-            </a:graphic>
-          </wp:inline>
-        </w:drawing>
-      </w:r>
-    </w:p>
+    <w:p/>
     <w:p>
       <w:pPr>
         <w:pStyle w:val="Heading2"/>
@@ -446,32 +404,129 @@
         <w:t xml:space="preserve">Purpose: </w:t>
       </w:r>
       <w:r>
-        <w:t>To compare the initial infection count of the outbreak event to the final number of people infected in that same block.</w:t>
-      </w:r>
-    </w:p>
-    <w:p>
-      <w:r>
-        <w:t xml:space="preserve">SELECT infectionevent.Block_ID, Event_Number, People_Infected, Event_Description, Infected_Count </w:t>
-      </w:r>
-    </w:p>
-    <w:p>
-      <w:r>
-        <w:t>FROM infectionevent</w:t>
-      </w:r>
-    </w:p>
-    <w:p>
-      <w:r>
-        <w:t xml:space="preserve"> INNER JOIN cityblock</w:t>
-      </w:r>
-    </w:p>
-    <w:p>
-      <w:r>
-        <w:t xml:space="preserve"> ON infectionevent.Block_ID = cityblock.Block_ID </w:t>
-      </w:r>
-    </w:p>
-    <w:p>
-      <w:r>
-        <w:t>WHERE People_Infected &gt; 7;</w:t>
+        <w:t xml:space="preserve">To compare the initial </w:t>
+      </w:r>
+      <w:proofErr w:type="gramStart"/>
+      <w:r>
+        <w:t>infection</w:t>
+      </w:r>
+      <w:proofErr w:type="gramEnd"/>
+      <w:r>
+        <w:t xml:space="preserve"> count of the outbreak event to the final number of people infected in that same block.</w:t>
+      </w:r>
+    </w:p>
+    <w:p>
+      <w:r>
+        <w:t xml:space="preserve">SELECT </w:t>
+      </w:r>
+      <w:proofErr w:type="spellStart"/>
+      <w:proofErr w:type="gramStart"/>
+      <w:r>
+        <w:t>infectionevent.Block</w:t>
+      </w:r>
+      <w:proofErr w:type="gramEnd"/>
+      <w:r>
+        <w:t>_ID</w:t>
+      </w:r>
+      <w:proofErr w:type="spellEnd"/>
+      <w:r>
+        <w:t xml:space="preserve">, </w:t>
+      </w:r>
+      <w:proofErr w:type="spellStart"/>
+      <w:r>
+        <w:t>Event_Number</w:t>
+      </w:r>
+      <w:proofErr w:type="spellEnd"/>
+      <w:r>
+        <w:t xml:space="preserve">, </w:t>
+      </w:r>
+      <w:proofErr w:type="spellStart"/>
+      <w:r>
+        <w:t>People_Infected</w:t>
+      </w:r>
+      <w:proofErr w:type="spellEnd"/>
+      <w:r>
+        <w:t xml:space="preserve">, </w:t>
+      </w:r>
+      <w:proofErr w:type="spellStart"/>
+      <w:r>
+        <w:t>Event_Description</w:t>
+      </w:r>
+      <w:proofErr w:type="spellEnd"/>
+      <w:r>
+        <w:t xml:space="preserve">, </w:t>
+      </w:r>
+      <w:proofErr w:type="spellStart"/>
+      <w:r>
+        <w:t>Infected_Count</w:t>
+      </w:r>
+      <w:proofErr w:type="spellEnd"/>
+      <w:r>
+        <w:t xml:space="preserve"> </w:t>
+      </w:r>
+    </w:p>
+    <w:p>
+      <w:r>
+        <w:t xml:space="preserve">FROM </w:t>
+      </w:r>
+      <w:proofErr w:type="spellStart"/>
+      <w:r>
+        <w:t>infectionevent</w:t>
+      </w:r>
+      <w:proofErr w:type="spellEnd"/>
+    </w:p>
+    <w:p>
+      <w:r>
+        <w:t xml:space="preserve"> INNER JOIN </w:t>
+      </w:r>
+      <w:proofErr w:type="spellStart"/>
+      <w:r>
+        <w:t>cityblock</w:t>
+      </w:r>
+      <w:proofErr w:type="spellEnd"/>
+    </w:p>
+    <w:p>
+      <w:r>
+        <w:t xml:space="preserve"> ON </w:t>
+      </w:r>
+      <w:proofErr w:type="spellStart"/>
+      <w:proofErr w:type="gramStart"/>
+      <w:r>
+        <w:t>infectionevent.Block</w:t>
+      </w:r>
+      <w:proofErr w:type="gramEnd"/>
+      <w:r>
+        <w:t>_ID</w:t>
+      </w:r>
+      <w:proofErr w:type="spellEnd"/>
+      <w:r>
+        <w:t xml:space="preserve"> = </w:t>
+      </w:r>
+      <w:proofErr w:type="spellStart"/>
+      <w:proofErr w:type="gramStart"/>
+      <w:r>
+        <w:t>cityblock.Block</w:t>
+      </w:r>
+      <w:proofErr w:type="gramEnd"/>
+      <w:r>
+        <w:t>_ID</w:t>
+      </w:r>
+      <w:proofErr w:type="spellEnd"/>
+      <w:r>
+        <w:t xml:space="preserve"> </w:t>
+      </w:r>
+    </w:p>
+    <w:p>
+      <w:r>
+        <w:t xml:space="preserve">WHERE </w:t>
+      </w:r>
+      <w:proofErr w:type="spellStart"/>
+      <w:r>
+        <w:t>People_Infected</w:t>
+      </w:r>
+      <w:proofErr w:type="spellEnd"/>
+      <w:r>
+        <w:t xml:space="preserve"> &gt; 7;</w:t>
       </w:r>
     </w:p>
     <w:p>
@@ -481,8 +536,15 @@
     </w:p>
     <w:p>
       <w:r>
-        <w:lastRenderedPageBreak/>
-        <w:t>This query will compare a subset of blocks to show the number of people who were initially infected at a block and show the number of people infected after the month by using data from the cityblock table</w:t>
+        <w:t xml:space="preserve">This query will compare a subset of blocks to show the number of people who were initially infected at a block and show the number of people infected after the month by using data from the </w:t>
+      </w:r>
+      <w:proofErr w:type="spellStart"/>
+      <w:r>
+        <w:t>cityblock</w:t>
+      </w:r>
+      <w:proofErr w:type="spellEnd"/>
+      <w:r>
+        <w:t xml:space="preserve"> table</w:t>
       </w:r>
     </w:p>
     <w:p>
@@ -501,316 +563,271 @@
           <w:b/>
           <w:bCs/>
         </w:rPr>
-        <w:t>Result:</w:t>
-      </w:r>
-      <w:r>
-        <w:rPr>
-          <w:noProof/>
-        </w:rPr>
-        <w:t xml:space="preserve"> </w:t>
-      </w:r>
-    </w:p>
-    <w:p>
-      <w:pPr>
-        <w:rPr>
-          <w:noProof/>
-        </w:rPr>
-      </w:pPr>
-    </w:p>
-    <w:p>
-      <w:r>
-        <w:rPr>
-          <w:noProof/>
-        </w:rPr>
-        <w:drawing>
-          <wp:inline distT="0" distB="0" distL="0" distR="0" wp14:anchorId="51516A84" wp14:editId="675595A9">
-            <wp:extent cx="5731510" cy="1127760"/>
-            <wp:effectExtent l="0" t="0" r="2540" b="0"/>
-            <wp:docPr id="481157748" name="Picture 1"/>
-            <wp:cNvGraphicFramePr>
-              <a:graphicFrameLocks xmlns:a="http://schemas.openxmlformats.org/drawingml/2006/main" noChangeAspect="1"/>
-            </wp:cNvGraphicFramePr>
-            <a:graphic xmlns:a="http://schemas.openxmlformats.org/drawingml/2006/main">
-              <a:graphicData uri="http://schemas.openxmlformats.org/drawingml/2006/picture">
-                <pic:pic xmlns:pic="http://schemas.openxmlformats.org/drawingml/2006/picture">
-                  <pic:nvPicPr>
-                    <pic:cNvPr id="481157748" name=""/>
-                    <pic:cNvPicPr/>
-                  </pic:nvPicPr>
-                  <pic:blipFill>
-                    <a:blip r:embed="rId10"/>
-                    <a:stretch>
-                      <a:fillRect/>
-                    </a:stretch>
-                  </pic:blipFill>
-                  <pic:spPr>
-                    <a:xfrm>
-                      <a:off x="0" y="0"/>
-                      <a:ext cx="5731510" cy="1127760"/>
-                    </a:xfrm>
-                    <a:prstGeom prst="rect">
-                      <a:avLst/>
-                    </a:prstGeom>
-                  </pic:spPr>
-                </pic:pic>
-              </a:graphicData>
-            </a:graphic>
-          </wp:inline>
-        </w:drawing>
-      </w:r>
-    </w:p>
-    <w:p/>
-    <w:p>
-      <w:r>
-        <w:t>WITHOUT the where statement:</w:t>
-      </w:r>
-    </w:p>
-    <w:p>
-      <w:r>
-        <w:drawing>
-          <wp:inline distT="0" distB="0" distL="0" distR="0" wp14:anchorId="6C71C15B" wp14:editId="4224B16C">
-            <wp:extent cx="5731510" cy="1977390"/>
-            <wp:effectExtent l="0" t="0" r="2540" b="3810"/>
-            <wp:docPr id="809364805" name="Picture 1" descr="The image shows a table listing various events, including the number of people infected, the event description, and the number of infected instances, such as infected dollar bills, street market vendors, and airborne particles.&#10;&#10;AI-generated content may be incorrect."/>
-            <wp:cNvGraphicFramePr>
-              <a:graphicFrameLocks xmlns:a="http://schemas.openxmlformats.org/drawingml/2006/main" noChangeAspect="1"/>
-            </wp:cNvGraphicFramePr>
-            <a:graphic xmlns:a="http://schemas.openxmlformats.org/drawingml/2006/main">
-              <a:graphicData uri="http://schemas.openxmlformats.org/drawingml/2006/picture">
-                <pic:pic xmlns:pic="http://schemas.openxmlformats.org/drawingml/2006/picture">
-                  <pic:nvPicPr>
-                    <pic:cNvPr id="809364805" name="Picture 1" descr="The image shows a table listing various events, including the number of people infected, the event description, and the number of infected instances, such as infected dollar bills, street market vendors, and airborne particles.&#10;&#10;AI-generated content may be incorrect."/>
-                    <pic:cNvPicPr/>
-                  </pic:nvPicPr>
-                  <pic:blipFill>
-                    <a:blip r:embed="rId11"/>
-                    <a:stretch>
-                      <a:fillRect/>
-                    </a:stretch>
-                  </pic:blipFill>
-                  <pic:spPr>
-                    <a:xfrm>
-                      <a:off x="0" y="0"/>
-                      <a:ext cx="5731510" cy="1977390"/>
-                    </a:xfrm>
-                    <a:prstGeom prst="rect">
-                      <a:avLst/>
-                    </a:prstGeom>
-                  </pic:spPr>
-                </pic:pic>
-              </a:graphicData>
-            </a:graphic>
-          </wp:inline>
-        </w:drawing>
-      </w:r>
-    </w:p>
-    <w:p>
-      <w:pPr>
-        <w:pStyle w:val="Heading2"/>
-        <w:rPr>
-          <w:u w:val="single"/>
-        </w:rPr>
-      </w:pPr>
-      <w:r>
-        <w:rPr>
-          <w:u w:val="single"/>
-        </w:rPr>
-        <w:t xml:space="preserve">Query </w:t>
-      </w:r>
-      <w:r>
-        <w:rPr>
-          <w:u w:val="single"/>
-        </w:rPr>
-        <w:t>3</w:t>
-      </w:r>
-      <w:r>
-        <w:rPr>
-          <w:u w:val="single"/>
-        </w:rPr>
-        <w:t>:</w:t>
-      </w:r>
-      <w:r>
-        <w:rPr>
-          <w:u w:val="single"/>
-        </w:rPr>
-        <w:t xml:space="preserve"> using “&gt;”</w:t>
-      </w:r>
-    </w:p>
-    <w:p>
+        <w:t xml:space="preserve">We can also remove </w:t>
+      </w:r>
+      <w:proofErr w:type="gramStart"/>
       <w:r>
         <w:rPr>
           <w:b/>
           <w:bCs/>
         </w:rPr>
-        <w:t xml:space="preserve">Purpose: </w:t>
-      </w:r>
-      <w:r>
-        <w:t>We want to use this query to see which blocks have the highest infected count</w:t>
-      </w:r>
-      <w:r>
-        <w:t xml:space="preserve"> (over 40000).</w:t>
-      </w:r>
-    </w:p>
-    <w:p>
-      <w:r>
-        <w:t xml:space="preserve">SELECT Block_ID, Neighbourhood_ID, Population, Infected_Count </w:t>
-      </w:r>
-    </w:p>
-    <w:p>
-      <w:r>
-        <w:t xml:space="preserve">FROM cityblock </w:t>
-      </w:r>
-    </w:p>
-    <w:p>
-      <w:r>
-        <w:t>WHERE Infected_Count &gt; 40000</w:t>
-      </w:r>
-      <w:r>
-        <w:t>;</w:t>
-      </w:r>
-    </w:p>
-    <w:p>
-      <w:r>
-        <w:t>-- WHERE is used as a filter to show the blocks with the highest infected count</w:t>
-      </w:r>
-    </w:p>
-    <w:p>
-      <w:pPr>
+        <w:t>the where</w:t>
+      </w:r>
+      <w:proofErr w:type="gramEnd"/>
+      <w:r>
         <w:rPr>
           <w:b/>
           <w:bCs/>
         </w:rPr>
-      </w:pPr>
+        <w:t xml:space="preserve"> statement to show all infection events.</w:t>
+      </w:r>
+    </w:p>
+    <w:p/>
+    <w:p>
+      <w:pPr>
+        <w:pStyle w:val="Heading2"/>
+        <w:rPr>
+          <w:u w:val="single"/>
+        </w:rPr>
+      </w:pPr>
+      <w:r>
+        <w:rPr>
+          <w:u w:val="single"/>
+        </w:rPr>
+        <w:t xml:space="preserve">Query </w:t>
+      </w:r>
+      <w:r>
+        <w:rPr>
+          <w:u w:val="single"/>
+        </w:rPr>
+        <w:t>3</w:t>
+      </w:r>
+      <w:r>
+        <w:rPr>
+          <w:u w:val="single"/>
+        </w:rPr>
+        <w:t>:</w:t>
+      </w:r>
+      <w:r>
+        <w:rPr>
+          <w:u w:val="single"/>
+        </w:rPr>
+        <w:t xml:space="preserve"> using “&gt;”</w:t>
+      </w:r>
+    </w:p>
+    <w:p>
       <w:r>
         <w:rPr>
           <w:b/>
           <w:bCs/>
         </w:rPr>
-        <w:t>Result</w:t>
-      </w:r>
-      <w:r>
+        <w:t xml:space="preserve">Purpose: </w:t>
+      </w:r>
+      <w:r>
+        <w:t>We want to use this query to see which blocks have the highest infected count</w:t>
+      </w:r>
+      <w:r>
+        <w:t xml:space="preserve"> (over 40000).</w:t>
+      </w:r>
+    </w:p>
+    <w:p>
+      <w:r>
+        <w:t xml:space="preserve">SELECT </w:t>
+      </w:r>
+      <w:proofErr w:type="spellStart"/>
+      <w:r>
+        <w:t>Block_ID</w:t>
+      </w:r>
+      <w:proofErr w:type="spellEnd"/>
+      <w:r>
+        <w:t xml:space="preserve">, </w:t>
+      </w:r>
+      <w:proofErr w:type="spellStart"/>
+      <w:r>
+        <w:t>Neighbourhood_ID</w:t>
+      </w:r>
+      <w:proofErr w:type="spellEnd"/>
+      <w:r>
+        <w:t xml:space="preserve">, Population, </w:t>
+      </w:r>
+      <w:proofErr w:type="spellStart"/>
+      <w:r>
+        <w:t>Infected_Count</w:t>
+      </w:r>
+      <w:proofErr w:type="spellEnd"/>
+      <w:r>
+        <w:t xml:space="preserve"> </w:t>
+      </w:r>
+    </w:p>
+    <w:p>
+      <w:r>
+        <w:t xml:space="preserve">FROM </w:t>
+      </w:r>
+      <w:proofErr w:type="spellStart"/>
+      <w:r>
+        <w:t>cityblock</w:t>
+      </w:r>
+      <w:proofErr w:type="spellEnd"/>
+      <w:r>
+        <w:t xml:space="preserve"> </w:t>
+      </w:r>
+    </w:p>
+    <w:p>
+      <w:r>
+        <w:t xml:space="preserve">WHERE </w:t>
+      </w:r>
+      <w:proofErr w:type="spellStart"/>
+      <w:r>
+        <w:t>Infected_Count</w:t>
+      </w:r>
+      <w:proofErr w:type="spellEnd"/>
+      <w:r>
+        <w:t xml:space="preserve"> &gt; 40000</w:t>
+      </w:r>
+      <w:r>
+        <w:t>;</w:t>
+      </w:r>
+    </w:p>
+    <w:p>
+      <w:r>
+        <w:t>-- WHERE is used as a filter to show the blocks with the highest infected count</w:t>
+      </w:r>
+    </w:p>
+    <w:p>
+      <w:pPr>
         <w:rPr>
           <w:b/>
           <w:bCs/>
         </w:rPr>
-        <w:t>:</w:t>
-      </w:r>
-    </w:p>
-    <w:p>
-      <w:pPr>
+      </w:pPr>
+    </w:p>
+    <w:p>
+      <w:pPr>
+        <w:pStyle w:val="Heading2"/>
+        <w:rPr>
+          <w:u w:val="single"/>
+        </w:rPr>
+      </w:pPr>
+      <w:r>
+        <w:rPr>
+          <w:u w:val="single"/>
+        </w:rPr>
+        <w:t xml:space="preserve">Query </w:t>
+      </w:r>
+      <w:r>
+        <w:rPr>
+          <w:u w:val="single"/>
+        </w:rPr>
+        <w:t>4</w:t>
+      </w:r>
+      <w:r>
+        <w:rPr>
+          <w:u w:val="single"/>
+        </w:rPr>
+        <w:t xml:space="preserve">: </w:t>
+      </w:r>
+    </w:p>
+    <w:p>
+      <w:r>
         <w:rPr>
           <w:b/>
           <w:bCs/>
         </w:rPr>
-      </w:pPr>
+        <w:t>Purpose:</w:t>
+      </w:r>
       <w:r>
         <w:rPr>
           <w:b/>
           <w:bCs/>
-          <w:noProof/>
-        </w:rPr>
-        <w:lastRenderedPageBreak/>
-        <w:drawing>
-          <wp:inline distT="0" distB="0" distL="0" distR="0" wp14:anchorId="2939E707" wp14:editId="6AC7EB4E">
-            <wp:extent cx="4718050" cy="2518454"/>
-            <wp:effectExtent l="0" t="0" r="6350" b="0"/>
-            <wp:docPr id="402353641" name="Picture 1" descr="This is a table displaying information about various blocks, including their IDs, neighborhood IDs, population, and infection counts, with options to edit, copy, or delete each entry.&#10;&#10;AI-generated content may be incorrect."/>
-            <wp:cNvGraphicFramePr>
-              <a:graphicFrameLocks xmlns:a="http://schemas.openxmlformats.org/drawingml/2006/main" noChangeAspect="1"/>
-            </wp:cNvGraphicFramePr>
-            <a:graphic xmlns:a="http://schemas.openxmlformats.org/drawingml/2006/main">
-              <a:graphicData uri="http://schemas.openxmlformats.org/drawingml/2006/picture">
-                <pic:pic xmlns:pic="http://schemas.openxmlformats.org/drawingml/2006/picture">
-                  <pic:nvPicPr>
-                    <pic:cNvPr id="402353641" name="Picture 1" descr="This is a table displaying information about various blocks, including their IDs, neighborhood IDs, population, and infection counts, with options to edit, copy, or delete each entry.&#10;&#10;AI-generated content may be incorrect."/>
-                    <pic:cNvPicPr/>
-                  </pic:nvPicPr>
-                  <pic:blipFill>
-                    <a:blip r:embed="rId12"/>
-                    <a:stretch>
-                      <a:fillRect/>
-                    </a:stretch>
-                  </pic:blipFill>
-                  <pic:spPr>
-                    <a:xfrm>
-                      <a:off x="0" y="0"/>
-                      <a:ext cx="4722586" cy="2520875"/>
-                    </a:xfrm>
-                    <a:prstGeom prst="rect">
-                      <a:avLst/>
-                    </a:prstGeom>
-                  </pic:spPr>
-                </pic:pic>
-              </a:graphicData>
-            </a:graphic>
-          </wp:inline>
-        </w:drawing>
-      </w:r>
-    </w:p>
-    <w:p>
-      <w:pPr>
-        <w:pStyle w:val="Heading2"/>
-        <w:rPr>
-          <w:u w:val="single"/>
-        </w:rPr>
-      </w:pPr>
-      <w:r>
-        <w:rPr>
-          <w:u w:val="single"/>
-        </w:rPr>
-        <w:t xml:space="preserve">Query </w:t>
-      </w:r>
-      <w:r>
-        <w:rPr>
-          <w:u w:val="single"/>
-        </w:rPr>
-        <w:t>4</w:t>
-      </w:r>
-      <w:r>
-        <w:rPr>
-          <w:u w:val="single"/>
-        </w:rPr>
-        <w:t xml:space="preserve">: </w:t>
-      </w:r>
-    </w:p>
-    <w:p>
-      <w:r>
+        </w:rPr>
+        <w:t xml:space="preserve"> </w:t>
+      </w:r>
+      <w:r>
+        <w:t>We want to see the total number of blocks as well as the total number of people infected across each neighbourhood.</w:t>
+      </w:r>
+    </w:p>
+    <w:p>
+      <w:r>
+        <w:t xml:space="preserve">/* SUM is the total number of </w:t>
+      </w:r>
+      <w:proofErr w:type="gramStart"/>
+      <w:r>
+        <w:t>infected</w:t>
+      </w:r>
+      <w:proofErr w:type="gramEnd"/>
+      <w:r>
+        <w:t xml:space="preserve"> and COUNT increments the individual instances of each block in each neighbourhood. */</w:t>
+      </w:r>
+    </w:p>
+    <w:p/>
+    <w:p>
+      <w:r>
+        <w:t xml:space="preserve">SELECT </w:t>
+      </w:r>
+      <w:proofErr w:type="spellStart"/>
+      <w:r>
+        <w:t>Neighbourhood_ID</w:t>
+      </w:r>
+      <w:proofErr w:type="spellEnd"/>
+      <w:r>
+        <w:t>, SUM(</w:t>
+      </w:r>
+      <w:proofErr w:type="spellStart"/>
+      <w:r>
+        <w:t>Infected_Count</w:t>
+      </w:r>
+      <w:proofErr w:type="spellEnd"/>
+      <w:r>
+        <w:t>), COUNT(</w:t>
+      </w:r>
+      <w:proofErr w:type="spellStart"/>
+      <w:r>
+        <w:t>Block_ID</w:t>
+      </w:r>
+      <w:proofErr w:type="spellEnd"/>
+      <w:r>
+        <w:t xml:space="preserve">) </w:t>
+      </w:r>
+    </w:p>
+    <w:p>
+      <w:r>
+        <w:t xml:space="preserve">FROM </w:t>
+      </w:r>
+      <w:proofErr w:type="spellStart"/>
+      <w:r>
+        <w:t>cityblock</w:t>
+      </w:r>
+      <w:proofErr w:type="spellEnd"/>
+      <w:r>
+        <w:t xml:space="preserve"> </w:t>
+      </w:r>
+    </w:p>
+    <w:p>
+      <w:r>
+        <w:t xml:space="preserve">GROUP BY </w:t>
+      </w:r>
+      <w:proofErr w:type="spellStart"/>
+      <w:r>
+        <w:t>Neighbourhood_ID</w:t>
+      </w:r>
+      <w:proofErr w:type="spellEnd"/>
+      <w:r>
+        <w:t>;</w:t>
+      </w:r>
+    </w:p>
+    <w:p>
+      <w:pPr>
         <w:rPr>
           <w:b/>
           <w:bCs/>
         </w:rPr>
-        <w:t>Purpose:</w:t>
-      </w:r>
+      </w:pPr>
       <w:r>
         <w:rPr>
           <w:b/>
           <w:bCs/>
         </w:rPr>
-        <w:t xml:space="preserve"> </w:t>
-      </w:r>
-      <w:r>
-        <w:t>We want to see the total number of blocks as well as the total number of people infected across each neighbourhood.</w:t>
-      </w:r>
-    </w:p>
-    <w:p>
-      <w:r>
-        <w:t>/* SUM is the total number of infected and COUNT increments the individual instances of each block in each neighbourhood. */</w:t>
-      </w:r>
-    </w:p>
-    <w:p/>
-    <w:p>
-      <w:r>
-        <w:t xml:space="preserve">SELECT Neighbourhood_ID, SUM(Infected_Count), COUNT(Block_ID) </w:t>
-      </w:r>
-    </w:p>
-    <w:p>
-      <w:r>
-        <w:t xml:space="preserve">FROM cityblock </w:t>
-      </w:r>
-    </w:p>
-    <w:p>
-      <w:r>
-        <w:t>GROUP BY Neighbourhood_ID;</w:t>
+        <w:t>Result</w:t>
       </w:r>
     </w:p>
     <w:p>
@@ -820,104 +837,46 @@
           <w:bCs/>
         </w:rPr>
       </w:pPr>
+    </w:p>
+    <w:p>
+      <w:pPr>
+        <w:pStyle w:val="Heading2"/>
+        <w:rPr>
+          <w:u w:val="single"/>
+        </w:rPr>
+      </w:pPr>
+      <w:r>
+        <w:rPr>
+          <w:u w:val="single"/>
+        </w:rPr>
+        <w:t xml:space="preserve">Query </w:t>
+      </w:r>
+      <w:r>
+        <w:rPr>
+          <w:u w:val="single"/>
+        </w:rPr>
+        <w:t>5</w:t>
+      </w:r>
+      <w:r>
+        <w:rPr>
+          <w:u w:val="single"/>
+        </w:rPr>
+        <w:t xml:space="preserve">: </w:t>
+      </w:r>
+    </w:p>
+    <w:p>
       <w:r>
         <w:rPr>
           <w:b/>
           <w:bCs/>
         </w:rPr>
-        <w:t>Result</w:t>
-      </w:r>
-    </w:p>
-    <w:p>
-      <w:pPr>
+        <w:t>Purpose:</w:t>
+      </w:r>
+      <w:r>
         <w:rPr>
           <w:b/>
           <w:bCs/>
         </w:rPr>
-      </w:pPr>
-      <w:r>
-        <w:rPr>
-          <w:b/>
-          <w:bCs/>
-          <w:noProof/>
-        </w:rPr>
-        <w:lastRenderedPageBreak/>
-        <w:drawing>
-          <wp:inline distT="0" distB="0" distL="0" distR="0" wp14:anchorId="18B8B7A5" wp14:editId="1D9DBCC0">
-            <wp:extent cx="3246133" cy="3651250"/>
-            <wp:effectExtent l="0" t="0" r="0" b="6350"/>
-            <wp:docPr id="1498612924" name="Picture 1" descr="The image is a table displaying a summary of neighborhood data, listing unique Neighborhood IDs, their total infected count, and the count of blocks within each neighborhood.&#10;&#10;AI-generated content may be incorrect."/>
-            <wp:cNvGraphicFramePr>
-              <a:graphicFrameLocks xmlns:a="http://schemas.openxmlformats.org/drawingml/2006/main" noChangeAspect="1"/>
-            </wp:cNvGraphicFramePr>
-            <a:graphic xmlns:a="http://schemas.openxmlformats.org/drawingml/2006/main">
-              <a:graphicData uri="http://schemas.openxmlformats.org/drawingml/2006/picture">
-                <pic:pic xmlns:pic="http://schemas.openxmlformats.org/drawingml/2006/picture">
-                  <pic:nvPicPr>
-                    <pic:cNvPr id="1498612924" name="Picture 1" descr="The image is a table displaying a summary of neighborhood data, listing unique Neighborhood IDs, their total infected count, and the count of blocks within each neighborhood.&#10;&#10;AI-generated content may be incorrect."/>
-                    <pic:cNvPicPr/>
-                  </pic:nvPicPr>
-                  <pic:blipFill>
-                    <a:blip r:embed="rId13"/>
-                    <a:stretch>
-                      <a:fillRect/>
-                    </a:stretch>
-                  </pic:blipFill>
-                  <pic:spPr>
-                    <a:xfrm>
-                      <a:off x="0" y="0"/>
-                      <a:ext cx="3250315" cy="3655954"/>
-                    </a:xfrm>
-                    <a:prstGeom prst="rect">
-                      <a:avLst/>
-                    </a:prstGeom>
-                  </pic:spPr>
-                </pic:pic>
-              </a:graphicData>
-            </a:graphic>
-          </wp:inline>
-        </w:drawing>
-      </w:r>
-    </w:p>
-    <w:p>
-      <w:pPr>
-        <w:pStyle w:val="Heading2"/>
-        <w:rPr>
-          <w:u w:val="single"/>
-        </w:rPr>
-      </w:pPr>
-      <w:r>
-        <w:rPr>
-          <w:u w:val="single"/>
-        </w:rPr>
-        <w:t xml:space="preserve">Query </w:t>
-      </w:r>
-      <w:r>
-        <w:rPr>
-          <w:u w:val="single"/>
-        </w:rPr>
-        <w:t>5</w:t>
-      </w:r>
-      <w:r>
-        <w:rPr>
-          <w:u w:val="single"/>
-        </w:rPr>
-        <w:t xml:space="preserve">: </w:t>
-      </w:r>
-    </w:p>
-    <w:p>
-      <w:r>
-        <w:rPr>
-          <w:b/>
-          <w:bCs/>
-        </w:rPr>
-        <w:t>Purpose:</w:t>
-      </w:r>
-      <w:r>
-        <w:rPr>
-          <w:b/>
-          <w:bCs/>
-        </w:rPr>
         <w:t xml:space="preserve"> </w:t>
       </w:r>
       <w:r>
@@ -940,7 +899,7 @@
       </w:r>
     </w:p>
     <w:p>
-      <w:hyperlink r:id="rId14" w:tgtFrame="mysql_doc" w:history="1">
+      <w:hyperlink r:id="rId8" w:tgtFrame="mysql_doc" w:history="1">
         <w:r>
           <w:rPr>
             <w:rStyle w:val="Hyperlink"/>
@@ -949,19 +908,59 @@
         </w:r>
       </w:hyperlink>
       <w:r>
-        <w:t xml:space="preserve"> Block_ID, Neighbourhood_ID, Population, Infected_Count </w:t>
-      </w:r>
-    </w:p>
-    <w:p>
-      <w:r>
-        <w:t xml:space="preserve">FROM cityblock </w:t>
-      </w:r>
-    </w:p>
-    <w:p>
-      <w:r>
-        <w:t xml:space="preserve">WHERE Neighbourhood_ID </w:t>
-      </w:r>
-      <w:hyperlink r:id="rId15" w:tgtFrame="mysql_doc" w:history="1">
+        <w:t xml:space="preserve"> </w:t>
+      </w:r>
+      <w:proofErr w:type="spellStart"/>
+      <w:r>
+        <w:t>Block_ID</w:t>
+      </w:r>
+      <w:proofErr w:type="spellEnd"/>
+      <w:r>
+        <w:t xml:space="preserve">, </w:t>
+      </w:r>
+      <w:proofErr w:type="spellStart"/>
+      <w:r>
+        <w:t>Neighbourhood_ID</w:t>
+      </w:r>
+      <w:proofErr w:type="spellEnd"/>
+      <w:r>
+        <w:t xml:space="preserve">, Population, </w:t>
+      </w:r>
+      <w:proofErr w:type="spellStart"/>
+      <w:r>
+        <w:t>Infected_Count</w:t>
+      </w:r>
+      <w:proofErr w:type="spellEnd"/>
+      <w:r>
+        <w:t xml:space="preserve"> </w:t>
+      </w:r>
+    </w:p>
+    <w:p>
+      <w:r>
+        <w:t xml:space="preserve">FROM </w:t>
+      </w:r>
+      <w:proofErr w:type="spellStart"/>
+      <w:r>
+        <w:t>cityblock</w:t>
+      </w:r>
+      <w:proofErr w:type="spellEnd"/>
+      <w:r>
+        <w:t xml:space="preserve"> </w:t>
+      </w:r>
+    </w:p>
+    <w:p>
+      <w:r>
+        <w:t xml:space="preserve">WHERE </w:t>
+      </w:r>
+      <w:proofErr w:type="spellStart"/>
+      <w:r>
+        <w:t>Neighbourhood_ID</w:t>
+      </w:r>
+      <w:proofErr w:type="spellEnd"/>
+      <w:r>
+        <w:t xml:space="preserve"> </w:t>
+      </w:r>
+      <w:hyperlink r:id="rId9" w:tgtFrame="mysql_doc" w:history="1">
         <w:r>
           <w:rPr>
             <w:rStyle w:val="Hyperlink"/>
@@ -973,49 +972,7 @@
         <w:t xml:space="preserve"> (1, 2, 3);</w:t>
       </w:r>
     </w:p>
-    <w:p>
-      <w:r>
-        <w:rPr>
-          <w:noProof/>
-        </w:rPr>
-        <w:lastRenderedPageBreak/>
-        <w:drawing>
-          <wp:inline distT="0" distB="0" distL="0" distR="0" wp14:anchorId="3EAD772B" wp14:editId="0E1022C3">
-            <wp:extent cx="5731510" cy="4718685"/>
-            <wp:effectExtent l="0" t="0" r="2540" b="5715"/>
-            <wp:docPr id="570353914" name="Picture 1" descr="This table displays a neighborhood's population and infected count for various Block IDs, along with options to edit, copy, or delete the data.&#10;&#10;AI-generated content may be incorrect."/>
-            <wp:cNvGraphicFramePr>
-              <a:graphicFrameLocks xmlns:a="http://schemas.openxmlformats.org/drawingml/2006/main" noChangeAspect="1"/>
-            </wp:cNvGraphicFramePr>
-            <a:graphic xmlns:a="http://schemas.openxmlformats.org/drawingml/2006/main">
-              <a:graphicData uri="http://schemas.openxmlformats.org/drawingml/2006/picture">
-                <pic:pic xmlns:pic="http://schemas.openxmlformats.org/drawingml/2006/picture">
-                  <pic:nvPicPr>
-                    <pic:cNvPr id="570353914" name="Picture 1" descr="This table displays a neighborhood's population and infected count for various Block IDs, along with options to edit, copy, or delete the data.&#10;&#10;AI-generated content may be incorrect."/>
-                    <pic:cNvPicPr/>
-                  </pic:nvPicPr>
-                  <pic:blipFill>
-                    <a:blip r:embed="rId16"/>
-                    <a:stretch>
-                      <a:fillRect/>
-                    </a:stretch>
-                  </pic:blipFill>
-                  <pic:spPr>
-                    <a:xfrm>
-                      <a:off x="0" y="0"/>
-                      <a:ext cx="5731510" cy="4718685"/>
-                    </a:xfrm>
-                    <a:prstGeom prst="rect">
-                      <a:avLst/>
-                    </a:prstGeom>
-                  </pic:spPr>
-                </pic:pic>
-              </a:graphicData>
-            </a:graphic>
-          </wp:inline>
-        </w:drawing>
-      </w:r>
-    </w:p>
+    <w:p/>
     <w:p>
       <w:pPr>
         <w:pStyle w:val="Heading2"/>
@@ -1059,140 +1016,23 @@
     </w:p>
     <w:p>
       <w:r>
-        <w:rPr>
-          <w:noProof/>
-        </w:rPr>
-        <w:drawing>
-          <wp:inline distT="0" distB="0" distL="0" distR="0" wp14:anchorId="67565FF0" wp14:editId="0E23C296">
-            <wp:extent cx="5731510" cy="394335"/>
-            <wp:effectExtent l="0" t="0" r="2540" b="5715"/>
-            <wp:docPr id="706505288" name="Picture 1" descr="The image displays a table with columns for Block ID, Neighbourhood ID, Population, Infected Count, and Recovered Count, with values showing 1, 1, 32,250, 30,638, and 1,613 respectively, along with options to copy and delete the data.&#10;&#10;AI-generated content may be incorrect."/>
-            <wp:cNvGraphicFramePr>
-              <a:graphicFrameLocks xmlns:a="http://schemas.openxmlformats.org/drawingml/2006/main" noChangeAspect="1"/>
-            </wp:cNvGraphicFramePr>
-            <a:graphic xmlns:a="http://schemas.openxmlformats.org/drawingml/2006/main">
-              <a:graphicData uri="http://schemas.openxmlformats.org/drawingml/2006/picture">
-                <pic:pic xmlns:pic="http://schemas.openxmlformats.org/drawingml/2006/picture">
-                  <pic:nvPicPr>
-                    <pic:cNvPr id="706505288" name="Picture 1" descr="The image displays a table with columns for Block ID, Neighbourhood ID, Population, Infected Count, and Recovered Count, with values showing 1, 1, 32,250, 30,638, and 1,613 respectively, along with options to copy and delete the data.&#10;&#10;AI-generated content may be incorrect."/>
-                    <pic:cNvPicPr/>
-                  </pic:nvPicPr>
-                  <pic:blipFill>
-                    <a:blip r:embed="rId17"/>
-                    <a:stretch>
-                      <a:fillRect/>
-                    </a:stretch>
-                  </pic:blipFill>
-                  <pic:spPr>
-                    <a:xfrm>
-                      <a:off x="0" y="0"/>
-                      <a:ext cx="5731510" cy="394335"/>
-                    </a:xfrm>
-                    <a:prstGeom prst="rect">
-                      <a:avLst/>
-                    </a:prstGeom>
-                  </pic:spPr>
-                </pic:pic>
-              </a:graphicData>
-            </a:graphic>
-          </wp:inline>
-        </w:drawing>
-      </w:r>
-    </w:p>
-    <w:p>
-      <w:r>
-        <w:rPr>
-          <w:noProof/>
-        </w:rPr>
-        <w:drawing>
-          <wp:inline distT="0" distB="0" distL="0" distR="0" wp14:anchorId="4A7116DC" wp14:editId="0C36AC20">
-            <wp:extent cx="5731510" cy="196850"/>
-            <wp:effectExtent l="0" t="0" r="2540" b="0"/>
-            <wp:docPr id="404092634" name="Picture 1"/>
-            <wp:cNvGraphicFramePr>
-              <a:graphicFrameLocks xmlns:a="http://schemas.openxmlformats.org/drawingml/2006/main" noChangeAspect="1"/>
-            </wp:cNvGraphicFramePr>
-            <a:graphic xmlns:a="http://schemas.openxmlformats.org/drawingml/2006/main">
-              <a:graphicData uri="http://schemas.openxmlformats.org/drawingml/2006/picture">
-                <pic:pic xmlns:pic="http://schemas.openxmlformats.org/drawingml/2006/picture">
-                  <pic:nvPicPr>
-                    <pic:cNvPr id="404092634" name=""/>
-                    <pic:cNvPicPr/>
-                  </pic:nvPicPr>
-                  <pic:blipFill>
-                    <a:blip r:embed="rId18"/>
-                    <a:stretch>
-                      <a:fillRect/>
-                    </a:stretch>
-                  </pic:blipFill>
-                  <pic:spPr>
-                    <a:xfrm>
-                      <a:off x="0" y="0"/>
-                      <a:ext cx="5731510" cy="196850"/>
-                    </a:xfrm>
-                    <a:prstGeom prst="rect">
-                      <a:avLst/>
-                    </a:prstGeom>
-                  </pic:spPr>
-                </pic:pic>
-              </a:graphicData>
-            </a:graphic>
-          </wp:inline>
-        </w:drawing>
-      </w:r>
-    </w:p>
-    <w:p>
-      <w:pPr>
-        <w:pStyle w:val="Heading2"/>
-        <w:rPr>
-          <w:u w:val="single"/>
-        </w:rPr>
-      </w:pPr>
-      <w:r>
-        <w:rPr>
-          <w:noProof/>
-          <w:u w:val="single"/>
-        </w:rPr>
-        <w:drawing>
-          <wp:inline distT="0" distB="0" distL="0" distR="0" wp14:anchorId="4090FA03" wp14:editId="72CE3CCF">
-            <wp:extent cx="5731510" cy="213995"/>
-            <wp:effectExtent l="0" t="0" r="2540" b="0"/>
-            <wp:docPr id="462479058" name="Picture 1"/>
-            <wp:cNvGraphicFramePr>
-              <a:graphicFrameLocks xmlns:a="http://schemas.openxmlformats.org/drawingml/2006/main" noChangeAspect="1"/>
-            </wp:cNvGraphicFramePr>
-            <a:graphic xmlns:a="http://schemas.openxmlformats.org/drawingml/2006/main">
-              <a:graphicData uri="http://schemas.openxmlformats.org/drawingml/2006/picture">
-                <pic:pic xmlns:pic="http://schemas.openxmlformats.org/drawingml/2006/picture">
-                  <pic:nvPicPr>
-                    <pic:cNvPr id="462479058" name=""/>
-                    <pic:cNvPicPr/>
-                  </pic:nvPicPr>
-                  <pic:blipFill>
-                    <a:blip r:embed="rId19"/>
-                    <a:stretch>
-                      <a:fillRect/>
-                    </a:stretch>
-                  </pic:blipFill>
-                  <pic:spPr>
-                    <a:xfrm>
-                      <a:off x="0" y="0"/>
-                      <a:ext cx="5731510" cy="213995"/>
-                    </a:xfrm>
-                    <a:prstGeom prst="rect">
-                      <a:avLst/>
-                    </a:prstGeom>
-                  </pic:spPr>
-                </pic:pic>
-              </a:graphicData>
-            </a:graphic>
-          </wp:inline>
-        </w:drawing>
-      </w:r>
-    </w:p>
-    <w:p>
-      <w:r>
-        <w:t xml:space="preserve">We have identified 3 rows where the total of the infected_count and recovered_count </w:t>
+        <w:t xml:space="preserve">We have identified 3 rows where the total of the </w:t>
+      </w:r>
+      <w:proofErr w:type="spellStart"/>
+      <w:r>
+        <w:t>infected_count</w:t>
+      </w:r>
+      <w:proofErr w:type="spellEnd"/>
+      <w:r>
+        <w:t xml:space="preserve"> and </w:t>
+      </w:r>
+      <w:proofErr w:type="spellStart"/>
+      <w:r>
+        <w:t>recovered_count</w:t>
+      </w:r>
+      <w:proofErr w:type="spellEnd"/>
+      <w:r>
+        <w:t xml:space="preserve"> </w:t>
       </w:r>
       <w:r>
         <w:t xml:space="preserve">adds up to 1 number higher than the population. An example is </w:t>
@@ -1204,7 +1044,15 @@
         <w:t xml:space="preserve"> is equal to 32251</w:t>
       </w:r>
       <w:r>
-        <w:t xml:space="preserve"> which is not the population. We need to update them so the </w:t>
+        <w:t xml:space="preserve"> which is not the population. We need to update </w:t>
+      </w:r>
+      <w:proofErr w:type="gramStart"/>
+      <w:r>
+        <w:t>them</w:t>
+      </w:r>
+      <w:proofErr w:type="gramEnd"/>
+      <w:r>
+        <w:t xml:space="preserve"> so the </w:t>
       </w:r>
       <w:r>
         <w:t xml:space="preserve">infected and recovered count add up to the </w:t>
@@ -1218,161 +1066,51 @@
     </w:p>
     <w:p>
       <w:r>
-        <w:t>UPDATE cityblock</w:t>
-      </w:r>
-    </w:p>
-    <w:p>
-      <w:r>
-        <w:t>SET Recovered_Count = Recovered_Count - 1 -- de-incrementing the recovered count for certain rows</w:t>
-      </w:r>
-    </w:p>
-    <w:p>
-      <w:r>
-        <w:t>WHERE Block_ID IN (1, 15, 51);</w:t>
-      </w:r>
-    </w:p>
-    <w:p>
-      <w:pPr>
-        <w:rPr>
-          <w:b/>
-          <w:bCs/>
-        </w:rPr>
-      </w:pPr>
-      <w:r>
-        <w:rPr>
-          <w:b/>
-          <w:bCs/>
-        </w:rPr>
-        <w:lastRenderedPageBreak/>
-        <w:t>Result:</w:t>
-      </w:r>
-    </w:p>
-    <w:p>
-      <w:r>
-        <w:rPr>
-          <w:noProof/>
-        </w:rPr>
-        <w:drawing>
-          <wp:inline distT="0" distB="0" distL="0" distR="0" wp14:anchorId="47FB914E" wp14:editId="71ACAC5D">
-            <wp:extent cx="5731510" cy="384810"/>
-            <wp:effectExtent l="0" t="0" r="2540" b="0"/>
-            <wp:docPr id="119991242" name="Picture 1" descr="The image displays a table with columns for Block ID, Neighbourhood ID, Population, Infected Count, and Recovered Count, along with options to copy and delete the data.&#10;&#10;AI-generated content may be incorrect."/>
-            <wp:cNvGraphicFramePr>
-              <a:graphicFrameLocks xmlns:a="http://schemas.openxmlformats.org/drawingml/2006/main" noChangeAspect="1"/>
-            </wp:cNvGraphicFramePr>
-            <a:graphic xmlns:a="http://schemas.openxmlformats.org/drawingml/2006/main">
-              <a:graphicData uri="http://schemas.openxmlformats.org/drawingml/2006/picture">
-                <pic:pic xmlns:pic="http://schemas.openxmlformats.org/drawingml/2006/picture">
-                  <pic:nvPicPr>
-                    <pic:cNvPr id="119991242" name="Picture 1" descr="The image displays a table with columns for Block ID, Neighbourhood ID, Population, Infected Count, and Recovered Count, along with options to copy and delete the data.&#10;&#10;AI-generated content may be incorrect."/>
-                    <pic:cNvPicPr/>
-                  </pic:nvPicPr>
-                  <pic:blipFill>
-                    <a:blip r:embed="rId20"/>
-                    <a:stretch>
-                      <a:fillRect/>
-                    </a:stretch>
-                  </pic:blipFill>
-                  <pic:spPr>
-                    <a:xfrm>
-                      <a:off x="0" y="0"/>
-                      <a:ext cx="5731510" cy="384810"/>
-                    </a:xfrm>
-                    <a:prstGeom prst="rect">
-                      <a:avLst/>
-                    </a:prstGeom>
-                  </pic:spPr>
-                </pic:pic>
-              </a:graphicData>
-            </a:graphic>
-          </wp:inline>
-        </w:drawing>
-      </w:r>
-    </w:p>
-    <w:p>
-      <w:r>
-        <w:rPr>
-          <w:noProof/>
-        </w:rPr>
-        <w:drawing>
-          <wp:inline distT="0" distB="0" distL="0" distR="0" wp14:anchorId="5B5A5CD3" wp14:editId="0BCDC0A9">
-            <wp:extent cx="5731510" cy="211455"/>
-            <wp:effectExtent l="0" t="0" r="2540" b="0"/>
-            <wp:docPr id="723308478" name="Picture 1"/>
-            <wp:cNvGraphicFramePr>
-              <a:graphicFrameLocks xmlns:a="http://schemas.openxmlformats.org/drawingml/2006/main" noChangeAspect="1"/>
-            </wp:cNvGraphicFramePr>
-            <a:graphic xmlns:a="http://schemas.openxmlformats.org/drawingml/2006/main">
-              <a:graphicData uri="http://schemas.openxmlformats.org/drawingml/2006/picture">
-                <pic:pic xmlns:pic="http://schemas.openxmlformats.org/drawingml/2006/picture">
-                  <pic:nvPicPr>
-                    <pic:cNvPr id="723308478" name=""/>
-                    <pic:cNvPicPr/>
-                  </pic:nvPicPr>
-                  <pic:blipFill>
-                    <a:blip r:embed="rId21"/>
-                    <a:stretch>
-                      <a:fillRect/>
-                    </a:stretch>
-                  </pic:blipFill>
-                  <pic:spPr>
-                    <a:xfrm>
-                      <a:off x="0" y="0"/>
-                      <a:ext cx="5731510" cy="211455"/>
-                    </a:xfrm>
-                    <a:prstGeom prst="rect">
-                      <a:avLst/>
-                    </a:prstGeom>
-                  </pic:spPr>
-                </pic:pic>
-              </a:graphicData>
-            </a:graphic>
-          </wp:inline>
-        </w:drawing>
-      </w:r>
-    </w:p>
-    <w:p>
-      <w:r>
-        <w:rPr>
-          <w:noProof/>
-        </w:rPr>
-        <w:drawing>
-          <wp:inline distT="0" distB="0" distL="0" distR="0" wp14:anchorId="0EF6D3E0" wp14:editId="5342926A">
-            <wp:extent cx="5731510" cy="196850"/>
-            <wp:effectExtent l="0" t="0" r="2540" b="0"/>
-            <wp:docPr id="1937647496" name="Picture 1"/>
-            <wp:cNvGraphicFramePr>
-              <a:graphicFrameLocks xmlns:a="http://schemas.openxmlformats.org/drawingml/2006/main" noChangeAspect="1"/>
-            </wp:cNvGraphicFramePr>
-            <a:graphic xmlns:a="http://schemas.openxmlformats.org/drawingml/2006/main">
-              <a:graphicData uri="http://schemas.openxmlformats.org/drawingml/2006/picture">
-                <pic:pic xmlns:pic="http://schemas.openxmlformats.org/drawingml/2006/picture">
-                  <pic:nvPicPr>
-                    <pic:cNvPr id="1937647496" name=""/>
-                    <pic:cNvPicPr/>
-                  </pic:nvPicPr>
-                  <pic:blipFill>
-                    <a:blip r:embed="rId22"/>
-                    <a:stretch>
-                      <a:fillRect/>
-                    </a:stretch>
-                  </pic:blipFill>
-                  <pic:spPr>
-                    <a:xfrm>
-                      <a:off x="0" y="0"/>
-                      <a:ext cx="5731510" cy="196850"/>
-                    </a:xfrm>
-                    <a:prstGeom prst="rect">
-                      <a:avLst/>
-                    </a:prstGeom>
-                  </pic:spPr>
-                </pic:pic>
-              </a:graphicData>
-            </a:graphic>
-          </wp:inline>
-        </w:drawing>
-      </w:r>
-    </w:p>
+        <w:t xml:space="preserve">UPDATE </w:t>
+      </w:r>
+      <w:proofErr w:type="spellStart"/>
+      <w:r>
+        <w:t>cityblock</w:t>
+      </w:r>
+      <w:proofErr w:type="spellEnd"/>
+    </w:p>
+    <w:p>
+      <w:r>
+        <w:t xml:space="preserve">SET </w:t>
+      </w:r>
+      <w:proofErr w:type="spellStart"/>
+      <w:r>
+        <w:t>Recovered_Count</w:t>
+      </w:r>
+      <w:proofErr w:type="spellEnd"/>
+      <w:r>
+        <w:t xml:space="preserve"> = </w:t>
+      </w:r>
+      <w:proofErr w:type="spellStart"/>
+      <w:r>
+        <w:t>Recovered_Count</w:t>
+      </w:r>
+      <w:proofErr w:type="spellEnd"/>
+      <w:r>
+        <w:t xml:space="preserve"> - 1 -- de-incrementing the recovered count for certain rows</w:t>
+      </w:r>
+    </w:p>
+    <w:p>
+      <w:r>
+        <w:t xml:space="preserve">WHERE </w:t>
+      </w:r>
+      <w:proofErr w:type="spellStart"/>
+      <w:r>
+        <w:t>Block_ID</w:t>
+      </w:r>
+      <w:proofErr w:type="spellEnd"/>
+      <w:r>
+        <w:t xml:space="preserve"> IN (1, 15, 51);</w:t>
+      </w:r>
+    </w:p>
+    <w:p/>
+    <w:p/>
+    <w:p/>
     <w:sectPr>
       <w:pgSz w:w="11906" w:h="16838"/>
       <w:pgMar w:top="1440" w:right="1440" w:bottom="1440" w:left="1440" w:header="708" w:footer="708" w:gutter="0"/>
@@ -2875,6 +2613,241 @@
 </a:theme>
 </file>
 
+<file path=customXml/item1.xml><?xml version="1.0" encoding="utf-8"?>
+<ct:contentTypeSchema xmlns:ct="http://schemas.microsoft.com/office/2006/metadata/contentType" xmlns:ma="http://schemas.microsoft.com/office/2006/metadata/properties/metaAttributes" ct:_="" ma:_="" ma:contentTypeName="Document" ma:contentTypeID="0x010100350D2240A3396B489D961B71EDDE4301" ma:contentTypeVersion="10" ma:contentTypeDescription="Create a new document." ma:contentTypeScope="" ma:versionID="25f5f2ed77984ffdeadaf01703a73815">
+  <xsd:schema xmlns:xsd="http://www.w3.org/2001/XMLSchema" xmlns:xs="http://www.w3.org/2001/XMLSchema" xmlns:p="http://schemas.microsoft.com/office/2006/metadata/properties" xmlns:ns3="84e782ac-1452-4fab-b0a4-6a655da4bdc7" targetNamespace="http://schemas.microsoft.com/office/2006/metadata/properties" ma:root="true" ma:fieldsID="edc20c531c4100b6caf8d651888a7e77" ns3:_="">
+    <xsd:import namespace="84e782ac-1452-4fab-b0a4-6a655da4bdc7"/>
+    <xsd:element name="properties">
+      <xsd:complexType>
+        <xsd:sequence>
+          <xsd:element name="documentManagement">
+            <xsd:complexType>
+              <xsd:all>
+                <xsd:element ref="ns3:MediaServiceDateTaken" minOccurs="0"/>
+                <xsd:element ref="ns3:MediaServiceMetadata" minOccurs="0"/>
+                <xsd:element ref="ns3:MediaServiceFastMetadata" minOccurs="0"/>
+                <xsd:element ref="ns3:MediaServiceSearchProperties" minOccurs="0"/>
+                <xsd:element ref="ns3:MediaServiceSystemTags" minOccurs="0"/>
+                <xsd:element ref="ns3:MediaServiceOCR" minOccurs="0"/>
+                <xsd:element ref="ns3:MediaServiceGenerationTime" minOccurs="0"/>
+                <xsd:element ref="ns3:MediaServiceEventHashCode" minOccurs="0"/>
+                <xsd:element ref="ns3:_activity" minOccurs="0"/>
+                <xsd:element ref="ns3:MediaServiceLocation" minOccurs="0"/>
+              </xsd:all>
+            </xsd:complexType>
+          </xsd:element>
+        </xsd:sequence>
+      </xsd:complexType>
+    </xsd:element>
+  </xsd:schema>
+  <xsd:schema xmlns:xsd="http://www.w3.org/2001/XMLSchema" xmlns:xs="http://www.w3.org/2001/XMLSchema" xmlns:dms="http://schemas.microsoft.com/office/2006/documentManagement/types" xmlns:pc="http://schemas.microsoft.com/office/infopath/2007/PartnerControls" targetNamespace="84e782ac-1452-4fab-b0a4-6a655da4bdc7" elementFormDefault="qualified">
+    <xsd:import namespace="http://schemas.microsoft.com/office/2006/documentManagement/types"/>
+    <xsd:import namespace="http://schemas.microsoft.com/office/infopath/2007/PartnerControls"/>
+    <xsd:element name="MediaServiceDateTaken" ma:index="8" nillable="true" ma:displayName="MediaServiceDateTaken" ma:hidden="true" ma:indexed="true" ma:internalName="MediaServiceDateTaken" ma:readOnly="true">
+      <xsd:simpleType>
+        <xsd:restriction base="dms:Text"/>
+      </xsd:simpleType>
+    </xsd:element>
+    <xsd:element name="MediaServiceMetadata" ma:index="9" nillable="true" ma:displayName="MediaServiceMetadata" ma:hidden="true" ma:internalName="MediaServiceMetadata" ma:readOnly="true">
+      <xsd:simpleType>
+        <xsd:restriction base="dms:Note"/>
+      </xsd:simpleType>
+    </xsd:element>
+    <xsd:element name="MediaServiceFastMetadata" ma:index="10" nillable="true" ma:displayName="MediaServiceFastMetadata" ma:hidden="true" ma:internalName="MediaServiceFastMetadata" ma:readOnly="true">
+      <xsd:simpleType>
+        <xsd:restriction base="dms:Note"/>
+      </xsd:simpleType>
+    </xsd:element>
+    <xsd:element name="MediaServiceSearchProperties" ma:index="11" nillable="true" ma:displayName="MediaServiceSearchProperties" ma:hidden="true" ma:internalName="MediaServiceSearchProperties" ma:readOnly="true">
+      <xsd:simpleType>
+        <xsd:restriction base="dms:Note"/>
+      </xsd:simpleType>
+    </xsd:element>
+    <xsd:element name="MediaServiceSystemTags" ma:index="12" nillable="true" ma:displayName="MediaServiceSystemTags" ma:hidden="true" ma:internalName="MediaServiceSystemTags" ma:readOnly="true">
+      <xsd:simpleType>
+        <xsd:restriction base="dms:Note"/>
+      </xsd:simpleType>
+    </xsd:element>
+    <xsd:element name="MediaServiceOCR" ma:index="13" nillable="true" ma:displayName="Extracted Text" ma:internalName="MediaServiceOCR" ma:readOnly="true">
+      <xsd:simpleType>
+        <xsd:restriction base="dms:Note">
+          <xsd:maxLength value="255"/>
+        </xsd:restriction>
+      </xsd:simpleType>
+    </xsd:element>
+    <xsd:element name="MediaServiceGenerationTime" ma:index="14" nillable="true" ma:displayName="MediaServiceGenerationTime" ma:hidden="true" ma:internalName="MediaServiceGenerationTime" ma:readOnly="true">
+      <xsd:simpleType>
+        <xsd:restriction base="dms:Text"/>
+      </xsd:simpleType>
+    </xsd:element>
+    <xsd:element name="MediaServiceEventHashCode" ma:index="15" nillable="true" ma:displayName="MediaServiceEventHashCode" ma:hidden="true" ma:internalName="MediaServiceEventHashCode" ma:readOnly="true">
+      <xsd:simpleType>
+        <xsd:restriction base="dms:Text"/>
+      </xsd:simpleType>
+    </xsd:element>
+    <xsd:element name="_activity" ma:index="16" nillable="true" ma:displayName="_activity" ma:hidden="true" ma:internalName="_activity">
+      <xsd:simpleType>
+        <xsd:restriction base="dms:Note"/>
+      </xsd:simpleType>
+    </xsd:element>
+    <xsd:element name="MediaServiceLocation" ma:index="17" nillable="true" ma:displayName="Location" ma:indexed="true" ma:internalName="MediaServiceLocation" ma:readOnly="true">
+      <xsd:simpleType>
+        <xsd:restriction base="dms:Text"/>
+      </xsd:simpleType>
+    </xsd:element>
+  </xsd:schema>
+  <xsd:schema xmlns="http://schemas.openxmlformats.org/package/2006/metadata/core-properties" xmlns:xsd="http://www.w3.org/2001/XMLSchema" xmlns:xsi="http://www.w3.org/2001/XMLSchema-instance" xmlns:dc="http://purl.org/dc/elements/1.1/" xmlns:dcterms="http://purl.org/dc/terms/" xmlns:odoc="http://schemas.microsoft.com/internal/obd" targetNamespace="http://schemas.openxmlformats.org/package/2006/metadata/core-properties" elementFormDefault="qualified" attributeFormDefault="unqualified" blockDefault="#all">
+    <xsd:import namespace="http://purl.org/dc/elements/1.1/" schemaLocation="http://dublincore.org/schemas/xmls/qdc/2003/04/02/dc.xsd"/>
+    <xsd:import namespace="http://purl.org/dc/terms/" schemaLocation="http://dublincore.org/schemas/xmls/qdc/2003/04/02/dcterms.xsd"/>
+    <xsd:element name="coreProperties" type="CT_coreProperties"/>
+    <xsd:complexType name="CT_coreProperties">
+      <xsd:all>
+        <xsd:element ref="dc:creator" minOccurs="0" maxOccurs="1"/>
+        <xsd:element ref="dcterms:created" minOccurs="0" maxOccurs="1"/>
+        <xsd:element ref="dc:identifier" minOccurs="0" maxOccurs="1"/>
+        <xsd:element name="contentType" minOccurs="0" maxOccurs="1" type="xsd:string" ma:index="0" ma:displayName="Content Type"/>
+        <xsd:element ref="dc:title" minOccurs="0" maxOccurs="1" ma:index="4" ma:displayName="Title"/>
+        <xsd:element ref="dc:subject" minOccurs="0" maxOccurs="1"/>
+        <xsd:element ref="dc:description" minOccurs="0" maxOccurs="1"/>
+        <xsd:element name="keywords" minOccurs="0" maxOccurs="1" type="xsd:string"/>
+        <xsd:element ref="dc:language" minOccurs="0" maxOccurs="1"/>
+        <xsd:element name="category" minOccurs="0" maxOccurs="1" type="xsd:string"/>
+        <xsd:element name="version" minOccurs="0" maxOccurs="1" type="xsd:string"/>
+        <xsd:element name="revision" minOccurs="0" maxOccurs="1" type="xsd:string">
+          <xsd:annotation>
+            <xsd:documentation>
+                        This value indicates the number of saves or revisions. The application is responsible for updating this value after each revision.
+                    </xsd:documentation>
+          </xsd:annotation>
+        </xsd:element>
+        <xsd:element name="lastModifiedBy" minOccurs="0" maxOccurs="1" type="xsd:string"/>
+        <xsd:element ref="dcterms:modified" minOccurs="0" maxOccurs="1"/>
+        <xsd:element name="contentStatus" minOccurs="0" maxOccurs="1" type="xsd:string"/>
+      </xsd:all>
+    </xsd:complexType>
+  </xsd:schema>
+  <xs:schema xmlns:pc="http://schemas.microsoft.com/office/infopath/2007/PartnerControls" xmlns:xs="http://www.w3.org/2001/XMLSchema" targetNamespace="http://schemas.microsoft.com/office/infopath/2007/PartnerControls" elementFormDefault="qualified" attributeFormDefault="unqualified">
+    <xs:element name="Person">
+      <xs:complexType>
+        <xs:sequence>
+          <xs:element ref="pc:DisplayName" minOccurs="0"/>
+          <xs:element ref="pc:AccountId" minOccurs="0"/>
+          <xs:element ref="pc:AccountType" minOccurs="0"/>
+        </xs:sequence>
+      </xs:complexType>
+    </xs:element>
+    <xs:element name="DisplayName" type="xs:string"/>
+    <xs:element name="AccountId" type="xs:string"/>
+    <xs:element name="AccountType" type="xs:string"/>
+    <xs:element name="BDCAssociatedEntity">
+      <xs:complexType>
+        <xs:sequence>
+          <xs:element ref="pc:BDCEntity" minOccurs="0" maxOccurs="unbounded"/>
+        </xs:sequence>
+        <xs:attribute ref="pc:EntityNamespace"/>
+        <xs:attribute ref="pc:EntityName"/>
+        <xs:attribute ref="pc:SystemInstanceName"/>
+        <xs:attribute ref="pc:AssociationName"/>
+      </xs:complexType>
+    </xs:element>
+    <xs:attribute name="EntityNamespace" type="xs:string"/>
+    <xs:attribute name="EntityName" type="xs:string"/>
+    <xs:attribute name="SystemInstanceName" type="xs:string"/>
+    <xs:attribute name="AssociationName" type="xs:string"/>
+    <xs:element name="BDCEntity">
+      <xs:complexType>
+        <xs:sequence>
+          <xs:element ref="pc:EntityDisplayName" minOccurs="0"/>
+          <xs:element ref="pc:EntityInstanceReference" minOccurs="0"/>
+          <xs:element ref="pc:EntityId1" minOccurs="0"/>
+          <xs:element ref="pc:EntityId2" minOccurs="0"/>
+          <xs:element ref="pc:EntityId3" minOccurs="0"/>
+          <xs:element ref="pc:EntityId4" minOccurs="0"/>
+          <xs:element ref="pc:EntityId5" minOccurs="0"/>
+        </xs:sequence>
+      </xs:complexType>
+    </xs:element>
+    <xs:element name="EntityDisplayName" type="xs:string"/>
+    <xs:element name="EntityInstanceReference" type="xs:string"/>
+    <xs:element name="EntityId1" type="xs:string"/>
+    <xs:element name="EntityId2" type="xs:string"/>
+    <xs:element name="EntityId3" type="xs:string"/>
+    <xs:element name="EntityId4" type="xs:string"/>
+    <xs:element name="EntityId5" type="xs:string"/>
+    <xs:element name="Terms">
+      <xs:complexType>
+        <xs:sequence>
+          <xs:element ref="pc:TermInfo" minOccurs="0" maxOccurs="unbounded"/>
+        </xs:sequence>
+      </xs:complexType>
+    </xs:element>
+    <xs:element name="TermInfo">
+      <xs:complexType>
+        <xs:sequence>
+          <xs:element ref="pc:TermName" minOccurs="0"/>
+          <xs:element ref="pc:TermId" minOccurs="0"/>
+        </xs:sequence>
+      </xs:complexType>
+    </xs:element>
+    <xs:element name="TermName" type="xs:string"/>
+    <xs:element name="TermId" type="xs:string"/>
+  </xs:schema>
+</ct:contentTypeSchema>
+</file>
+
+<file path=customXml/item2.xml><?xml version="1.0" encoding="utf-8"?>
+<?mso-contentType ?>
+<FormTemplates xmlns="http://schemas.microsoft.com/sharepoint/v3/contenttype/forms">
+  <Display>DocumentLibraryForm</Display>
+  <Edit>DocumentLibraryForm</Edit>
+  <New>DocumentLibraryForm</New>
+</FormTemplates>
+</file>
+
+<file path=customXml/item3.xml><?xml version="1.0" encoding="utf-8"?>
+<p:properties xmlns:p="http://schemas.microsoft.com/office/2006/metadata/properties" xmlns:xsi="http://www.w3.org/2001/XMLSchema-instance" xmlns:pc="http://schemas.microsoft.com/office/infopath/2007/PartnerControls">
+  <documentManagement>
+    <_activity xmlns="84e782ac-1452-4fab-b0a4-6a655da4bdc7" xsi:nil="true"/>
+  </documentManagement>
+</p:properties>
+</file>
+
+<file path=customXml/itemProps1.xml><?xml version="1.0" encoding="utf-8"?>
+<ds:datastoreItem xmlns:ds="http://schemas.openxmlformats.org/officeDocument/2006/customXml" ds:itemID="{1AE51C8A-C697-45A8-BB73-1C1656D801F2}">
+  <ds:schemaRefs>
+    <ds:schemaRef ds:uri="http://schemas.microsoft.com/office/2006/metadata/contentType"/>
+    <ds:schemaRef ds:uri="http://schemas.microsoft.com/office/2006/metadata/properties/metaAttributes"/>
+    <ds:schemaRef ds:uri="http://www.w3.org/2001/XMLSchema"/>
+    <ds:schemaRef ds:uri="http://schemas.microsoft.com/office/2006/metadata/properties"/>
+    <ds:schemaRef ds:uri="84e782ac-1452-4fab-b0a4-6a655da4bdc7"/>
+    <ds:schemaRef ds:uri="http://schemas.microsoft.com/office/2006/documentManagement/types"/>
+    <ds:schemaRef ds:uri="http://schemas.microsoft.com/office/infopath/2007/PartnerControls"/>
+    <ds:schemaRef ds:uri="http://schemas.openxmlformats.org/package/2006/metadata/core-properties"/>
+    <ds:schemaRef ds:uri="http://purl.org/dc/elements/1.1/"/>
+    <ds:schemaRef ds:uri="http://purl.org/dc/terms/"/>
+    <ds:schemaRef ds:uri="http://schemas.microsoft.com/internal/obd"/>
+  </ds:schemaRefs>
+</ds:datastoreItem>
+</file>
+
+<file path=customXml/itemProps2.xml><?xml version="1.0" encoding="utf-8"?>
+<ds:datastoreItem xmlns:ds="http://schemas.openxmlformats.org/officeDocument/2006/customXml" ds:itemID="{A069D4A3-7CD9-4E6C-9DDF-BA3FAA603416}">
+  <ds:schemaRefs>
+    <ds:schemaRef ds:uri="http://schemas.microsoft.com/sharepoint/v3/contenttype/forms"/>
+  </ds:schemaRefs>
+</ds:datastoreItem>
+</file>
+
+<file path=customXml/itemProps3.xml><?xml version="1.0" encoding="utf-8"?>
+<ds:datastoreItem xmlns:ds="http://schemas.openxmlformats.org/officeDocument/2006/customXml" ds:itemID="{75E1558C-04BB-47EC-B6A3-44F82F18E6C8}">
+  <ds:schemaRefs>
+    <ds:schemaRef ds:uri="http://schemas.microsoft.com/office/2006/metadata/properties"/>
+    <ds:schemaRef ds:uri="http://schemas.microsoft.com/office/infopath/2007/PartnerControls"/>
+    <ds:schemaRef ds:uri="84e782ac-1452-4fab-b0a4-6a655da4bdc7"/>
+  </ds:schemaRefs>
+</ds:datastoreItem>
+</file>
+
 <file path=docMetadata/LabelInfo.xml><?xml version="1.0" encoding="utf-8"?>
 <clbl:labelList xmlns:clbl="http://schemas.microsoft.com/office/2020/mipLabelMetadata">
   <clbl:label id="{d6fa6db5-9f3a-4c93-9e38-61059ee07e95}" enabled="1" method="Standard" siteId="{4e8d09f7-cc79-4ccb-9149-a4238dd17422}" removed="0"/>

</xml_diff>